<commit_message>
Adding Control Center and Kafka Connect with source and sink connectors
</commit_message>
<xml_diff>
--- a/grpc-go-kafka-producer-and-consumer-communication.docx
+++ b/grpc-go-kafka-producer-and-consumer-communication.docx
@@ -1551,9 +1551,9 @@
         </w:rPr>
         <w:drawing>
           <wp:inline distT="0" distB="0" distL="0" distR="0">
-            <wp:extent cx="5400040" cy="1483196"/>
+            <wp:extent cx="6043736" cy="867507"/>
             <wp:effectExtent l="19050" t="0" r="0" b="0"/>
-            <wp:docPr id="4" name="Imagen 4"/>
+            <wp:docPr id="17" name="Imagen 19"/>
             <wp:cNvGraphicFramePr>
               <a:graphicFrameLocks xmlns:a="http://schemas.openxmlformats.org/drawingml/2006/main" noChangeAspect="1"/>
             </wp:cNvGraphicFramePr>
@@ -1561,7 +1561,7 @@
               <a:graphicData uri="http://schemas.openxmlformats.org/drawingml/2006/picture">
                 <pic:pic xmlns:pic="http://schemas.openxmlformats.org/drawingml/2006/picture">
                   <pic:nvPicPr>
-                    <pic:cNvPr id="0" name="Picture 4"/>
+                    <pic:cNvPr id="0" name="Picture 19"/>
                     <pic:cNvPicPr>
                       <a:picLocks noChangeAspect="1" noChangeArrowheads="1"/>
                     </pic:cNvPicPr>
@@ -1576,7 +1576,7 @@
                   <pic:spPr bwMode="auto">
                     <a:xfrm>
                       <a:off x="0" y="0"/>
-                      <a:ext cx="5400040" cy="1483196"/>
+                      <a:ext cx="6054586" cy="869064"/>
                     </a:xfrm>
                     <a:prstGeom prst="rect">
                       <a:avLst/>
@@ -1600,6 +1600,38 @@
       <w:pPr>
         <w:spacing w:after="0"/>
         <w:rPr>
+          <w:sz w:val="24"/>
+        </w:rPr>
+      </w:pPr>
+    </w:p>
+    <w:p>
+      <w:pPr>
+        <w:spacing w:after="0"/>
+        <w:rPr>
+          <w:sz w:val="24"/>
+        </w:rPr>
+      </w:pPr>
+    </w:p>
+    <w:p>
+      <w:pPr>
+        <w:spacing w:after="0"/>
+        <w:rPr>
+          <w:sz w:val="24"/>
+        </w:rPr>
+      </w:pPr>
+    </w:p>
+    <w:p>
+      <w:pPr>
+        <w:spacing w:after="0"/>
+        <w:rPr>
+          <w:sz w:val="24"/>
+        </w:rPr>
+      </w:pPr>
+    </w:p>
+    <w:p>
+      <w:pPr>
+        <w:spacing w:after="0"/>
+        <w:rPr>
           <w:b/>
           <w:sz w:val="24"/>
         </w:rPr>
@@ -1609,7 +1641,6 @@
           <w:b/>
           <w:sz w:val="24"/>
         </w:rPr>
-        <w:lastRenderedPageBreak/>
         <w:t xml:space="preserve"> </w:t>
       </w:r>
       <w:proofErr w:type="spellStart"/>
@@ -2731,6 +2762,12 @@
           <w:color w:val="080808"/>
         </w:rPr>
         <w:br/>
+      </w:r>
+      <w:r>
+        <w:rPr>
+          <w:color w:val="080808"/>
+        </w:rPr>
+        <w:lastRenderedPageBreak/>
         <w:t xml:space="preserve">       </w:t>
       </w:r>
       <w:proofErr w:type="spellStart"/>
@@ -2870,7 +2907,6 @@
         <w:rPr>
           <w:color w:val="080808"/>
         </w:rPr>
-        <w:lastRenderedPageBreak/>
         <w:br/>
         <w:t xml:space="preserve">    </w:t>
       </w:r>
@@ -5079,7 +5115,14 @@
           <w:color w:val="067D17"/>
         </w:rPr>
         <w:br/>
-        <w:t xml:space="preserve">    "github.com/confluentinc/confluent-kafka-go/v2/schemaregistry/serde/protobuf"</w:t>
+        <w:t xml:space="preserve">    "github.com/confluentinc/confluent-kafka-</w:t>
+      </w:r>
+      <w:r>
+        <w:rPr>
+          <w:color w:val="067D17"/>
+        </w:rPr>
+        <w:lastRenderedPageBreak/>
+        <w:t>go/v2/schemaregistry/serde/protobuf"</w:t>
       </w:r>
       <w:r>
         <w:rPr>
@@ -5103,7 +5146,6 @@
         <w:rPr>
           <w:color w:val="080808"/>
         </w:rPr>
-        <w:lastRenderedPageBreak/>
         <w:br/>
       </w:r>
       <w:proofErr w:type="spellStart"/>
@@ -7518,6 +7560,7 @@
           <w:sz w:val="24"/>
           <w:lang w:eastAsia="es-ES"/>
         </w:rPr>
+        <w:lastRenderedPageBreak/>
         <w:drawing>
           <wp:inline distT="0" distB="0" distL="0" distR="0">
             <wp:extent cx="5400040" cy="510830"/>
@@ -7578,7 +7621,6 @@
           <w:sz w:val="24"/>
           <w:lang w:eastAsia="es-ES"/>
         </w:rPr>
-        <w:lastRenderedPageBreak/>
         <w:drawing>
           <wp:inline distT="0" distB="0" distL="0" distR="0">
             <wp:extent cx="5400040" cy="3841686"/>
@@ -7893,6 +7935,225 @@
           <w:sz w:val="24"/>
         </w:rPr>
       </w:pPr>
+      <w:r>
+        <w:rPr>
+          <w:sz w:val="24"/>
+        </w:rPr>
+        <w:t xml:space="preserve">And </w:t>
+      </w:r>
+      <w:proofErr w:type="spellStart"/>
+      <w:r>
+        <w:rPr>
+          <w:sz w:val="24"/>
+        </w:rPr>
+        <w:t>similarly</w:t>
+      </w:r>
+      <w:proofErr w:type="spellEnd"/>
+      <w:r>
+        <w:rPr>
+          <w:sz w:val="24"/>
+        </w:rPr>
+        <w:t xml:space="preserve"> </w:t>
+      </w:r>
+      <w:proofErr w:type="spellStart"/>
+      <w:r>
+        <w:rPr>
+          <w:sz w:val="24"/>
+        </w:rPr>
+        <w:t>we</w:t>
+      </w:r>
+      <w:proofErr w:type="spellEnd"/>
+      <w:r>
+        <w:rPr>
+          <w:sz w:val="24"/>
+        </w:rPr>
+        <w:t xml:space="preserve"> can </w:t>
+      </w:r>
+      <w:proofErr w:type="spellStart"/>
+      <w:r>
+        <w:rPr>
+          <w:sz w:val="24"/>
+        </w:rPr>
+        <w:t>see</w:t>
+      </w:r>
+      <w:proofErr w:type="spellEnd"/>
+      <w:r>
+        <w:rPr>
+          <w:sz w:val="24"/>
+        </w:rPr>
+        <w:t xml:space="preserve"> </w:t>
+      </w:r>
+      <w:proofErr w:type="spellStart"/>
+      <w:r>
+        <w:rPr>
+          <w:sz w:val="24"/>
+        </w:rPr>
+        <w:t>the</w:t>
+      </w:r>
+      <w:proofErr w:type="spellEnd"/>
+      <w:r>
+        <w:rPr>
+          <w:sz w:val="24"/>
+        </w:rPr>
+        <w:t xml:space="preserve"> </w:t>
+      </w:r>
+      <w:proofErr w:type="spellStart"/>
+      <w:r>
+        <w:rPr>
+          <w:sz w:val="24"/>
+        </w:rPr>
+        <w:t>same</w:t>
+      </w:r>
+      <w:proofErr w:type="spellEnd"/>
+      <w:r>
+        <w:rPr>
+          <w:sz w:val="24"/>
+        </w:rPr>
+        <w:t xml:space="preserve"> </w:t>
+      </w:r>
+      <w:proofErr w:type="spellStart"/>
+      <w:r>
+        <w:rPr>
+          <w:sz w:val="24"/>
+        </w:rPr>
+        <w:t>from</w:t>
+      </w:r>
+      <w:proofErr w:type="spellEnd"/>
+      <w:r>
+        <w:rPr>
+          <w:sz w:val="24"/>
+        </w:rPr>
+        <w:t xml:space="preserve"> Control Center UI:</w:t>
+      </w:r>
+    </w:p>
+    <w:p>
+      <w:pPr>
+        <w:spacing w:after="0"/>
+        <w:rPr>
+          <w:sz w:val="24"/>
+        </w:rPr>
+      </w:pPr>
+    </w:p>
+    <w:p>
+      <w:pPr>
+        <w:spacing w:after="0"/>
+        <w:rPr>
+          <w:sz w:val="24"/>
+        </w:rPr>
+      </w:pPr>
+      <w:r>
+        <w:rPr>
+          <w:noProof/>
+          <w:sz w:val="24"/>
+          <w:lang w:eastAsia="es-ES"/>
+        </w:rPr>
+        <w:lastRenderedPageBreak/>
+        <w:drawing>
+          <wp:inline distT="0" distB="0" distL="0" distR="0">
+            <wp:extent cx="5400040" cy="2681876"/>
+            <wp:effectExtent l="19050" t="0" r="0" b="0"/>
+            <wp:docPr id="3" name="Imagen 1"/>
+            <wp:cNvGraphicFramePr>
+              <a:graphicFrameLocks xmlns:a="http://schemas.openxmlformats.org/drawingml/2006/main" noChangeAspect="1"/>
+            </wp:cNvGraphicFramePr>
+            <a:graphic xmlns:a="http://schemas.openxmlformats.org/drawingml/2006/main">
+              <a:graphicData uri="http://schemas.openxmlformats.org/drawingml/2006/picture">
+                <pic:pic xmlns:pic="http://schemas.openxmlformats.org/drawingml/2006/picture">
+                  <pic:nvPicPr>
+                    <pic:cNvPr id="0" name="Picture 1"/>
+                    <pic:cNvPicPr>
+                      <a:picLocks noChangeAspect="1" noChangeArrowheads="1"/>
+                    </pic:cNvPicPr>
+                  </pic:nvPicPr>
+                  <pic:blipFill>
+                    <a:blip r:embed="rId11" cstate="print"/>
+                    <a:srcRect/>
+                    <a:stretch>
+                      <a:fillRect/>
+                    </a:stretch>
+                  </pic:blipFill>
+                  <pic:spPr bwMode="auto">
+                    <a:xfrm>
+                      <a:off x="0" y="0"/>
+                      <a:ext cx="5400040" cy="2681876"/>
+                    </a:xfrm>
+                    <a:prstGeom prst="rect">
+                      <a:avLst/>
+                    </a:prstGeom>
+                    <a:noFill/>
+                    <a:ln w="9525">
+                      <a:noFill/>
+                      <a:miter lim="800000"/>
+                      <a:headEnd/>
+                      <a:tailEnd/>
+                    </a:ln>
+                  </pic:spPr>
+                </pic:pic>
+              </a:graphicData>
+            </a:graphic>
+          </wp:inline>
+        </w:drawing>
+      </w:r>
+    </w:p>
+    <w:p>
+      <w:pPr>
+        <w:spacing w:after="0"/>
+        <w:rPr>
+          <w:sz w:val="24"/>
+        </w:rPr>
+      </w:pPr>
+      <w:r>
+        <w:rPr>
+          <w:noProof/>
+          <w:sz w:val="24"/>
+          <w:lang w:eastAsia="es-ES"/>
+        </w:rPr>
+        <w:drawing>
+          <wp:inline distT="0" distB="0" distL="0" distR="0">
+            <wp:extent cx="5400040" cy="4876874"/>
+            <wp:effectExtent l="19050" t="0" r="0" b="0"/>
+            <wp:docPr id="11" name="Imagen 4"/>
+            <wp:cNvGraphicFramePr>
+              <a:graphicFrameLocks xmlns:a="http://schemas.openxmlformats.org/drawingml/2006/main" noChangeAspect="1"/>
+            </wp:cNvGraphicFramePr>
+            <a:graphic xmlns:a="http://schemas.openxmlformats.org/drawingml/2006/main">
+              <a:graphicData uri="http://schemas.openxmlformats.org/drawingml/2006/picture">
+                <pic:pic xmlns:pic="http://schemas.openxmlformats.org/drawingml/2006/picture">
+                  <pic:nvPicPr>
+                    <pic:cNvPr id="0" name="Picture 4"/>
+                    <pic:cNvPicPr>
+                      <a:picLocks noChangeAspect="1" noChangeArrowheads="1"/>
+                    </pic:cNvPicPr>
+                  </pic:nvPicPr>
+                  <pic:blipFill>
+                    <a:blip r:embed="rId12"/>
+                    <a:srcRect/>
+                    <a:stretch>
+                      <a:fillRect/>
+                    </a:stretch>
+                  </pic:blipFill>
+                  <pic:spPr bwMode="auto">
+                    <a:xfrm>
+                      <a:off x="0" y="0"/>
+                      <a:ext cx="5400040" cy="4876874"/>
+                    </a:xfrm>
+                    <a:prstGeom prst="rect">
+                      <a:avLst/>
+                    </a:prstGeom>
+                    <a:noFill/>
+                    <a:ln w="9525">
+                      <a:noFill/>
+                      <a:miter lim="800000"/>
+                      <a:headEnd/>
+                      <a:tailEnd/>
+                    </a:ln>
+                  </pic:spPr>
+                </pic:pic>
+              </a:graphicData>
+            </a:graphic>
+          </wp:inline>
+        </w:drawing>
+      </w:r>
     </w:p>
     <w:p>
       <w:pPr>
@@ -8413,7 +8674,7 @@
                     </pic:cNvPicPr>
                   </pic:nvPicPr>
                   <pic:blipFill>
-                    <a:blip r:embed="rId11"/>
+                    <a:blip r:embed="rId13"/>
                     <a:srcRect/>
                     <a:stretch>
                       <a:fillRect/>
@@ -14056,7 +14317,7 @@
                     </pic:cNvPicPr>
                   </pic:nvPicPr>
                   <pic:blipFill>
-                    <a:blip r:embed="rId12" cstate="print"/>
+                    <a:blip r:embed="rId14" cstate="print"/>
                     <a:srcRect/>
                     <a:stretch>
                       <a:fillRect/>
@@ -14162,7 +14423,7 @@
                     </pic:cNvPicPr>
                   </pic:nvPicPr>
                   <pic:blipFill>
-                    <a:blip r:embed="rId13"/>
+                    <a:blip r:embed="rId15"/>
                     <a:srcRect/>
                     <a:stretch>
                       <a:fillRect/>
@@ -14328,7 +14589,7 @@
                     </pic:cNvPicPr>
                   </pic:nvPicPr>
                   <pic:blipFill>
-                    <a:blip r:embed="rId14"/>
+                    <a:blip r:embed="rId16"/>
                     <a:srcRect/>
                     <a:stretch>
                       <a:fillRect/>
@@ -14930,7 +15191,7 @@
                     </pic:cNvPicPr>
                   </pic:nvPicPr>
                   <pic:blipFill>
-                    <a:blip r:embed="rId15"/>
+                    <a:blip r:embed="rId17"/>
                     <a:srcRect/>
                     <a:stretch>
                       <a:fillRect/>
@@ -15239,7 +15500,7 @@
                     </pic:cNvPicPr>
                   </pic:nvPicPr>
                   <pic:blipFill>
-                    <a:blip r:embed="rId16"/>
+                    <a:blip r:embed="rId18"/>
                     <a:srcRect/>
                     <a:stretch>
                       <a:fillRect/>
@@ -15543,7 +15804,7 @@
                     </pic:cNvPicPr>
                   </pic:nvPicPr>
                   <pic:blipFill>
-                    <a:blip r:embed="rId17"/>
+                    <a:blip r:embed="rId19"/>
                     <a:srcRect/>
                     <a:stretch>
                       <a:fillRect/>
@@ -15553,6 +15814,485 @@
                     <a:xfrm>
                       <a:off x="0" y="0"/>
                       <a:ext cx="5400040" cy="3843267"/>
+                    </a:xfrm>
+                    <a:prstGeom prst="rect">
+                      <a:avLst/>
+                    </a:prstGeom>
+                    <a:noFill/>
+                    <a:ln w="9525">
+                      <a:noFill/>
+                      <a:miter lim="800000"/>
+                      <a:headEnd/>
+                      <a:tailEnd/>
+                    </a:ln>
+                  </pic:spPr>
+                </pic:pic>
+              </a:graphicData>
+            </a:graphic>
+          </wp:inline>
+        </w:drawing>
+      </w:r>
+    </w:p>
+    <w:p>
+      <w:pPr>
+        <w:spacing w:after="0"/>
+        <w:rPr>
+          <w:sz w:val="24"/>
+        </w:rPr>
+      </w:pPr>
+      <w:proofErr w:type="spellStart"/>
+      <w:r>
+        <w:rPr>
+          <w:sz w:val="24"/>
+        </w:rPr>
+        <w:lastRenderedPageBreak/>
+        <w:t>From</w:t>
+      </w:r>
+      <w:proofErr w:type="spellEnd"/>
+      <w:r>
+        <w:rPr>
+          <w:sz w:val="24"/>
+        </w:rPr>
+        <w:t xml:space="preserve"> Control Center </w:t>
+      </w:r>
+      <w:proofErr w:type="spellStart"/>
+      <w:r>
+        <w:rPr>
+          <w:sz w:val="24"/>
+        </w:rPr>
+        <w:t>we</w:t>
+      </w:r>
+      <w:proofErr w:type="spellEnd"/>
+      <w:r>
+        <w:rPr>
+          <w:sz w:val="24"/>
+        </w:rPr>
+        <w:t xml:space="preserve"> can </w:t>
+      </w:r>
+      <w:proofErr w:type="spellStart"/>
+      <w:r>
+        <w:rPr>
+          <w:sz w:val="24"/>
+        </w:rPr>
+        <w:t>see</w:t>
+      </w:r>
+      <w:proofErr w:type="spellEnd"/>
+      <w:r>
+        <w:rPr>
+          <w:sz w:val="24"/>
+        </w:rPr>
+        <w:t xml:space="preserve"> </w:t>
+      </w:r>
+      <w:proofErr w:type="spellStart"/>
+      <w:r>
+        <w:rPr>
+          <w:sz w:val="24"/>
+        </w:rPr>
+        <w:t>how</w:t>
+      </w:r>
+      <w:proofErr w:type="spellEnd"/>
+      <w:r>
+        <w:rPr>
+          <w:sz w:val="24"/>
+        </w:rPr>
+        <w:t xml:space="preserve"> </w:t>
+      </w:r>
+      <w:proofErr w:type="spellStart"/>
+      <w:r>
+        <w:rPr>
+          <w:sz w:val="24"/>
+        </w:rPr>
+        <w:t>the</w:t>
+      </w:r>
+      <w:proofErr w:type="spellEnd"/>
+      <w:r>
+        <w:rPr>
+          <w:sz w:val="24"/>
+        </w:rPr>
+        <w:t xml:space="preserve"> </w:t>
+      </w:r>
+      <w:proofErr w:type="spellStart"/>
+      <w:r>
+        <w:rPr>
+          <w:sz w:val="24"/>
+        </w:rPr>
+        <w:t>schema</w:t>
+      </w:r>
+      <w:proofErr w:type="spellEnd"/>
+      <w:r>
+        <w:rPr>
+          <w:sz w:val="24"/>
+        </w:rPr>
+        <w:t xml:space="preserve"> has </w:t>
+      </w:r>
+      <w:proofErr w:type="spellStart"/>
+      <w:r>
+        <w:rPr>
+          <w:sz w:val="24"/>
+        </w:rPr>
+        <w:t>evolved</w:t>
+      </w:r>
+      <w:proofErr w:type="spellEnd"/>
+      <w:r>
+        <w:rPr>
+          <w:sz w:val="24"/>
+        </w:rPr>
+        <w:t>:</w:t>
+      </w:r>
+    </w:p>
+    <w:p>
+      <w:pPr>
+        <w:spacing w:after="0"/>
+        <w:rPr>
+          <w:sz w:val="24"/>
+        </w:rPr>
+      </w:pPr>
+      <w:r>
+        <w:rPr>
+          <w:noProof/>
+          <w:sz w:val="24"/>
+          <w:lang w:eastAsia="es-ES"/>
+        </w:rPr>
+        <w:drawing>
+          <wp:inline distT="0" distB="0" distL="0" distR="0">
+            <wp:extent cx="5400040" cy="4494798"/>
+            <wp:effectExtent l="19050" t="0" r="0" b="0"/>
+            <wp:docPr id="12" name="Imagen 7"/>
+            <wp:cNvGraphicFramePr>
+              <a:graphicFrameLocks xmlns:a="http://schemas.openxmlformats.org/drawingml/2006/main" noChangeAspect="1"/>
+            </wp:cNvGraphicFramePr>
+            <a:graphic xmlns:a="http://schemas.openxmlformats.org/drawingml/2006/main">
+              <a:graphicData uri="http://schemas.openxmlformats.org/drawingml/2006/picture">
+                <pic:pic xmlns:pic="http://schemas.openxmlformats.org/drawingml/2006/picture">
+                  <pic:nvPicPr>
+                    <pic:cNvPr id="0" name="Picture 7"/>
+                    <pic:cNvPicPr>
+                      <a:picLocks noChangeAspect="1" noChangeArrowheads="1"/>
+                    </pic:cNvPicPr>
+                  </pic:nvPicPr>
+                  <pic:blipFill>
+                    <a:blip r:embed="rId20"/>
+                    <a:srcRect/>
+                    <a:stretch>
+                      <a:fillRect/>
+                    </a:stretch>
+                  </pic:blipFill>
+                  <pic:spPr bwMode="auto">
+                    <a:xfrm>
+                      <a:off x="0" y="0"/>
+                      <a:ext cx="5400040" cy="4494798"/>
+                    </a:xfrm>
+                    <a:prstGeom prst="rect">
+                      <a:avLst/>
+                    </a:prstGeom>
+                    <a:noFill/>
+                    <a:ln w="9525">
+                      <a:noFill/>
+                      <a:miter lim="800000"/>
+                      <a:headEnd/>
+                      <a:tailEnd/>
+                    </a:ln>
+                  </pic:spPr>
+                </pic:pic>
+              </a:graphicData>
+            </a:graphic>
+          </wp:inline>
+        </w:drawing>
+      </w:r>
+    </w:p>
+    <w:p>
+      <w:pPr>
+        <w:spacing w:after="0"/>
+        <w:rPr>
+          <w:sz w:val="24"/>
+        </w:rPr>
+      </w:pPr>
+    </w:p>
+    <w:p>
+      <w:pPr>
+        <w:spacing w:after="0"/>
+        <w:rPr>
+          <w:sz w:val="24"/>
+        </w:rPr>
+      </w:pPr>
+      <w:r>
+        <w:rPr>
+          <w:noProof/>
+          <w:sz w:val="24"/>
+          <w:lang w:eastAsia="es-ES"/>
+        </w:rPr>
+        <w:lastRenderedPageBreak/>
+        <w:drawing>
+          <wp:inline distT="0" distB="0" distL="0" distR="0">
+            <wp:extent cx="5400040" cy="5715419"/>
+            <wp:effectExtent l="19050" t="0" r="0" b="0"/>
+            <wp:docPr id="14" name="Imagen 10"/>
+            <wp:cNvGraphicFramePr>
+              <a:graphicFrameLocks xmlns:a="http://schemas.openxmlformats.org/drawingml/2006/main" noChangeAspect="1"/>
+            </wp:cNvGraphicFramePr>
+            <a:graphic xmlns:a="http://schemas.openxmlformats.org/drawingml/2006/main">
+              <a:graphicData uri="http://schemas.openxmlformats.org/drawingml/2006/picture">
+                <pic:pic xmlns:pic="http://schemas.openxmlformats.org/drawingml/2006/picture">
+                  <pic:nvPicPr>
+                    <pic:cNvPr id="0" name="Picture 10"/>
+                    <pic:cNvPicPr>
+                      <a:picLocks noChangeAspect="1" noChangeArrowheads="1"/>
+                    </pic:cNvPicPr>
+                  </pic:nvPicPr>
+                  <pic:blipFill>
+                    <a:blip r:embed="rId21"/>
+                    <a:srcRect/>
+                    <a:stretch>
+                      <a:fillRect/>
+                    </a:stretch>
+                  </pic:blipFill>
+                  <pic:spPr bwMode="auto">
+                    <a:xfrm>
+                      <a:off x="0" y="0"/>
+                      <a:ext cx="5400040" cy="5715419"/>
+                    </a:xfrm>
+                    <a:prstGeom prst="rect">
+                      <a:avLst/>
+                    </a:prstGeom>
+                    <a:noFill/>
+                    <a:ln w="9525">
+                      <a:noFill/>
+                      <a:miter lim="800000"/>
+                      <a:headEnd/>
+                      <a:tailEnd/>
+                    </a:ln>
+                  </pic:spPr>
+                </pic:pic>
+              </a:graphicData>
+            </a:graphic>
+          </wp:inline>
+        </w:drawing>
+      </w:r>
+    </w:p>
+    <w:p>
+      <w:pPr>
+        <w:spacing w:after="0"/>
+        <w:rPr>
+          <w:sz w:val="24"/>
+        </w:rPr>
+      </w:pPr>
+      <w:r>
+        <w:rPr>
+          <w:noProof/>
+          <w:sz w:val="24"/>
+          <w:lang w:eastAsia="es-ES"/>
+        </w:rPr>
+        <w:lastRenderedPageBreak/>
+        <w:drawing>
+          <wp:inline distT="0" distB="0" distL="0" distR="0">
+            <wp:extent cx="4841489" cy="4126523"/>
+            <wp:effectExtent l="19050" t="0" r="0" b="0"/>
+            <wp:docPr id="15" name="Imagen 13"/>
+            <wp:cNvGraphicFramePr>
+              <a:graphicFrameLocks xmlns:a="http://schemas.openxmlformats.org/drawingml/2006/main" noChangeAspect="1"/>
+            </wp:cNvGraphicFramePr>
+            <a:graphic xmlns:a="http://schemas.openxmlformats.org/drawingml/2006/main">
+              <a:graphicData uri="http://schemas.openxmlformats.org/drawingml/2006/picture">
+                <pic:pic xmlns:pic="http://schemas.openxmlformats.org/drawingml/2006/picture">
+                  <pic:nvPicPr>
+                    <pic:cNvPr id="0" name="Picture 13"/>
+                    <pic:cNvPicPr>
+                      <a:picLocks noChangeAspect="1" noChangeArrowheads="1"/>
+                    </pic:cNvPicPr>
+                  </pic:nvPicPr>
+                  <pic:blipFill>
+                    <a:blip r:embed="rId22"/>
+                    <a:srcRect/>
+                    <a:stretch>
+                      <a:fillRect/>
+                    </a:stretch>
+                  </pic:blipFill>
+                  <pic:spPr bwMode="auto">
+                    <a:xfrm>
+                      <a:off x="0" y="0"/>
+                      <a:ext cx="4842838" cy="4127673"/>
+                    </a:xfrm>
+                    <a:prstGeom prst="rect">
+                      <a:avLst/>
+                    </a:prstGeom>
+                    <a:noFill/>
+                    <a:ln w="9525">
+                      <a:noFill/>
+                      <a:miter lim="800000"/>
+                      <a:headEnd/>
+                      <a:tailEnd/>
+                    </a:ln>
+                  </pic:spPr>
+                </pic:pic>
+              </a:graphicData>
+            </a:graphic>
+          </wp:inline>
+        </w:drawing>
+      </w:r>
+    </w:p>
+    <w:p>
+      <w:pPr>
+        <w:spacing w:after="0"/>
+        <w:rPr>
+          <w:sz w:val="24"/>
+        </w:rPr>
+      </w:pPr>
+    </w:p>
+    <w:p>
+      <w:pPr>
+        <w:spacing w:after="0"/>
+        <w:rPr>
+          <w:sz w:val="24"/>
+        </w:rPr>
+      </w:pPr>
+      <w:proofErr w:type="spellStart"/>
+      <w:r>
+        <w:rPr>
+          <w:sz w:val="24"/>
+        </w:rPr>
+        <w:t>We</w:t>
+      </w:r>
+      <w:proofErr w:type="spellEnd"/>
+      <w:r>
+        <w:rPr>
+          <w:sz w:val="24"/>
+        </w:rPr>
+        <w:t xml:space="preserve"> can </w:t>
+      </w:r>
+      <w:proofErr w:type="spellStart"/>
+      <w:r>
+        <w:rPr>
+          <w:sz w:val="24"/>
+        </w:rPr>
+        <w:t>evolve</w:t>
+      </w:r>
+      <w:proofErr w:type="spellEnd"/>
+      <w:r>
+        <w:rPr>
+          <w:sz w:val="24"/>
+        </w:rPr>
+        <w:t xml:space="preserve"> </w:t>
+      </w:r>
+      <w:proofErr w:type="spellStart"/>
+      <w:r>
+        <w:rPr>
+          <w:sz w:val="24"/>
+        </w:rPr>
+        <w:t>the</w:t>
+      </w:r>
+      <w:proofErr w:type="spellEnd"/>
+      <w:r>
+        <w:rPr>
+          <w:sz w:val="24"/>
+        </w:rPr>
+        <w:t xml:space="preserve"> </w:t>
+      </w:r>
+      <w:proofErr w:type="spellStart"/>
+      <w:r>
+        <w:rPr>
+          <w:sz w:val="24"/>
+        </w:rPr>
+        <w:t>schema</w:t>
+      </w:r>
+      <w:proofErr w:type="spellEnd"/>
+      <w:r>
+        <w:rPr>
+          <w:sz w:val="24"/>
+        </w:rPr>
+        <w:t xml:space="preserve"> </w:t>
+      </w:r>
+      <w:proofErr w:type="spellStart"/>
+      <w:r>
+        <w:rPr>
+          <w:sz w:val="24"/>
+        </w:rPr>
+        <w:t>from</w:t>
+      </w:r>
+      <w:proofErr w:type="spellEnd"/>
+      <w:r>
+        <w:rPr>
+          <w:sz w:val="24"/>
+        </w:rPr>
+        <w:t xml:space="preserve"> </w:t>
+      </w:r>
+      <w:proofErr w:type="spellStart"/>
+      <w:r>
+        <w:rPr>
+          <w:sz w:val="24"/>
+        </w:rPr>
+        <w:t>the</w:t>
+      </w:r>
+      <w:proofErr w:type="spellEnd"/>
+      <w:r>
+        <w:rPr>
+          <w:sz w:val="24"/>
+        </w:rPr>
+        <w:t xml:space="preserve"> UI as </w:t>
+      </w:r>
+      <w:proofErr w:type="spellStart"/>
+      <w:r>
+        <w:rPr>
+          <w:sz w:val="24"/>
+        </w:rPr>
+        <w:t>well</w:t>
+      </w:r>
+      <w:proofErr w:type="spellEnd"/>
+      <w:r>
+        <w:rPr>
+          <w:sz w:val="24"/>
+        </w:rPr>
+        <w:t>:</w:t>
+      </w:r>
+    </w:p>
+    <w:p>
+      <w:pPr>
+        <w:spacing w:after="0"/>
+        <w:rPr>
+          <w:sz w:val="24"/>
+        </w:rPr>
+      </w:pPr>
+    </w:p>
+    <w:p>
+      <w:pPr>
+        <w:spacing w:after="0"/>
+        <w:rPr>
+          <w:sz w:val="24"/>
+        </w:rPr>
+      </w:pPr>
+      <w:r>
+        <w:rPr>
+          <w:noProof/>
+          <w:sz w:val="24"/>
+          <w:lang w:eastAsia="es-ES"/>
+        </w:rPr>
+        <w:drawing>
+          <wp:inline distT="0" distB="0" distL="0" distR="0">
+            <wp:extent cx="4099505" cy="3821723"/>
+            <wp:effectExtent l="19050" t="0" r="0" b="0"/>
+            <wp:docPr id="16" name="Imagen 16"/>
+            <wp:cNvGraphicFramePr>
+              <a:graphicFrameLocks xmlns:a="http://schemas.openxmlformats.org/drawingml/2006/main" noChangeAspect="1"/>
+            </wp:cNvGraphicFramePr>
+            <a:graphic xmlns:a="http://schemas.openxmlformats.org/drawingml/2006/main">
+              <a:graphicData uri="http://schemas.openxmlformats.org/drawingml/2006/picture">
+                <pic:pic xmlns:pic="http://schemas.openxmlformats.org/drawingml/2006/picture">
+                  <pic:nvPicPr>
+                    <pic:cNvPr id="0" name="Picture 16"/>
+                    <pic:cNvPicPr>
+                      <a:picLocks noChangeAspect="1" noChangeArrowheads="1"/>
+                    </pic:cNvPicPr>
+                  </pic:nvPicPr>
+                  <pic:blipFill>
+                    <a:blip r:embed="rId23"/>
+                    <a:srcRect/>
+                    <a:stretch>
+                      <a:fillRect/>
+                    </a:stretch>
+                  </pic:blipFill>
+                  <pic:spPr bwMode="auto">
+                    <a:xfrm>
+                      <a:off x="0" y="0"/>
+                      <a:ext cx="4098749" cy="3821019"/>
                     </a:xfrm>
                     <a:prstGeom prst="rect">
                       <a:avLst/>

</xml_diff>

<commit_message>
Added a Postgres Source connector sharing the same kafka topic and protobuf contract
</commit_message>
<xml_diff>
--- a/grpc-go-kafka-producer-and-consumer-communication.docx
+++ b/grpc-go-kafka-producer-and-consumer-communication.docx
@@ -1385,7 +1385,7 @@
                     </pic:cNvPicPr>
                   </pic:nvPicPr>
                   <pic:blipFill>
-                    <a:blip r:embed="rId4"/>
+                    <a:blip r:embed="rId5"/>
                     <a:srcRect/>
                     <a:stretch>
                       <a:fillRect/>
@@ -1567,7 +1567,7 @@
                     </pic:cNvPicPr>
                   </pic:nvPicPr>
                   <pic:blipFill>
-                    <a:blip r:embed="rId5"/>
+                    <a:blip r:embed="rId6"/>
                     <a:srcRect/>
                     <a:stretch>
                       <a:fillRect/>
@@ -2192,7 +2192,7 @@
                     </pic:cNvPicPr>
                   </pic:nvPicPr>
                   <pic:blipFill>
-                    <a:blip r:embed="rId6"/>
+                    <a:blip r:embed="rId7"/>
                     <a:srcRect/>
                     <a:stretch>
                       <a:fillRect/>
@@ -7342,7 +7342,7 @@
                     </pic:cNvPicPr>
                   </pic:nvPicPr>
                   <pic:blipFill>
-                    <a:blip r:embed="rId7"/>
+                    <a:blip r:embed="rId8"/>
                     <a:srcRect/>
                     <a:stretch>
                       <a:fillRect/>
@@ -7579,7 +7579,7 @@
                     </pic:cNvPicPr>
                   </pic:nvPicPr>
                   <pic:blipFill>
-                    <a:blip r:embed="rId8"/>
+                    <a:blip r:embed="rId9"/>
                     <a:srcRect/>
                     <a:stretch>
                       <a:fillRect/>
@@ -7639,7 +7639,7 @@
                     </pic:cNvPicPr>
                   </pic:nvPicPr>
                   <pic:blipFill>
-                    <a:blip r:embed="rId9"/>
+                    <a:blip r:embed="rId10"/>
                     <a:srcRect/>
                     <a:stretch>
                       <a:fillRect/>
@@ -7891,7 +7891,7 @@
                     </pic:cNvPicPr>
                   </pic:nvPicPr>
                   <pic:blipFill>
-                    <a:blip r:embed="rId10"/>
+                    <a:blip r:embed="rId11"/>
                     <a:srcRect/>
                     <a:stretch>
                       <a:fillRect/>
@@ -8066,7 +8066,7 @@
                     </pic:cNvPicPr>
                   </pic:nvPicPr>
                   <pic:blipFill>
-                    <a:blip r:embed="rId11" cstate="print"/>
+                    <a:blip r:embed="rId12" cstate="print"/>
                     <a:srcRect/>
                     <a:stretch>
                       <a:fillRect/>
@@ -8126,7 +8126,7 @@
                     </pic:cNvPicPr>
                   </pic:nvPicPr>
                   <pic:blipFill>
-                    <a:blip r:embed="rId12"/>
+                    <a:blip r:embed="rId13"/>
                     <a:srcRect/>
                     <a:stretch>
                       <a:fillRect/>
@@ -8674,7 +8674,7 @@
                     </pic:cNvPicPr>
                   </pic:nvPicPr>
                   <pic:blipFill>
-                    <a:blip r:embed="rId13"/>
+                    <a:blip r:embed="rId14"/>
                     <a:srcRect/>
                     <a:stretch>
                       <a:fillRect/>
@@ -14317,7 +14317,7 @@
                     </pic:cNvPicPr>
                   </pic:nvPicPr>
                   <pic:blipFill>
-                    <a:blip r:embed="rId14" cstate="print"/>
+                    <a:blip r:embed="rId15" cstate="print"/>
                     <a:srcRect/>
                     <a:stretch>
                       <a:fillRect/>
@@ -14423,7 +14423,7 @@
                     </pic:cNvPicPr>
                   </pic:nvPicPr>
                   <pic:blipFill>
-                    <a:blip r:embed="rId15"/>
+                    <a:blip r:embed="rId16"/>
                     <a:srcRect/>
                     <a:stretch>
                       <a:fillRect/>
@@ -14589,7 +14589,7 @@
                     </pic:cNvPicPr>
                   </pic:nvPicPr>
                   <pic:blipFill>
-                    <a:blip r:embed="rId16"/>
+                    <a:blip r:embed="rId17"/>
                     <a:srcRect/>
                     <a:stretch>
                       <a:fillRect/>
@@ -15191,7 +15191,7 @@
                     </pic:cNvPicPr>
                   </pic:nvPicPr>
                   <pic:blipFill>
-                    <a:blip r:embed="rId17"/>
+                    <a:blip r:embed="rId18"/>
                     <a:srcRect/>
                     <a:stretch>
                       <a:fillRect/>
@@ -15500,7 +15500,7 @@
                     </pic:cNvPicPr>
                   </pic:nvPicPr>
                   <pic:blipFill>
-                    <a:blip r:embed="rId18"/>
+                    <a:blip r:embed="rId19"/>
                     <a:srcRect/>
                     <a:stretch>
                       <a:fillRect/>
@@ -15804,7 +15804,7 @@
                     </pic:cNvPicPr>
                   </pic:nvPicPr>
                   <pic:blipFill>
-                    <a:blip r:embed="rId19"/>
+                    <a:blip r:embed="rId20"/>
                     <a:srcRect/>
                     <a:stretch>
                       <a:fillRect/>
@@ -15971,7 +15971,7 @@
                     </pic:cNvPicPr>
                   </pic:nvPicPr>
                   <pic:blipFill>
-                    <a:blip r:embed="rId20"/>
+                    <a:blip r:embed="rId21"/>
                     <a:srcRect/>
                     <a:stretch>
                       <a:fillRect/>
@@ -16040,7 +16040,7 @@
                     </pic:cNvPicPr>
                   </pic:nvPicPr>
                   <pic:blipFill>
-                    <a:blip r:embed="rId21"/>
+                    <a:blip r:embed="rId22"/>
                     <a:srcRect/>
                     <a:stretch>
                       <a:fillRect/>
@@ -16101,7 +16101,7 @@
                     </pic:cNvPicPr>
                   </pic:nvPicPr>
                   <pic:blipFill>
-                    <a:blip r:embed="rId22"/>
+                    <a:blip r:embed="rId23"/>
                     <a:srcRect/>
                     <a:stretch>
                       <a:fillRect/>
@@ -16283,7 +16283,7 @@
                     </pic:cNvPicPr>
                   </pic:nvPicPr>
                   <pic:blipFill>
-                    <a:blip r:embed="rId23"/>
+                    <a:blip r:embed="rId24"/>
                     <a:srcRect/>
                     <a:stretch>
                       <a:fillRect/>
@@ -16312,6 +16312,3905 @@
         </w:drawing>
       </w:r>
     </w:p>
+    <w:p>
+      <w:pPr>
+        <w:spacing w:after="0"/>
+        <w:rPr>
+          <w:sz w:val="24"/>
+        </w:rPr>
+      </w:pPr>
+    </w:p>
+    <w:p>
+      <w:pPr>
+        <w:spacing w:after="0"/>
+        <w:rPr>
+          <w:b/>
+          <w:sz w:val="28"/>
+          <w:u w:val="single"/>
+        </w:rPr>
+      </w:pPr>
+      <w:r>
+        <w:rPr>
+          <w:b/>
+          <w:sz w:val="28"/>
+          <w:u w:val="single"/>
+        </w:rPr>
+        <w:lastRenderedPageBreak/>
+        <w:t>FAN-IN ARCHITECTURE IMPLEMENTATION: CREATE A POSTGRES KAFKA SOURCE CONNECTOR THAT ALSO WRITES TO THE ABOVE TOPIC</w:t>
+      </w:r>
+    </w:p>
+    <w:p>
+      <w:pPr>
+        <w:spacing w:after="0"/>
+        <w:rPr>
+          <w:sz w:val="24"/>
+        </w:rPr>
+      </w:pPr>
+    </w:p>
+    <w:p>
+      <w:pPr>
+        <w:spacing w:after="0"/>
+        <w:rPr>
+          <w:rStyle w:val="hljs-keyword"/>
+        </w:rPr>
+      </w:pPr>
+      <w:proofErr w:type="spellStart"/>
+      <w:r>
+        <w:rPr>
+          <w:rStyle w:val="hljs-keyword"/>
+        </w:rPr>
+        <w:t>Next</w:t>
+      </w:r>
+      <w:proofErr w:type="spellEnd"/>
+      <w:r>
+        <w:rPr>
+          <w:rStyle w:val="hljs-keyword"/>
+        </w:rPr>
+        <w:t xml:space="preserve">, </w:t>
+      </w:r>
+      <w:proofErr w:type="spellStart"/>
+      <w:r>
+        <w:rPr>
+          <w:rStyle w:val="hljs-keyword"/>
+        </w:rPr>
+        <w:t>let’s</w:t>
+      </w:r>
+      <w:proofErr w:type="spellEnd"/>
+      <w:r>
+        <w:rPr>
+          <w:rStyle w:val="hljs-keyword"/>
+        </w:rPr>
+        <w:t xml:space="preserve"> </w:t>
+      </w:r>
+      <w:proofErr w:type="spellStart"/>
+      <w:r>
+        <w:rPr>
+          <w:rStyle w:val="hljs-keyword"/>
+        </w:rPr>
+        <w:t>create</w:t>
+      </w:r>
+      <w:proofErr w:type="spellEnd"/>
+      <w:r>
+        <w:rPr>
+          <w:rStyle w:val="hljs-keyword"/>
+        </w:rPr>
+        <w:t xml:space="preserve"> a </w:t>
+      </w:r>
+      <w:proofErr w:type="spellStart"/>
+      <w:r>
+        <w:rPr>
+          <w:rStyle w:val="hljs-keyword"/>
+        </w:rPr>
+        <w:t>postgres</w:t>
+      </w:r>
+      <w:proofErr w:type="spellEnd"/>
+      <w:r>
+        <w:rPr>
+          <w:rStyle w:val="hljs-keyword"/>
+        </w:rPr>
+        <w:t xml:space="preserve"> </w:t>
+      </w:r>
+      <w:proofErr w:type="spellStart"/>
+      <w:r>
+        <w:rPr>
+          <w:rStyle w:val="hljs-keyword"/>
+        </w:rPr>
+        <w:t>table</w:t>
+      </w:r>
+      <w:proofErr w:type="spellEnd"/>
+      <w:r>
+        <w:rPr>
+          <w:rStyle w:val="hljs-keyword"/>
+        </w:rPr>
+        <w:t xml:space="preserve"> </w:t>
+      </w:r>
+      <w:proofErr w:type="spellStart"/>
+      <w:r>
+        <w:rPr>
+          <w:rStyle w:val="hljs-keyword"/>
+        </w:rPr>
+        <w:t>equivalent</w:t>
+      </w:r>
+      <w:proofErr w:type="spellEnd"/>
+      <w:r>
+        <w:rPr>
+          <w:rStyle w:val="hljs-keyword"/>
+        </w:rPr>
+        <w:t xml:space="preserve"> </w:t>
+      </w:r>
+      <w:proofErr w:type="spellStart"/>
+      <w:r>
+        <w:rPr>
+          <w:rStyle w:val="hljs-keyword"/>
+        </w:rPr>
+        <w:t>to</w:t>
+      </w:r>
+      <w:proofErr w:type="spellEnd"/>
+      <w:r>
+        <w:rPr>
+          <w:rStyle w:val="hljs-keyword"/>
+        </w:rPr>
+        <w:t xml:space="preserve"> </w:t>
+      </w:r>
+      <w:proofErr w:type="spellStart"/>
+      <w:r>
+        <w:rPr>
+          <w:rStyle w:val="hljs-keyword"/>
+        </w:rPr>
+        <w:t>the</w:t>
+      </w:r>
+      <w:proofErr w:type="spellEnd"/>
+      <w:r>
+        <w:rPr>
+          <w:rStyle w:val="hljs-keyword"/>
+        </w:rPr>
+        <w:t xml:space="preserve"> </w:t>
+      </w:r>
+      <w:proofErr w:type="spellStart"/>
+      <w:r>
+        <w:rPr>
+          <w:rStyle w:val="hljs-keyword"/>
+        </w:rPr>
+        <w:t>protobuf</w:t>
+      </w:r>
+      <w:proofErr w:type="spellEnd"/>
+      <w:r>
+        <w:rPr>
+          <w:rStyle w:val="hljs-keyword"/>
+        </w:rPr>
+        <w:t xml:space="preserve"> </w:t>
+      </w:r>
+      <w:proofErr w:type="spellStart"/>
+      <w:r>
+        <w:rPr>
+          <w:rStyle w:val="hljs-keyword"/>
+        </w:rPr>
+        <w:t>contract</w:t>
+      </w:r>
+      <w:proofErr w:type="spellEnd"/>
+      <w:r>
+        <w:rPr>
+          <w:rStyle w:val="hljs-keyword"/>
+        </w:rPr>
+        <w:t xml:space="preserve"> </w:t>
+      </w:r>
+      <w:proofErr w:type="spellStart"/>
+      <w:r>
+        <w:rPr>
+          <w:rStyle w:val="hljs-keyword"/>
+        </w:rPr>
+        <w:t>that</w:t>
+      </w:r>
+      <w:proofErr w:type="spellEnd"/>
+      <w:r>
+        <w:rPr>
+          <w:rStyle w:val="hljs-keyword"/>
+        </w:rPr>
+        <w:t xml:space="preserve"> </w:t>
+      </w:r>
+      <w:proofErr w:type="spellStart"/>
+      <w:r>
+        <w:rPr>
+          <w:rStyle w:val="hljs-keyword"/>
+        </w:rPr>
+        <w:t>we</w:t>
+      </w:r>
+      <w:proofErr w:type="spellEnd"/>
+      <w:r>
+        <w:rPr>
+          <w:rStyle w:val="hljs-keyword"/>
+        </w:rPr>
+        <w:t xml:space="preserve"> </w:t>
+      </w:r>
+      <w:proofErr w:type="spellStart"/>
+      <w:r>
+        <w:rPr>
+          <w:rStyle w:val="hljs-keyword"/>
+        </w:rPr>
+        <w:t>used</w:t>
+      </w:r>
+      <w:proofErr w:type="spellEnd"/>
+      <w:r>
+        <w:rPr>
+          <w:rStyle w:val="hljs-keyword"/>
+        </w:rPr>
+        <w:t xml:space="preserve"> </w:t>
+      </w:r>
+      <w:proofErr w:type="spellStart"/>
+      <w:r>
+        <w:rPr>
+          <w:rStyle w:val="hljs-keyword"/>
+        </w:rPr>
+        <w:t>earlier</w:t>
+      </w:r>
+      <w:proofErr w:type="spellEnd"/>
+      <w:r>
+        <w:rPr>
+          <w:rStyle w:val="hljs-keyword"/>
+        </w:rPr>
+        <w:t xml:space="preserve">, and </w:t>
+      </w:r>
+      <w:proofErr w:type="spellStart"/>
+      <w:r>
+        <w:rPr>
+          <w:rStyle w:val="hljs-keyword"/>
+        </w:rPr>
+        <w:t>there</w:t>
+      </w:r>
+      <w:proofErr w:type="spellEnd"/>
+      <w:r>
+        <w:rPr>
+          <w:rStyle w:val="hljs-keyword"/>
+        </w:rPr>
+        <w:t xml:space="preserve"> </w:t>
+      </w:r>
+      <w:proofErr w:type="spellStart"/>
+      <w:r>
+        <w:rPr>
+          <w:rStyle w:val="hljs-keyword"/>
+        </w:rPr>
+        <w:t>after</w:t>
+      </w:r>
+      <w:proofErr w:type="spellEnd"/>
+      <w:r>
+        <w:rPr>
+          <w:rStyle w:val="hljs-keyword"/>
+        </w:rPr>
+        <w:t xml:space="preserve"> </w:t>
+      </w:r>
+      <w:proofErr w:type="spellStart"/>
+      <w:r>
+        <w:rPr>
+          <w:rStyle w:val="hljs-keyword"/>
+        </w:rPr>
+        <w:t>create</w:t>
+      </w:r>
+      <w:proofErr w:type="spellEnd"/>
+      <w:r>
+        <w:rPr>
+          <w:rStyle w:val="hljs-keyword"/>
+        </w:rPr>
+        <w:t xml:space="preserve"> a </w:t>
+      </w:r>
+      <w:proofErr w:type="spellStart"/>
+      <w:r>
+        <w:rPr>
+          <w:rStyle w:val="hljs-keyword"/>
+        </w:rPr>
+        <w:t>Postgres</w:t>
+      </w:r>
+      <w:proofErr w:type="spellEnd"/>
+      <w:r>
+        <w:rPr>
+          <w:rStyle w:val="hljs-keyword"/>
+        </w:rPr>
+        <w:t xml:space="preserve"> </w:t>
+      </w:r>
+      <w:proofErr w:type="spellStart"/>
+      <w:r>
+        <w:rPr>
+          <w:rStyle w:val="hljs-keyword"/>
+        </w:rPr>
+        <w:t>Source</w:t>
+      </w:r>
+      <w:proofErr w:type="spellEnd"/>
+      <w:r>
+        <w:rPr>
+          <w:rStyle w:val="hljs-keyword"/>
+        </w:rPr>
+        <w:t xml:space="preserve"> </w:t>
+      </w:r>
+      <w:proofErr w:type="spellStart"/>
+      <w:r>
+        <w:rPr>
+          <w:rStyle w:val="hljs-keyword"/>
+        </w:rPr>
+        <w:t>connector</w:t>
+      </w:r>
+      <w:proofErr w:type="spellEnd"/>
+      <w:r>
+        <w:rPr>
+          <w:rStyle w:val="hljs-keyword"/>
+        </w:rPr>
+        <w:t xml:space="preserve"> </w:t>
+      </w:r>
+      <w:proofErr w:type="spellStart"/>
+      <w:r>
+        <w:rPr>
+          <w:rStyle w:val="hljs-keyword"/>
+        </w:rPr>
+        <w:t>that</w:t>
+      </w:r>
+      <w:proofErr w:type="spellEnd"/>
+      <w:r>
+        <w:rPr>
+          <w:rStyle w:val="hljs-keyword"/>
+        </w:rPr>
+        <w:t xml:space="preserve"> </w:t>
+      </w:r>
+      <w:proofErr w:type="spellStart"/>
+      <w:r>
+        <w:rPr>
+          <w:rStyle w:val="hljs-keyword"/>
+        </w:rPr>
+        <w:t>writes</w:t>
+      </w:r>
+      <w:proofErr w:type="spellEnd"/>
+      <w:r>
+        <w:rPr>
+          <w:rStyle w:val="hljs-keyword"/>
+        </w:rPr>
+        <w:t xml:space="preserve"> in </w:t>
+      </w:r>
+      <w:proofErr w:type="spellStart"/>
+      <w:r>
+        <w:rPr>
+          <w:rStyle w:val="hljs-keyword"/>
+        </w:rPr>
+        <w:t>the</w:t>
+      </w:r>
+      <w:proofErr w:type="spellEnd"/>
+      <w:r>
+        <w:rPr>
+          <w:rStyle w:val="hljs-keyword"/>
+        </w:rPr>
+        <w:t xml:space="preserve"> </w:t>
+      </w:r>
+      <w:proofErr w:type="spellStart"/>
+      <w:r>
+        <w:rPr>
+          <w:rStyle w:val="hljs-keyword"/>
+        </w:rPr>
+        <w:t>user-updates-value</w:t>
+      </w:r>
+      <w:proofErr w:type="spellEnd"/>
+      <w:r>
+        <w:rPr>
+          <w:rStyle w:val="hljs-keyword"/>
+        </w:rPr>
+        <w:t xml:space="preserve"> </w:t>
+      </w:r>
+      <w:proofErr w:type="spellStart"/>
+      <w:r>
+        <w:rPr>
+          <w:rStyle w:val="hljs-keyword"/>
+        </w:rPr>
+        <w:t>topic</w:t>
+      </w:r>
+      <w:proofErr w:type="spellEnd"/>
+      <w:r>
+        <w:rPr>
+          <w:rStyle w:val="hljs-keyword"/>
+        </w:rPr>
+        <w:t xml:space="preserve">, </w:t>
+      </w:r>
+      <w:proofErr w:type="spellStart"/>
+      <w:r>
+        <w:rPr>
+          <w:rStyle w:val="hljs-keyword"/>
+        </w:rPr>
+        <w:t>validated</w:t>
+      </w:r>
+      <w:proofErr w:type="spellEnd"/>
+      <w:r>
+        <w:rPr>
+          <w:rStyle w:val="hljs-keyword"/>
+        </w:rPr>
+        <w:t xml:space="preserve"> </w:t>
+      </w:r>
+      <w:proofErr w:type="spellStart"/>
+      <w:r>
+        <w:rPr>
+          <w:rStyle w:val="hljs-keyword"/>
+        </w:rPr>
+        <w:t>with</w:t>
+      </w:r>
+      <w:proofErr w:type="spellEnd"/>
+      <w:r>
+        <w:rPr>
+          <w:rStyle w:val="hljs-keyword"/>
+        </w:rPr>
+        <w:t xml:space="preserve"> </w:t>
+      </w:r>
+      <w:proofErr w:type="spellStart"/>
+      <w:r>
+        <w:rPr>
+          <w:rStyle w:val="hljs-keyword"/>
+        </w:rPr>
+        <w:t>the</w:t>
+      </w:r>
+      <w:proofErr w:type="spellEnd"/>
+      <w:r>
+        <w:rPr>
+          <w:rStyle w:val="hljs-keyword"/>
+        </w:rPr>
+        <w:t xml:space="preserve"> </w:t>
+      </w:r>
+      <w:proofErr w:type="spellStart"/>
+      <w:r>
+        <w:rPr>
+          <w:rStyle w:val="hljs-keyword"/>
+        </w:rPr>
+        <w:t>same</w:t>
+      </w:r>
+      <w:proofErr w:type="spellEnd"/>
+      <w:r>
+        <w:rPr>
+          <w:rStyle w:val="hljs-keyword"/>
+        </w:rPr>
+        <w:t xml:space="preserve"> </w:t>
+      </w:r>
+      <w:proofErr w:type="spellStart"/>
+      <w:r>
+        <w:rPr>
+          <w:rStyle w:val="hljs-keyword"/>
+        </w:rPr>
+        <w:t>protobuf</w:t>
+      </w:r>
+      <w:proofErr w:type="spellEnd"/>
+      <w:r>
+        <w:rPr>
+          <w:rStyle w:val="hljs-keyword"/>
+        </w:rPr>
+        <w:t xml:space="preserve"> </w:t>
+      </w:r>
+      <w:proofErr w:type="spellStart"/>
+      <w:r>
+        <w:rPr>
+          <w:rStyle w:val="hljs-keyword"/>
+        </w:rPr>
+        <w:t>schema</w:t>
+      </w:r>
+      <w:proofErr w:type="spellEnd"/>
+      <w:r>
+        <w:rPr>
+          <w:rStyle w:val="hljs-keyword"/>
+        </w:rPr>
+        <w:t xml:space="preserve"> </w:t>
+      </w:r>
+      <w:proofErr w:type="spellStart"/>
+      <w:r>
+        <w:rPr>
+          <w:rStyle w:val="hljs-keyword"/>
+        </w:rPr>
+        <w:t>that</w:t>
+      </w:r>
+      <w:proofErr w:type="spellEnd"/>
+      <w:r>
+        <w:rPr>
+          <w:rStyle w:val="hljs-keyword"/>
+        </w:rPr>
+        <w:t xml:space="preserve"> </w:t>
+      </w:r>
+      <w:proofErr w:type="spellStart"/>
+      <w:r>
+        <w:rPr>
+          <w:rStyle w:val="hljs-keyword"/>
+        </w:rPr>
+        <w:t>is</w:t>
+      </w:r>
+      <w:proofErr w:type="spellEnd"/>
+      <w:r>
+        <w:rPr>
+          <w:rStyle w:val="hljs-keyword"/>
+        </w:rPr>
+        <w:t xml:space="preserve"> </w:t>
+      </w:r>
+      <w:proofErr w:type="spellStart"/>
+      <w:r>
+        <w:rPr>
+          <w:rStyle w:val="hljs-keyword"/>
+        </w:rPr>
+        <w:t>assigned</w:t>
+      </w:r>
+      <w:proofErr w:type="spellEnd"/>
+      <w:r>
+        <w:rPr>
+          <w:rStyle w:val="hljs-keyword"/>
+        </w:rPr>
+        <w:t xml:space="preserve"> </w:t>
+      </w:r>
+      <w:proofErr w:type="spellStart"/>
+      <w:r>
+        <w:rPr>
+          <w:rStyle w:val="hljs-keyword"/>
+        </w:rPr>
+        <w:t>to</w:t>
+      </w:r>
+      <w:proofErr w:type="spellEnd"/>
+      <w:r>
+        <w:rPr>
+          <w:rStyle w:val="hljs-keyword"/>
+        </w:rPr>
+        <w:t xml:space="preserve"> </w:t>
+      </w:r>
+      <w:proofErr w:type="spellStart"/>
+      <w:r>
+        <w:rPr>
+          <w:rStyle w:val="hljs-keyword"/>
+        </w:rPr>
+        <w:t>the</w:t>
+      </w:r>
+      <w:proofErr w:type="spellEnd"/>
+      <w:r>
+        <w:rPr>
+          <w:rStyle w:val="hljs-keyword"/>
+        </w:rPr>
+        <w:t xml:space="preserve"> </w:t>
+      </w:r>
+      <w:proofErr w:type="spellStart"/>
+      <w:r>
+        <w:rPr>
+          <w:rStyle w:val="hljs-keyword"/>
+        </w:rPr>
+        <w:t>topic</w:t>
+      </w:r>
+      <w:proofErr w:type="spellEnd"/>
+      <w:r>
+        <w:rPr>
+          <w:rStyle w:val="hljs-keyword"/>
+        </w:rPr>
+        <w:t>.</w:t>
+      </w:r>
+    </w:p>
+    <w:p>
+      <w:pPr>
+        <w:spacing w:after="0"/>
+        <w:rPr>
+          <w:rStyle w:val="hljs-keyword"/>
+        </w:rPr>
+      </w:pPr>
+    </w:p>
+    <w:p>
+      <w:pPr>
+        <w:spacing w:after="0"/>
+        <w:rPr>
+          <w:rFonts w:ascii="Courier New" w:hAnsi="Courier New" w:cs="Courier New"/>
+          <w:i/>
+          <w:sz w:val="18"/>
+        </w:rPr>
+      </w:pPr>
+      <w:r>
+        <w:rPr>
+          <w:rStyle w:val="hljs-keyword"/>
+          <w:rFonts w:ascii="Courier New" w:hAnsi="Courier New" w:cs="Courier New"/>
+          <w:i/>
+          <w:sz w:val="18"/>
+        </w:rPr>
+        <w:t>CREATE</w:t>
+      </w:r>
+      <w:r>
+        <w:rPr>
+          <w:rFonts w:ascii="Courier New" w:hAnsi="Courier New" w:cs="Courier New"/>
+          <w:i/>
+          <w:sz w:val="18"/>
+        </w:rPr>
+        <w:t xml:space="preserve"> </w:t>
+      </w:r>
+      <w:r>
+        <w:rPr>
+          <w:rStyle w:val="hljs-keyword"/>
+          <w:rFonts w:ascii="Courier New" w:hAnsi="Courier New" w:cs="Courier New"/>
+          <w:i/>
+          <w:sz w:val="18"/>
+        </w:rPr>
+        <w:t>TABLE</w:t>
+      </w:r>
+      <w:r>
+        <w:rPr>
+          <w:rFonts w:ascii="Courier New" w:hAnsi="Courier New" w:cs="Courier New"/>
+          <w:i/>
+          <w:sz w:val="18"/>
+        </w:rPr>
+        <w:t xml:space="preserve"> </w:t>
+      </w:r>
+      <w:proofErr w:type="spellStart"/>
+      <w:r>
+        <w:rPr>
+          <w:rFonts w:ascii="Courier New" w:hAnsi="Courier New" w:cs="Courier New"/>
+          <w:i/>
+          <w:sz w:val="18"/>
+        </w:rPr>
+        <w:t>users</w:t>
+      </w:r>
+      <w:proofErr w:type="spellEnd"/>
+      <w:r>
+        <w:rPr>
+          <w:rFonts w:ascii="Courier New" w:hAnsi="Courier New" w:cs="Courier New"/>
+          <w:i/>
+          <w:sz w:val="18"/>
+        </w:rPr>
+        <w:t xml:space="preserve"> </w:t>
+      </w:r>
+      <w:proofErr w:type="gramStart"/>
+      <w:r>
+        <w:rPr>
+          <w:rFonts w:ascii="Courier New" w:hAnsi="Courier New" w:cs="Courier New"/>
+          <w:i/>
+          <w:sz w:val="18"/>
+        </w:rPr>
+        <w:t xml:space="preserve">( </w:t>
+      </w:r>
+      <w:proofErr w:type="spellStart"/>
+      <w:r>
+        <w:rPr>
+          <w:rFonts w:ascii="Courier New" w:hAnsi="Courier New" w:cs="Courier New"/>
+          <w:i/>
+          <w:sz w:val="18"/>
+        </w:rPr>
+        <w:t>user</w:t>
+      </w:r>
+      <w:proofErr w:type="gramEnd"/>
+      <w:r>
+        <w:rPr>
+          <w:rFonts w:ascii="Courier New" w:hAnsi="Courier New" w:cs="Courier New"/>
+          <w:i/>
+          <w:sz w:val="18"/>
+        </w:rPr>
+        <w:t>_id</w:t>
+      </w:r>
+      <w:proofErr w:type="spellEnd"/>
+      <w:r>
+        <w:rPr>
+          <w:rFonts w:ascii="Courier New" w:hAnsi="Courier New" w:cs="Courier New"/>
+          <w:i/>
+          <w:sz w:val="18"/>
+        </w:rPr>
+        <w:t xml:space="preserve"> </w:t>
+      </w:r>
+      <w:r>
+        <w:rPr>
+          <w:rStyle w:val="hljs-type"/>
+          <w:rFonts w:ascii="Courier New" w:hAnsi="Courier New" w:cs="Courier New"/>
+          <w:i/>
+          <w:sz w:val="18"/>
+        </w:rPr>
+        <w:t>BIGINT</w:t>
+      </w:r>
+      <w:r>
+        <w:rPr>
+          <w:rFonts w:ascii="Courier New" w:hAnsi="Courier New" w:cs="Courier New"/>
+          <w:i/>
+          <w:sz w:val="18"/>
+        </w:rPr>
+        <w:t xml:space="preserve"> </w:t>
+      </w:r>
+      <w:r>
+        <w:rPr>
+          <w:rStyle w:val="hljs-keyword"/>
+          <w:rFonts w:ascii="Courier New" w:hAnsi="Courier New" w:cs="Courier New"/>
+          <w:i/>
+          <w:sz w:val="18"/>
+        </w:rPr>
+        <w:t>PRIMARY</w:t>
+      </w:r>
+      <w:r>
+        <w:rPr>
+          <w:rFonts w:ascii="Courier New" w:hAnsi="Courier New" w:cs="Courier New"/>
+          <w:i/>
+          <w:sz w:val="18"/>
+        </w:rPr>
+        <w:t xml:space="preserve"> KEY, </w:t>
+      </w:r>
+      <w:proofErr w:type="spellStart"/>
+      <w:r>
+        <w:rPr>
+          <w:rFonts w:ascii="Courier New" w:hAnsi="Courier New" w:cs="Courier New"/>
+          <w:i/>
+          <w:sz w:val="18"/>
+        </w:rPr>
+        <w:t>name</w:t>
+      </w:r>
+      <w:proofErr w:type="spellEnd"/>
+      <w:r>
+        <w:rPr>
+          <w:rFonts w:ascii="Courier New" w:hAnsi="Courier New" w:cs="Courier New"/>
+          <w:i/>
+          <w:sz w:val="18"/>
+        </w:rPr>
+        <w:t xml:space="preserve"> TEXT, </w:t>
+      </w:r>
+      <w:proofErr w:type="spellStart"/>
+      <w:r>
+        <w:rPr>
+          <w:rFonts w:ascii="Courier New" w:hAnsi="Courier New" w:cs="Courier New"/>
+          <w:i/>
+          <w:sz w:val="18"/>
+        </w:rPr>
+        <w:t>last_name</w:t>
+      </w:r>
+      <w:proofErr w:type="spellEnd"/>
+      <w:r>
+        <w:rPr>
+          <w:rFonts w:ascii="Courier New" w:hAnsi="Courier New" w:cs="Courier New"/>
+          <w:i/>
+          <w:sz w:val="18"/>
+        </w:rPr>
+        <w:t xml:space="preserve"> TEXT );</w:t>
+      </w:r>
+    </w:p>
+    <w:p>
+      <w:pPr>
+        <w:spacing w:after="0"/>
+      </w:pPr>
+    </w:p>
+    <w:p>
+      <w:pPr>
+        <w:spacing w:after="0"/>
+        <w:rPr>
+          <w:b/>
+          <w:sz w:val="28"/>
+          <w:u w:val="single"/>
+        </w:rPr>
+      </w:pPr>
+      <w:r>
+        <w:rPr>
+          <w:b/>
+          <w:noProof/>
+          <w:sz w:val="28"/>
+          <w:u w:val="single"/>
+          <w:lang w:eastAsia="es-ES"/>
+        </w:rPr>
+        <w:drawing>
+          <wp:inline distT="0" distB="0" distL="0" distR="0">
+            <wp:extent cx="5400040" cy="803301"/>
+            <wp:effectExtent l="19050" t="0" r="0" b="0"/>
+            <wp:docPr id="4" name="Imagen 7"/>
+            <wp:cNvGraphicFramePr>
+              <a:graphicFrameLocks xmlns:a="http://schemas.openxmlformats.org/drawingml/2006/main" noChangeAspect="1"/>
+            </wp:cNvGraphicFramePr>
+            <a:graphic xmlns:a="http://schemas.openxmlformats.org/drawingml/2006/main">
+              <a:graphicData uri="http://schemas.openxmlformats.org/drawingml/2006/picture">
+                <pic:pic xmlns:pic="http://schemas.openxmlformats.org/drawingml/2006/picture">
+                  <pic:nvPicPr>
+                    <pic:cNvPr id="0" name="Picture 7"/>
+                    <pic:cNvPicPr>
+                      <a:picLocks noChangeAspect="1" noChangeArrowheads="1"/>
+                    </pic:cNvPicPr>
+                  </pic:nvPicPr>
+                  <pic:blipFill>
+                    <a:blip r:embed="rId25"/>
+                    <a:srcRect/>
+                    <a:stretch>
+                      <a:fillRect/>
+                    </a:stretch>
+                  </pic:blipFill>
+                  <pic:spPr bwMode="auto">
+                    <a:xfrm>
+                      <a:off x="0" y="0"/>
+                      <a:ext cx="5400040" cy="803301"/>
+                    </a:xfrm>
+                    <a:prstGeom prst="rect">
+                      <a:avLst/>
+                    </a:prstGeom>
+                    <a:noFill/>
+                    <a:ln w="9525">
+                      <a:noFill/>
+                      <a:miter lim="800000"/>
+                      <a:headEnd/>
+                      <a:tailEnd/>
+                    </a:ln>
+                  </pic:spPr>
+                </pic:pic>
+              </a:graphicData>
+            </a:graphic>
+          </wp:inline>
+        </w:drawing>
+      </w:r>
+    </w:p>
+    <w:p>
+      <w:pPr>
+        <w:spacing w:after="0"/>
+        <w:rPr>
+          <w:b/>
+          <w:sz w:val="28"/>
+          <w:u w:val="single"/>
+        </w:rPr>
+      </w:pPr>
+    </w:p>
+    <w:p>
+      <w:pPr>
+        <w:spacing w:after="0"/>
+        <w:rPr>
+          <w:b/>
+          <w:sz w:val="28"/>
+          <w:u w:val="single"/>
+        </w:rPr>
+      </w:pPr>
+    </w:p>
+    <w:p>
+      <w:pPr>
+        <w:spacing w:after="0"/>
+        <w:rPr>
+          <w:rFonts w:ascii="Courier New" w:hAnsi="Courier New" w:cs="Courier New"/>
+          <w:i/>
+          <w:sz w:val="16"/>
+        </w:rPr>
+      </w:pPr>
+      <w:proofErr w:type="spellStart"/>
+      <w:proofErr w:type="gramStart"/>
+      <w:r>
+        <w:rPr>
+          <w:rFonts w:ascii="Courier New" w:hAnsi="Courier New" w:cs="Courier New"/>
+          <w:i/>
+          <w:sz w:val="16"/>
+        </w:rPr>
+        <w:t>curl</w:t>
+      </w:r>
+      <w:proofErr w:type="spellEnd"/>
+      <w:proofErr w:type="gramEnd"/>
+      <w:r>
+        <w:rPr>
+          <w:rFonts w:ascii="Courier New" w:hAnsi="Courier New" w:cs="Courier New"/>
+          <w:i/>
+          <w:sz w:val="16"/>
+        </w:rPr>
+        <w:t xml:space="preserve"> -X POST http://localhost:8083/connectors \</w:t>
+      </w:r>
+    </w:p>
+    <w:p>
+      <w:pPr>
+        <w:spacing w:after="0"/>
+        <w:rPr>
+          <w:rFonts w:ascii="Courier New" w:hAnsi="Courier New" w:cs="Courier New"/>
+          <w:i/>
+          <w:sz w:val="16"/>
+        </w:rPr>
+      </w:pPr>
+      <w:r>
+        <w:rPr>
+          <w:rFonts w:ascii="Courier New" w:hAnsi="Courier New" w:cs="Courier New"/>
+          <w:i/>
+          <w:sz w:val="16"/>
+        </w:rPr>
+        <w:t xml:space="preserve">  -H "Content-</w:t>
+      </w:r>
+      <w:proofErr w:type="spellStart"/>
+      <w:r>
+        <w:rPr>
+          <w:rFonts w:ascii="Courier New" w:hAnsi="Courier New" w:cs="Courier New"/>
+          <w:i/>
+          <w:sz w:val="16"/>
+        </w:rPr>
+        <w:t>Type</w:t>
+      </w:r>
+      <w:proofErr w:type="spellEnd"/>
+      <w:r>
+        <w:rPr>
+          <w:rFonts w:ascii="Courier New" w:hAnsi="Courier New" w:cs="Courier New"/>
+          <w:i/>
+          <w:sz w:val="16"/>
+        </w:rPr>
+        <w:t xml:space="preserve">: </w:t>
+      </w:r>
+      <w:proofErr w:type="spellStart"/>
+      <w:r>
+        <w:rPr>
+          <w:rFonts w:ascii="Courier New" w:hAnsi="Courier New" w:cs="Courier New"/>
+          <w:i/>
+          <w:sz w:val="16"/>
+        </w:rPr>
+        <w:t>application</w:t>
+      </w:r>
+      <w:proofErr w:type="spellEnd"/>
+      <w:r>
+        <w:rPr>
+          <w:rFonts w:ascii="Courier New" w:hAnsi="Courier New" w:cs="Courier New"/>
+          <w:i/>
+          <w:sz w:val="16"/>
+        </w:rPr>
+        <w:t>/</w:t>
+      </w:r>
+      <w:proofErr w:type="spellStart"/>
+      <w:r>
+        <w:rPr>
+          <w:rFonts w:ascii="Courier New" w:hAnsi="Courier New" w:cs="Courier New"/>
+          <w:i/>
+          <w:sz w:val="16"/>
+        </w:rPr>
+        <w:t>json</w:t>
+      </w:r>
+      <w:proofErr w:type="spellEnd"/>
+      <w:r>
+        <w:rPr>
+          <w:rFonts w:ascii="Courier New" w:hAnsi="Courier New" w:cs="Courier New"/>
+          <w:i/>
+          <w:sz w:val="16"/>
+        </w:rPr>
+        <w:t>" \</w:t>
+      </w:r>
+    </w:p>
+    <w:p>
+      <w:pPr>
+        <w:spacing w:after="0"/>
+        <w:rPr>
+          <w:rFonts w:ascii="Courier New" w:hAnsi="Courier New" w:cs="Courier New"/>
+          <w:i/>
+          <w:sz w:val="16"/>
+        </w:rPr>
+      </w:pPr>
+      <w:r>
+        <w:rPr>
+          <w:rFonts w:ascii="Courier New" w:hAnsi="Courier New" w:cs="Courier New"/>
+          <w:i/>
+          <w:sz w:val="16"/>
+        </w:rPr>
+        <w:t xml:space="preserve">  -d '{</w:t>
+      </w:r>
+    </w:p>
+    <w:p>
+      <w:pPr>
+        <w:spacing w:after="0"/>
+        <w:rPr>
+          <w:rFonts w:ascii="Courier New" w:hAnsi="Courier New" w:cs="Courier New"/>
+          <w:i/>
+          <w:sz w:val="16"/>
+        </w:rPr>
+      </w:pPr>
+      <w:r>
+        <w:rPr>
+          <w:rFonts w:ascii="Courier New" w:hAnsi="Courier New" w:cs="Courier New"/>
+          <w:i/>
+          <w:sz w:val="16"/>
+        </w:rPr>
+        <w:t xml:space="preserve">    "</w:t>
+      </w:r>
+      <w:proofErr w:type="spellStart"/>
+      <w:r>
+        <w:rPr>
+          <w:rFonts w:ascii="Courier New" w:hAnsi="Courier New" w:cs="Courier New"/>
+          <w:i/>
+          <w:sz w:val="16"/>
+        </w:rPr>
+        <w:t>name</w:t>
+      </w:r>
+      <w:proofErr w:type="spellEnd"/>
+      <w:r>
+        <w:rPr>
+          <w:rFonts w:ascii="Courier New" w:hAnsi="Courier New" w:cs="Courier New"/>
+          <w:i/>
+          <w:sz w:val="16"/>
+        </w:rPr>
+        <w:t>": "</w:t>
+      </w:r>
+      <w:proofErr w:type="spellStart"/>
+      <w:r>
+        <w:rPr>
+          <w:rFonts w:ascii="Courier New" w:hAnsi="Courier New" w:cs="Courier New"/>
+          <w:i/>
+          <w:sz w:val="16"/>
+        </w:rPr>
+        <w:t>postgres-user-updates-connector</w:t>
+      </w:r>
+      <w:proofErr w:type="spellEnd"/>
+      <w:r>
+        <w:rPr>
+          <w:rFonts w:ascii="Courier New" w:hAnsi="Courier New" w:cs="Courier New"/>
+          <w:i/>
+          <w:sz w:val="16"/>
+        </w:rPr>
+        <w:t>",</w:t>
+      </w:r>
+    </w:p>
+    <w:p>
+      <w:pPr>
+        <w:spacing w:after="0"/>
+        <w:rPr>
+          <w:rFonts w:ascii="Courier New" w:hAnsi="Courier New" w:cs="Courier New"/>
+          <w:i/>
+          <w:sz w:val="16"/>
+        </w:rPr>
+      </w:pPr>
+      <w:r>
+        <w:rPr>
+          <w:rFonts w:ascii="Courier New" w:hAnsi="Courier New" w:cs="Courier New"/>
+          <w:i/>
+          <w:sz w:val="16"/>
+        </w:rPr>
+        <w:t xml:space="preserve">    "</w:t>
+      </w:r>
+      <w:proofErr w:type="spellStart"/>
+      <w:r>
+        <w:rPr>
+          <w:rFonts w:ascii="Courier New" w:hAnsi="Courier New" w:cs="Courier New"/>
+          <w:i/>
+          <w:sz w:val="16"/>
+        </w:rPr>
+        <w:t>config</w:t>
+      </w:r>
+      <w:proofErr w:type="spellEnd"/>
+      <w:r>
+        <w:rPr>
+          <w:rFonts w:ascii="Courier New" w:hAnsi="Courier New" w:cs="Courier New"/>
+          <w:i/>
+          <w:sz w:val="16"/>
+        </w:rPr>
+        <w:t>": {</w:t>
+      </w:r>
+    </w:p>
+    <w:p>
+      <w:pPr>
+        <w:spacing w:after="0"/>
+        <w:rPr>
+          <w:rFonts w:ascii="Courier New" w:hAnsi="Courier New" w:cs="Courier New"/>
+          <w:i/>
+          <w:sz w:val="16"/>
+        </w:rPr>
+      </w:pPr>
+      <w:r>
+        <w:rPr>
+          <w:rFonts w:ascii="Courier New" w:hAnsi="Courier New" w:cs="Courier New"/>
+          <w:i/>
+          <w:sz w:val="16"/>
+        </w:rPr>
+        <w:t xml:space="preserve">      "</w:t>
+      </w:r>
+      <w:proofErr w:type="spellStart"/>
+      <w:r>
+        <w:rPr>
+          <w:rFonts w:ascii="Courier New" w:hAnsi="Courier New" w:cs="Courier New"/>
+          <w:i/>
+          <w:sz w:val="16"/>
+        </w:rPr>
+        <w:t>connector.class</w:t>
+      </w:r>
+      <w:proofErr w:type="spellEnd"/>
+      <w:r>
+        <w:rPr>
+          <w:rFonts w:ascii="Courier New" w:hAnsi="Courier New" w:cs="Courier New"/>
+          <w:i/>
+          <w:sz w:val="16"/>
+        </w:rPr>
+        <w:t>": "</w:t>
+      </w:r>
+      <w:proofErr w:type="spellStart"/>
+      <w:r>
+        <w:rPr>
+          <w:rFonts w:ascii="Courier New" w:hAnsi="Courier New" w:cs="Courier New"/>
+          <w:i/>
+          <w:sz w:val="16"/>
+        </w:rPr>
+        <w:t>io.debezium.connector.postgresql.PostgresConnector</w:t>
+      </w:r>
+      <w:proofErr w:type="spellEnd"/>
+      <w:r>
+        <w:rPr>
+          <w:rFonts w:ascii="Courier New" w:hAnsi="Courier New" w:cs="Courier New"/>
+          <w:i/>
+          <w:sz w:val="16"/>
+        </w:rPr>
+        <w:t>",</w:t>
+      </w:r>
+    </w:p>
+    <w:p>
+      <w:pPr>
+        <w:spacing w:after="0"/>
+        <w:rPr>
+          <w:rFonts w:ascii="Courier New" w:hAnsi="Courier New" w:cs="Courier New"/>
+          <w:i/>
+          <w:sz w:val="16"/>
+        </w:rPr>
+      </w:pPr>
+      <w:r>
+        <w:rPr>
+          <w:rFonts w:ascii="Courier New" w:hAnsi="Courier New" w:cs="Courier New"/>
+          <w:i/>
+          <w:sz w:val="16"/>
+        </w:rPr>
+        <w:t xml:space="preserve">      "</w:t>
+      </w:r>
+      <w:proofErr w:type="spellStart"/>
+      <w:r>
+        <w:rPr>
+          <w:rFonts w:ascii="Courier New" w:hAnsi="Courier New" w:cs="Courier New"/>
+          <w:i/>
+          <w:sz w:val="16"/>
+        </w:rPr>
+        <w:t>database.hostname</w:t>
+      </w:r>
+      <w:proofErr w:type="spellEnd"/>
+      <w:r>
+        <w:rPr>
+          <w:rFonts w:ascii="Courier New" w:hAnsi="Courier New" w:cs="Courier New"/>
+          <w:i/>
+          <w:sz w:val="16"/>
+        </w:rPr>
+        <w:t>": "</w:t>
+      </w:r>
+      <w:proofErr w:type="spellStart"/>
+      <w:r>
+        <w:rPr>
+          <w:rFonts w:ascii="Courier New" w:hAnsi="Courier New" w:cs="Courier New"/>
+          <w:i/>
+          <w:sz w:val="16"/>
+        </w:rPr>
+        <w:t>postgres</w:t>
+      </w:r>
+      <w:proofErr w:type="spellEnd"/>
+      <w:r>
+        <w:rPr>
+          <w:rFonts w:ascii="Courier New" w:hAnsi="Courier New" w:cs="Courier New"/>
+          <w:i/>
+          <w:sz w:val="16"/>
+        </w:rPr>
+        <w:t>",</w:t>
+      </w:r>
+    </w:p>
+    <w:p>
+      <w:pPr>
+        <w:spacing w:after="0"/>
+        <w:rPr>
+          <w:rFonts w:ascii="Courier New" w:hAnsi="Courier New" w:cs="Courier New"/>
+          <w:i/>
+          <w:sz w:val="16"/>
+        </w:rPr>
+      </w:pPr>
+      <w:r>
+        <w:rPr>
+          <w:rFonts w:ascii="Courier New" w:hAnsi="Courier New" w:cs="Courier New"/>
+          <w:i/>
+          <w:sz w:val="16"/>
+        </w:rPr>
+        <w:t xml:space="preserve">      "</w:t>
+      </w:r>
+      <w:proofErr w:type="spellStart"/>
+      <w:r>
+        <w:rPr>
+          <w:rFonts w:ascii="Courier New" w:hAnsi="Courier New" w:cs="Courier New"/>
+          <w:i/>
+          <w:sz w:val="16"/>
+        </w:rPr>
+        <w:t>database.port</w:t>
+      </w:r>
+      <w:proofErr w:type="spellEnd"/>
+      <w:r>
+        <w:rPr>
+          <w:rFonts w:ascii="Courier New" w:hAnsi="Courier New" w:cs="Courier New"/>
+          <w:i/>
+          <w:sz w:val="16"/>
+        </w:rPr>
+        <w:t>": "5432",</w:t>
+      </w:r>
+    </w:p>
+    <w:p>
+      <w:pPr>
+        <w:spacing w:after="0"/>
+        <w:rPr>
+          <w:rFonts w:ascii="Courier New" w:hAnsi="Courier New" w:cs="Courier New"/>
+          <w:i/>
+          <w:sz w:val="16"/>
+        </w:rPr>
+      </w:pPr>
+      <w:r>
+        <w:rPr>
+          <w:rFonts w:ascii="Courier New" w:hAnsi="Courier New" w:cs="Courier New"/>
+          <w:i/>
+          <w:sz w:val="16"/>
+        </w:rPr>
+        <w:t xml:space="preserve">      "</w:t>
+      </w:r>
+      <w:proofErr w:type="spellStart"/>
+      <w:r>
+        <w:rPr>
+          <w:rFonts w:ascii="Courier New" w:hAnsi="Courier New" w:cs="Courier New"/>
+          <w:i/>
+          <w:sz w:val="16"/>
+        </w:rPr>
+        <w:t>database.user</w:t>
+      </w:r>
+      <w:proofErr w:type="spellEnd"/>
+      <w:r>
+        <w:rPr>
+          <w:rFonts w:ascii="Courier New" w:hAnsi="Courier New" w:cs="Courier New"/>
+          <w:i/>
+          <w:sz w:val="16"/>
+        </w:rPr>
+        <w:t>": "</w:t>
+      </w:r>
+      <w:proofErr w:type="spellStart"/>
+      <w:r>
+        <w:rPr>
+          <w:rFonts w:ascii="Courier New" w:hAnsi="Courier New" w:cs="Courier New"/>
+          <w:i/>
+          <w:sz w:val="16"/>
+        </w:rPr>
+        <w:t>root</w:t>
+      </w:r>
+      <w:proofErr w:type="spellEnd"/>
+      <w:r>
+        <w:rPr>
+          <w:rFonts w:ascii="Courier New" w:hAnsi="Courier New" w:cs="Courier New"/>
+          <w:i/>
+          <w:sz w:val="16"/>
+        </w:rPr>
+        <w:t>",</w:t>
+      </w:r>
+    </w:p>
+    <w:p>
+      <w:pPr>
+        <w:spacing w:after="0"/>
+        <w:rPr>
+          <w:rFonts w:ascii="Courier New" w:hAnsi="Courier New" w:cs="Courier New"/>
+          <w:i/>
+          <w:sz w:val="16"/>
+        </w:rPr>
+      </w:pPr>
+      <w:r>
+        <w:rPr>
+          <w:rFonts w:ascii="Courier New" w:hAnsi="Courier New" w:cs="Courier New"/>
+          <w:i/>
+          <w:sz w:val="16"/>
+        </w:rPr>
+        <w:t xml:space="preserve">      "</w:t>
+      </w:r>
+      <w:proofErr w:type="spellStart"/>
+      <w:r>
+        <w:rPr>
+          <w:rFonts w:ascii="Courier New" w:hAnsi="Courier New" w:cs="Courier New"/>
+          <w:i/>
+          <w:sz w:val="16"/>
+        </w:rPr>
+        <w:t>database.password</w:t>
+      </w:r>
+      <w:proofErr w:type="spellEnd"/>
+      <w:r>
+        <w:rPr>
+          <w:rFonts w:ascii="Courier New" w:hAnsi="Courier New" w:cs="Courier New"/>
+          <w:i/>
+          <w:sz w:val="16"/>
+        </w:rPr>
+        <w:t>": "</w:t>
+      </w:r>
+      <w:proofErr w:type="spellStart"/>
+      <w:r>
+        <w:rPr>
+          <w:rFonts w:ascii="Courier New" w:hAnsi="Courier New" w:cs="Courier New"/>
+          <w:i/>
+          <w:sz w:val="16"/>
+        </w:rPr>
+        <w:t>root</w:t>
+      </w:r>
+      <w:proofErr w:type="spellEnd"/>
+      <w:r>
+        <w:rPr>
+          <w:rFonts w:ascii="Courier New" w:hAnsi="Courier New" w:cs="Courier New"/>
+          <w:i/>
+          <w:sz w:val="16"/>
+        </w:rPr>
+        <w:t>",</w:t>
+      </w:r>
+    </w:p>
+    <w:p>
+      <w:pPr>
+        <w:spacing w:after="0"/>
+        <w:rPr>
+          <w:rFonts w:ascii="Courier New" w:hAnsi="Courier New" w:cs="Courier New"/>
+          <w:i/>
+          <w:sz w:val="16"/>
+        </w:rPr>
+      </w:pPr>
+      <w:r>
+        <w:rPr>
+          <w:rFonts w:ascii="Courier New" w:hAnsi="Courier New" w:cs="Courier New"/>
+          <w:i/>
+          <w:sz w:val="16"/>
+        </w:rPr>
+        <w:t xml:space="preserve">      "</w:t>
+      </w:r>
+      <w:proofErr w:type="spellStart"/>
+      <w:r>
+        <w:rPr>
+          <w:rFonts w:ascii="Courier New" w:hAnsi="Courier New" w:cs="Courier New"/>
+          <w:i/>
+          <w:sz w:val="16"/>
+        </w:rPr>
+        <w:t>database.dbname</w:t>
+      </w:r>
+      <w:proofErr w:type="spellEnd"/>
+      <w:r>
+        <w:rPr>
+          <w:rFonts w:ascii="Courier New" w:hAnsi="Courier New" w:cs="Courier New"/>
+          <w:i/>
+          <w:sz w:val="16"/>
+        </w:rPr>
+        <w:t>": "</w:t>
+      </w:r>
+      <w:proofErr w:type="spellStart"/>
+      <w:r>
+        <w:rPr>
+          <w:rFonts w:ascii="Courier New" w:hAnsi="Courier New" w:cs="Courier New"/>
+          <w:i/>
+          <w:sz w:val="16"/>
+        </w:rPr>
+        <w:t>main</w:t>
+      </w:r>
+      <w:proofErr w:type="spellEnd"/>
+      <w:r>
+        <w:rPr>
+          <w:rFonts w:ascii="Courier New" w:hAnsi="Courier New" w:cs="Courier New"/>
+          <w:i/>
+          <w:sz w:val="16"/>
+        </w:rPr>
+        <w:t>",</w:t>
+      </w:r>
+    </w:p>
+    <w:p>
+      <w:pPr>
+        <w:spacing w:after="0"/>
+        <w:rPr>
+          <w:rFonts w:ascii="Courier New" w:hAnsi="Courier New" w:cs="Courier New"/>
+          <w:i/>
+          <w:sz w:val="16"/>
+        </w:rPr>
+      </w:pPr>
+      <w:r>
+        <w:rPr>
+          <w:rFonts w:ascii="Courier New" w:hAnsi="Courier New" w:cs="Courier New"/>
+          <w:i/>
+          <w:sz w:val="16"/>
+        </w:rPr>
+        <w:t xml:space="preserve">      "</w:t>
+      </w:r>
+      <w:proofErr w:type="spellStart"/>
+      <w:r>
+        <w:rPr>
+          <w:rFonts w:ascii="Courier New" w:hAnsi="Courier New" w:cs="Courier New"/>
+          <w:i/>
+          <w:sz w:val="16"/>
+        </w:rPr>
+        <w:t>topic.prefix</w:t>
+      </w:r>
+      <w:proofErr w:type="spellEnd"/>
+      <w:r>
+        <w:rPr>
+          <w:rFonts w:ascii="Courier New" w:hAnsi="Courier New" w:cs="Courier New"/>
+          <w:i/>
+          <w:sz w:val="16"/>
+        </w:rPr>
+        <w:t>": "</w:t>
+      </w:r>
+      <w:proofErr w:type="spellStart"/>
+      <w:r>
+        <w:rPr>
+          <w:rFonts w:ascii="Courier New" w:hAnsi="Courier New" w:cs="Courier New"/>
+          <w:i/>
+          <w:sz w:val="16"/>
+        </w:rPr>
+        <w:t>user-updates</w:t>
+      </w:r>
+      <w:proofErr w:type="spellEnd"/>
+      <w:r>
+        <w:rPr>
+          <w:rFonts w:ascii="Courier New" w:hAnsi="Courier New" w:cs="Courier New"/>
+          <w:i/>
+          <w:sz w:val="16"/>
+        </w:rPr>
+        <w:t>",</w:t>
+      </w:r>
+    </w:p>
+    <w:p>
+      <w:pPr>
+        <w:spacing w:after="0"/>
+        <w:rPr>
+          <w:rFonts w:ascii="Courier New" w:hAnsi="Courier New" w:cs="Courier New"/>
+          <w:i/>
+          <w:sz w:val="16"/>
+        </w:rPr>
+      </w:pPr>
+      <w:r>
+        <w:rPr>
+          <w:rFonts w:ascii="Courier New" w:hAnsi="Courier New" w:cs="Courier New"/>
+          <w:i/>
+          <w:sz w:val="16"/>
+        </w:rPr>
+        <w:t xml:space="preserve">      "</w:t>
+      </w:r>
+      <w:proofErr w:type="spellStart"/>
+      <w:r>
+        <w:rPr>
+          <w:rFonts w:ascii="Courier New" w:hAnsi="Courier New" w:cs="Courier New"/>
+          <w:i/>
+          <w:sz w:val="16"/>
+        </w:rPr>
+        <w:t>table.include.list</w:t>
+      </w:r>
+      <w:proofErr w:type="spellEnd"/>
+      <w:r>
+        <w:rPr>
+          <w:rFonts w:ascii="Courier New" w:hAnsi="Courier New" w:cs="Courier New"/>
+          <w:i/>
+          <w:sz w:val="16"/>
+        </w:rPr>
+        <w:t>": "</w:t>
+      </w:r>
+      <w:proofErr w:type="spellStart"/>
+      <w:r>
+        <w:rPr>
+          <w:rFonts w:ascii="Courier New" w:hAnsi="Courier New" w:cs="Courier New"/>
+          <w:i/>
+          <w:sz w:val="16"/>
+        </w:rPr>
+        <w:t>public.users</w:t>
+      </w:r>
+      <w:proofErr w:type="spellEnd"/>
+      <w:r>
+        <w:rPr>
+          <w:rFonts w:ascii="Courier New" w:hAnsi="Courier New" w:cs="Courier New"/>
+          <w:i/>
+          <w:sz w:val="16"/>
+        </w:rPr>
+        <w:t>",</w:t>
+      </w:r>
+    </w:p>
+    <w:p>
+      <w:pPr>
+        <w:spacing w:after="0"/>
+        <w:rPr>
+          <w:rFonts w:ascii="Courier New" w:hAnsi="Courier New" w:cs="Courier New"/>
+          <w:i/>
+          <w:sz w:val="16"/>
+        </w:rPr>
+      </w:pPr>
+      <w:r>
+        <w:rPr>
+          <w:rFonts w:ascii="Courier New" w:hAnsi="Courier New" w:cs="Courier New"/>
+          <w:i/>
+          <w:sz w:val="16"/>
+        </w:rPr>
+        <w:t xml:space="preserve">      "plugin.name": "</w:t>
+      </w:r>
+      <w:proofErr w:type="spellStart"/>
+      <w:r>
+        <w:rPr>
+          <w:rFonts w:ascii="Courier New" w:hAnsi="Courier New" w:cs="Courier New"/>
+          <w:i/>
+          <w:sz w:val="16"/>
+        </w:rPr>
+        <w:t>pgoutput</w:t>
+      </w:r>
+      <w:proofErr w:type="spellEnd"/>
+      <w:r>
+        <w:rPr>
+          <w:rFonts w:ascii="Courier New" w:hAnsi="Courier New" w:cs="Courier New"/>
+          <w:i/>
+          <w:sz w:val="16"/>
+        </w:rPr>
+        <w:t>",</w:t>
+      </w:r>
+    </w:p>
+    <w:p>
+      <w:pPr>
+        <w:spacing w:after="0"/>
+        <w:rPr>
+          <w:rFonts w:ascii="Courier New" w:hAnsi="Courier New" w:cs="Courier New"/>
+          <w:i/>
+          <w:sz w:val="16"/>
+        </w:rPr>
+      </w:pPr>
+      <w:r>
+        <w:rPr>
+          <w:rFonts w:ascii="Courier New" w:hAnsi="Courier New" w:cs="Courier New"/>
+          <w:i/>
+          <w:sz w:val="16"/>
+        </w:rPr>
+        <w:t xml:space="preserve">      "slot.name": "</w:t>
+      </w:r>
+      <w:proofErr w:type="spellStart"/>
+      <w:r>
+        <w:rPr>
+          <w:rFonts w:ascii="Courier New" w:hAnsi="Courier New" w:cs="Courier New"/>
+          <w:i/>
+          <w:sz w:val="16"/>
+        </w:rPr>
+        <w:t>debezium_users</w:t>
+      </w:r>
+      <w:proofErr w:type="spellEnd"/>
+      <w:r>
+        <w:rPr>
+          <w:rFonts w:ascii="Courier New" w:hAnsi="Courier New" w:cs="Courier New"/>
+          <w:i/>
+          <w:sz w:val="16"/>
+        </w:rPr>
+        <w:t>",</w:t>
+      </w:r>
+    </w:p>
+    <w:p>
+      <w:pPr>
+        <w:spacing w:after="0"/>
+        <w:rPr>
+          <w:rFonts w:ascii="Courier New" w:hAnsi="Courier New" w:cs="Courier New"/>
+          <w:i/>
+          <w:sz w:val="16"/>
+        </w:rPr>
+      </w:pPr>
+    </w:p>
+    <w:p>
+      <w:pPr>
+        <w:spacing w:after="0"/>
+        <w:rPr>
+          <w:rFonts w:ascii="Courier New" w:hAnsi="Courier New" w:cs="Courier New"/>
+          <w:i/>
+          <w:sz w:val="16"/>
+        </w:rPr>
+      </w:pPr>
+      <w:r>
+        <w:rPr>
+          <w:rFonts w:ascii="Courier New" w:hAnsi="Courier New" w:cs="Courier New"/>
+          <w:i/>
+          <w:sz w:val="16"/>
+        </w:rPr>
+        <w:t xml:space="preserve">      "</w:t>
+      </w:r>
+      <w:proofErr w:type="spellStart"/>
+      <w:r>
+        <w:rPr>
+          <w:rFonts w:ascii="Courier New" w:hAnsi="Courier New" w:cs="Courier New"/>
+          <w:i/>
+          <w:sz w:val="16"/>
+        </w:rPr>
+        <w:t>transforms</w:t>
+      </w:r>
+      <w:proofErr w:type="spellEnd"/>
+      <w:r>
+        <w:rPr>
+          <w:rFonts w:ascii="Courier New" w:hAnsi="Courier New" w:cs="Courier New"/>
+          <w:i/>
+          <w:sz w:val="16"/>
+        </w:rPr>
+        <w:t>": "</w:t>
+      </w:r>
+      <w:proofErr w:type="spellStart"/>
+      <w:r>
+        <w:rPr>
+          <w:rFonts w:ascii="Courier New" w:hAnsi="Courier New" w:cs="Courier New"/>
+          <w:i/>
+          <w:sz w:val="16"/>
+        </w:rPr>
+        <w:t>unwrap</w:t>
+      </w:r>
+      <w:proofErr w:type="gramStart"/>
+      <w:r>
+        <w:rPr>
+          <w:rFonts w:ascii="Courier New" w:hAnsi="Courier New" w:cs="Courier New"/>
+          <w:i/>
+          <w:sz w:val="16"/>
+        </w:rPr>
+        <w:t>,reroute</w:t>
+      </w:r>
+      <w:proofErr w:type="spellEnd"/>
+      <w:proofErr w:type="gramEnd"/>
+      <w:r>
+        <w:rPr>
+          <w:rFonts w:ascii="Courier New" w:hAnsi="Courier New" w:cs="Courier New"/>
+          <w:i/>
+          <w:sz w:val="16"/>
+        </w:rPr>
+        <w:t>",</w:t>
+      </w:r>
+    </w:p>
+    <w:p>
+      <w:pPr>
+        <w:spacing w:after="0"/>
+        <w:rPr>
+          <w:rFonts w:ascii="Courier New" w:hAnsi="Courier New" w:cs="Courier New"/>
+          <w:i/>
+          <w:sz w:val="16"/>
+        </w:rPr>
+      </w:pPr>
+      <w:r>
+        <w:rPr>
+          <w:rFonts w:ascii="Courier New" w:hAnsi="Courier New" w:cs="Courier New"/>
+          <w:i/>
+          <w:sz w:val="16"/>
+        </w:rPr>
+        <w:t xml:space="preserve">      "</w:t>
+      </w:r>
+      <w:proofErr w:type="spellStart"/>
+      <w:r>
+        <w:rPr>
+          <w:rFonts w:ascii="Courier New" w:hAnsi="Courier New" w:cs="Courier New"/>
+          <w:i/>
+          <w:sz w:val="16"/>
+        </w:rPr>
+        <w:t>transforms.unwrap.type</w:t>
+      </w:r>
+      <w:proofErr w:type="spellEnd"/>
+      <w:r>
+        <w:rPr>
+          <w:rFonts w:ascii="Courier New" w:hAnsi="Courier New" w:cs="Courier New"/>
+          <w:i/>
+          <w:sz w:val="16"/>
+        </w:rPr>
+        <w:t>": "</w:t>
+      </w:r>
+      <w:proofErr w:type="spellStart"/>
+      <w:r>
+        <w:rPr>
+          <w:rFonts w:ascii="Courier New" w:hAnsi="Courier New" w:cs="Courier New"/>
+          <w:i/>
+          <w:sz w:val="16"/>
+        </w:rPr>
+        <w:t>io.debezium.transforms.ExtractNewRecordState</w:t>
+      </w:r>
+      <w:proofErr w:type="spellEnd"/>
+      <w:r>
+        <w:rPr>
+          <w:rFonts w:ascii="Courier New" w:hAnsi="Courier New" w:cs="Courier New"/>
+          <w:i/>
+          <w:sz w:val="16"/>
+        </w:rPr>
+        <w:t>",</w:t>
+      </w:r>
+    </w:p>
+    <w:p>
+      <w:pPr>
+        <w:spacing w:after="0"/>
+        <w:rPr>
+          <w:rFonts w:ascii="Courier New" w:hAnsi="Courier New" w:cs="Courier New"/>
+          <w:i/>
+          <w:sz w:val="16"/>
+        </w:rPr>
+      </w:pPr>
+      <w:r>
+        <w:rPr>
+          <w:rFonts w:ascii="Courier New" w:hAnsi="Courier New" w:cs="Courier New"/>
+          <w:i/>
+          <w:sz w:val="16"/>
+        </w:rPr>
+        <w:t xml:space="preserve">      "</w:t>
+      </w:r>
+      <w:proofErr w:type="spellStart"/>
+      <w:r>
+        <w:rPr>
+          <w:rFonts w:ascii="Courier New" w:hAnsi="Courier New" w:cs="Courier New"/>
+          <w:i/>
+          <w:sz w:val="16"/>
+        </w:rPr>
+        <w:t>transforms.unwrap.drop.tombstones</w:t>
+      </w:r>
+      <w:proofErr w:type="spellEnd"/>
+      <w:r>
+        <w:rPr>
+          <w:rFonts w:ascii="Courier New" w:hAnsi="Courier New" w:cs="Courier New"/>
+          <w:i/>
+          <w:sz w:val="16"/>
+        </w:rPr>
+        <w:t>": "false",</w:t>
+      </w:r>
+    </w:p>
+    <w:p>
+      <w:pPr>
+        <w:spacing w:after="0"/>
+        <w:rPr>
+          <w:rFonts w:ascii="Courier New" w:hAnsi="Courier New" w:cs="Courier New"/>
+          <w:i/>
+          <w:sz w:val="16"/>
+        </w:rPr>
+      </w:pPr>
+      <w:r>
+        <w:rPr>
+          <w:rFonts w:ascii="Courier New" w:hAnsi="Courier New" w:cs="Courier New"/>
+          <w:i/>
+          <w:sz w:val="16"/>
+        </w:rPr>
+        <w:t xml:space="preserve">      "</w:t>
+      </w:r>
+      <w:proofErr w:type="spellStart"/>
+      <w:r>
+        <w:rPr>
+          <w:rFonts w:ascii="Courier New" w:hAnsi="Courier New" w:cs="Courier New"/>
+          <w:i/>
+          <w:sz w:val="16"/>
+        </w:rPr>
+        <w:t>transforms.unwrap.delete.handling.mode</w:t>
+      </w:r>
+      <w:proofErr w:type="spellEnd"/>
+      <w:r>
+        <w:rPr>
+          <w:rFonts w:ascii="Courier New" w:hAnsi="Courier New" w:cs="Courier New"/>
+          <w:i/>
+          <w:sz w:val="16"/>
+        </w:rPr>
+        <w:t>": "</w:t>
+      </w:r>
+      <w:proofErr w:type="spellStart"/>
+      <w:r>
+        <w:rPr>
+          <w:rFonts w:ascii="Courier New" w:hAnsi="Courier New" w:cs="Courier New"/>
+          <w:i/>
+          <w:sz w:val="16"/>
+        </w:rPr>
+        <w:t>rewrite</w:t>
+      </w:r>
+      <w:proofErr w:type="spellEnd"/>
+      <w:r>
+        <w:rPr>
+          <w:rFonts w:ascii="Courier New" w:hAnsi="Courier New" w:cs="Courier New"/>
+          <w:i/>
+          <w:sz w:val="16"/>
+        </w:rPr>
+        <w:t>",</w:t>
+      </w:r>
+    </w:p>
+    <w:p>
+      <w:pPr>
+        <w:spacing w:after="0"/>
+        <w:rPr>
+          <w:rFonts w:ascii="Courier New" w:hAnsi="Courier New" w:cs="Courier New"/>
+          <w:i/>
+          <w:sz w:val="16"/>
+        </w:rPr>
+      </w:pPr>
+      <w:r>
+        <w:rPr>
+          <w:rFonts w:ascii="Courier New" w:hAnsi="Courier New" w:cs="Courier New"/>
+          <w:i/>
+          <w:sz w:val="16"/>
+        </w:rPr>
+        <w:t xml:space="preserve">      "</w:t>
+      </w:r>
+      <w:proofErr w:type="spellStart"/>
+      <w:r>
+        <w:rPr>
+          <w:rFonts w:ascii="Courier New" w:hAnsi="Courier New" w:cs="Courier New"/>
+          <w:i/>
+          <w:sz w:val="16"/>
+        </w:rPr>
+        <w:t>transforms.reroute.type</w:t>
+      </w:r>
+      <w:proofErr w:type="spellEnd"/>
+      <w:r>
+        <w:rPr>
+          <w:rFonts w:ascii="Courier New" w:hAnsi="Courier New" w:cs="Courier New"/>
+          <w:i/>
+          <w:sz w:val="16"/>
+        </w:rPr>
+        <w:t>": "</w:t>
+      </w:r>
+      <w:proofErr w:type="spellStart"/>
+      <w:r>
+        <w:rPr>
+          <w:rFonts w:ascii="Courier New" w:hAnsi="Courier New" w:cs="Courier New"/>
+          <w:i/>
+          <w:sz w:val="16"/>
+        </w:rPr>
+        <w:t>io.debezium.transforms.ByLogicalTableRouter</w:t>
+      </w:r>
+      <w:proofErr w:type="spellEnd"/>
+      <w:r>
+        <w:rPr>
+          <w:rFonts w:ascii="Courier New" w:hAnsi="Courier New" w:cs="Courier New"/>
+          <w:i/>
+          <w:sz w:val="16"/>
+        </w:rPr>
+        <w:t>",</w:t>
+      </w:r>
+    </w:p>
+    <w:p>
+      <w:pPr>
+        <w:spacing w:after="0"/>
+        <w:rPr>
+          <w:rFonts w:ascii="Courier New" w:hAnsi="Courier New" w:cs="Courier New"/>
+          <w:i/>
+          <w:sz w:val="16"/>
+        </w:rPr>
+      </w:pPr>
+      <w:r>
+        <w:rPr>
+          <w:rFonts w:ascii="Courier New" w:hAnsi="Courier New" w:cs="Courier New"/>
+          <w:i/>
+          <w:sz w:val="16"/>
+        </w:rPr>
+        <w:t xml:space="preserve">      "</w:t>
+      </w:r>
+      <w:proofErr w:type="spellStart"/>
+      <w:r>
+        <w:rPr>
+          <w:rFonts w:ascii="Courier New" w:hAnsi="Courier New" w:cs="Courier New"/>
+          <w:i/>
+          <w:sz w:val="16"/>
+        </w:rPr>
+        <w:t>transforms.reroute.topic.regex</w:t>
+      </w:r>
+      <w:proofErr w:type="spellEnd"/>
+      <w:r>
+        <w:rPr>
+          <w:rFonts w:ascii="Courier New" w:hAnsi="Courier New" w:cs="Courier New"/>
+          <w:i/>
+          <w:sz w:val="16"/>
+        </w:rPr>
+        <w:t>": ".*",</w:t>
+      </w:r>
+    </w:p>
+    <w:p>
+      <w:pPr>
+        <w:spacing w:after="0"/>
+        <w:rPr>
+          <w:rFonts w:ascii="Courier New" w:hAnsi="Courier New" w:cs="Courier New"/>
+          <w:i/>
+          <w:sz w:val="16"/>
+        </w:rPr>
+      </w:pPr>
+      <w:r>
+        <w:rPr>
+          <w:rFonts w:ascii="Courier New" w:hAnsi="Courier New" w:cs="Courier New"/>
+          <w:i/>
+          <w:sz w:val="16"/>
+        </w:rPr>
+        <w:t xml:space="preserve">      "</w:t>
+      </w:r>
+      <w:proofErr w:type="spellStart"/>
+      <w:r>
+        <w:rPr>
+          <w:rFonts w:ascii="Courier New" w:hAnsi="Courier New" w:cs="Courier New"/>
+          <w:i/>
+          <w:sz w:val="16"/>
+        </w:rPr>
+        <w:t>transforms.reroute.topic.replacement</w:t>
+      </w:r>
+      <w:proofErr w:type="spellEnd"/>
+      <w:r>
+        <w:rPr>
+          <w:rFonts w:ascii="Courier New" w:hAnsi="Courier New" w:cs="Courier New"/>
+          <w:i/>
+          <w:sz w:val="16"/>
+        </w:rPr>
+        <w:t>": "</w:t>
+      </w:r>
+      <w:proofErr w:type="spellStart"/>
+      <w:r>
+        <w:rPr>
+          <w:rFonts w:ascii="Courier New" w:hAnsi="Courier New" w:cs="Courier New"/>
+          <w:i/>
+          <w:sz w:val="16"/>
+        </w:rPr>
+        <w:t>user-updates-value</w:t>
+      </w:r>
+      <w:proofErr w:type="spellEnd"/>
+      <w:r>
+        <w:rPr>
+          <w:rFonts w:ascii="Courier New" w:hAnsi="Courier New" w:cs="Courier New"/>
+          <w:i/>
+          <w:sz w:val="16"/>
+        </w:rPr>
+        <w:t>",</w:t>
+      </w:r>
+    </w:p>
+    <w:p>
+      <w:pPr>
+        <w:spacing w:after="0"/>
+        <w:rPr>
+          <w:rFonts w:ascii="Courier New" w:hAnsi="Courier New" w:cs="Courier New"/>
+          <w:i/>
+          <w:sz w:val="16"/>
+        </w:rPr>
+      </w:pPr>
+    </w:p>
+    <w:p>
+      <w:pPr>
+        <w:spacing w:after="0"/>
+        <w:rPr>
+          <w:rFonts w:ascii="Courier New" w:hAnsi="Courier New" w:cs="Courier New"/>
+          <w:i/>
+          <w:sz w:val="16"/>
+        </w:rPr>
+      </w:pPr>
+      <w:r>
+        <w:rPr>
+          <w:rFonts w:ascii="Courier New" w:hAnsi="Courier New" w:cs="Courier New"/>
+          <w:i/>
+          <w:sz w:val="16"/>
+        </w:rPr>
+        <w:t xml:space="preserve">      "</w:t>
+      </w:r>
+      <w:proofErr w:type="spellStart"/>
+      <w:r>
+        <w:rPr>
+          <w:rFonts w:ascii="Courier New" w:hAnsi="Courier New" w:cs="Courier New"/>
+          <w:i/>
+          <w:sz w:val="16"/>
+        </w:rPr>
+        <w:t>key.converter</w:t>
+      </w:r>
+      <w:proofErr w:type="spellEnd"/>
+      <w:r>
+        <w:rPr>
+          <w:rFonts w:ascii="Courier New" w:hAnsi="Courier New" w:cs="Courier New"/>
+          <w:i/>
+          <w:sz w:val="16"/>
+        </w:rPr>
+        <w:t>": "</w:t>
+      </w:r>
+      <w:proofErr w:type="spellStart"/>
+      <w:r>
+        <w:rPr>
+          <w:rFonts w:ascii="Courier New" w:hAnsi="Courier New" w:cs="Courier New"/>
+          <w:i/>
+          <w:sz w:val="16"/>
+        </w:rPr>
+        <w:t>org.apache.kafka.connect.storage.StringConverter</w:t>
+      </w:r>
+      <w:proofErr w:type="spellEnd"/>
+      <w:r>
+        <w:rPr>
+          <w:rFonts w:ascii="Courier New" w:hAnsi="Courier New" w:cs="Courier New"/>
+          <w:i/>
+          <w:sz w:val="16"/>
+        </w:rPr>
+        <w:t>",</w:t>
+      </w:r>
+    </w:p>
+    <w:p>
+      <w:pPr>
+        <w:spacing w:after="0"/>
+        <w:rPr>
+          <w:rFonts w:ascii="Courier New" w:hAnsi="Courier New" w:cs="Courier New"/>
+          <w:i/>
+          <w:sz w:val="16"/>
+        </w:rPr>
+      </w:pPr>
+      <w:r>
+        <w:rPr>
+          <w:rFonts w:ascii="Courier New" w:hAnsi="Courier New" w:cs="Courier New"/>
+          <w:i/>
+          <w:sz w:val="16"/>
+        </w:rPr>
+        <w:t xml:space="preserve">      "</w:t>
+      </w:r>
+      <w:proofErr w:type="spellStart"/>
+      <w:r>
+        <w:rPr>
+          <w:rFonts w:ascii="Courier New" w:hAnsi="Courier New" w:cs="Courier New"/>
+          <w:i/>
+          <w:sz w:val="16"/>
+        </w:rPr>
+        <w:t>value.converter</w:t>
+      </w:r>
+      <w:proofErr w:type="spellEnd"/>
+      <w:r>
+        <w:rPr>
+          <w:rFonts w:ascii="Courier New" w:hAnsi="Courier New" w:cs="Courier New"/>
+          <w:i/>
+          <w:sz w:val="16"/>
+        </w:rPr>
+        <w:t>": "</w:t>
+      </w:r>
+      <w:proofErr w:type="spellStart"/>
+      <w:r>
+        <w:rPr>
+          <w:rFonts w:ascii="Courier New" w:hAnsi="Courier New" w:cs="Courier New"/>
+          <w:i/>
+          <w:sz w:val="16"/>
+        </w:rPr>
+        <w:t>io.confluent.connect.protobuf.ProtobufConverter</w:t>
+      </w:r>
+      <w:proofErr w:type="spellEnd"/>
+      <w:r>
+        <w:rPr>
+          <w:rFonts w:ascii="Courier New" w:hAnsi="Courier New" w:cs="Courier New"/>
+          <w:i/>
+          <w:sz w:val="16"/>
+        </w:rPr>
+        <w:t>",</w:t>
+      </w:r>
+    </w:p>
+    <w:p>
+      <w:pPr>
+        <w:spacing w:after="0"/>
+        <w:rPr>
+          <w:rFonts w:ascii="Courier New" w:hAnsi="Courier New" w:cs="Courier New"/>
+          <w:i/>
+          <w:sz w:val="16"/>
+        </w:rPr>
+      </w:pPr>
+      <w:r>
+        <w:rPr>
+          <w:rFonts w:ascii="Courier New" w:hAnsi="Courier New" w:cs="Courier New"/>
+          <w:i/>
+          <w:sz w:val="16"/>
+        </w:rPr>
+        <w:t xml:space="preserve">      "</w:t>
+      </w:r>
+      <w:proofErr w:type="spellStart"/>
+      <w:r>
+        <w:rPr>
+          <w:rFonts w:ascii="Courier New" w:hAnsi="Courier New" w:cs="Courier New"/>
+          <w:i/>
+          <w:sz w:val="16"/>
+        </w:rPr>
+        <w:t>value.converter.schema.registry.url</w:t>
+      </w:r>
+      <w:proofErr w:type="spellEnd"/>
+      <w:r>
+        <w:rPr>
+          <w:rFonts w:ascii="Courier New" w:hAnsi="Courier New" w:cs="Courier New"/>
+          <w:i/>
+          <w:sz w:val="16"/>
+        </w:rPr>
+        <w:t>": "http://schema-registry:8081",</w:t>
+      </w:r>
+    </w:p>
+    <w:p>
+      <w:pPr>
+        <w:spacing w:after="0"/>
+        <w:rPr>
+          <w:rFonts w:ascii="Courier New" w:hAnsi="Courier New" w:cs="Courier New"/>
+          <w:i/>
+          <w:sz w:val="16"/>
+        </w:rPr>
+      </w:pPr>
+      <w:r>
+        <w:rPr>
+          <w:rFonts w:ascii="Courier New" w:hAnsi="Courier New" w:cs="Courier New"/>
+          <w:i/>
+          <w:sz w:val="16"/>
+        </w:rPr>
+        <w:t xml:space="preserve">      "</w:t>
+      </w:r>
+      <w:proofErr w:type="spellStart"/>
+      <w:r>
+        <w:rPr>
+          <w:rFonts w:ascii="Courier New" w:hAnsi="Courier New" w:cs="Courier New"/>
+          <w:i/>
+          <w:sz w:val="16"/>
+        </w:rPr>
+        <w:t>value.converter.scrub.invalid.names</w:t>
+      </w:r>
+      <w:proofErr w:type="spellEnd"/>
+      <w:r>
+        <w:rPr>
+          <w:rFonts w:ascii="Courier New" w:hAnsi="Courier New" w:cs="Courier New"/>
+          <w:i/>
+          <w:sz w:val="16"/>
+        </w:rPr>
+        <w:t>": "true",</w:t>
+      </w:r>
+    </w:p>
+    <w:p>
+      <w:pPr>
+        <w:spacing w:after="0"/>
+        <w:rPr>
+          <w:rFonts w:ascii="Courier New" w:hAnsi="Courier New" w:cs="Courier New"/>
+          <w:i/>
+          <w:sz w:val="16"/>
+        </w:rPr>
+      </w:pPr>
+      <w:r>
+        <w:rPr>
+          <w:rFonts w:ascii="Courier New" w:hAnsi="Courier New" w:cs="Courier New"/>
+          <w:i/>
+          <w:sz w:val="16"/>
+        </w:rPr>
+        <w:t xml:space="preserve">      "</w:t>
+      </w:r>
+      <w:proofErr w:type="spellStart"/>
+      <w:r>
+        <w:rPr>
+          <w:rFonts w:ascii="Courier New" w:hAnsi="Courier New" w:cs="Courier New"/>
+          <w:i/>
+          <w:sz w:val="16"/>
+        </w:rPr>
+        <w:t>value.converter.auto.register.schemas</w:t>
+      </w:r>
+      <w:proofErr w:type="spellEnd"/>
+      <w:r>
+        <w:rPr>
+          <w:rFonts w:ascii="Courier New" w:hAnsi="Courier New" w:cs="Courier New"/>
+          <w:i/>
+          <w:sz w:val="16"/>
+        </w:rPr>
+        <w:t>": "true"</w:t>
+      </w:r>
+    </w:p>
+    <w:p>
+      <w:pPr>
+        <w:spacing w:after="0"/>
+        <w:rPr>
+          <w:rFonts w:ascii="Courier New" w:hAnsi="Courier New" w:cs="Courier New"/>
+          <w:i/>
+          <w:sz w:val="16"/>
+        </w:rPr>
+      </w:pPr>
+      <w:r>
+        <w:rPr>
+          <w:rFonts w:ascii="Courier New" w:hAnsi="Courier New" w:cs="Courier New"/>
+          <w:i/>
+          <w:sz w:val="16"/>
+        </w:rPr>
+        <w:t xml:space="preserve">    }</w:t>
+      </w:r>
+    </w:p>
+    <w:p>
+      <w:pPr>
+        <w:spacing w:after="0"/>
+        <w:rPr>
+          <w:rFonts w:ascii="Courier New" w:hAnsi="Courier New" w:cs="Courier New"/>
+          <w:i/>
+          <w:sz w:val="16"/>
+        </w:rPr>
+      </w:pPr>
+      <w:r>
+        <w:rPr>
+          <w:rFonts w:ascii="Courier New" w:hAnsi="Courier New" w:cs="Courier New"/>
+          <w:i/>
+          <w:sz w:val="16"/>
+        </w:rPr>
+        <w:t xml:space="preserve">  }' | </w:t>
+      </w:r>
+      <w:proofErr w:type="spellStart"/>
+      <w:r>
+        <w:rPr>
+          <w:rFonts w:ascii="Courier New" w:hAnsi="Courier New" w:cs="Courier New"/>
+          <w:i/>
+          <w:sz w:val="16"/>
+        </w:rPr>
+        <w:t>jq</w:t>
+      </w:r>
+      <w:proofErr w:type="spellEnd"/>
+    </w:p>
+    <w:p>
+      <w:pPr>
+        <w:spacing w:after="0"/>
+        <w:rPr>
+          <w:sz w:val="24"/>
+        </w:rPr>
+      </w:pPr>
+      <w:r>
+        <w:rPr>
+          <w:noProof/>
+          <w:sz w:val="24"/>
+          <w:lang w:eastAsia="es-ES"/>
+        </w:rPr>
+        <w:lastRenderedPageBreak/>
+        <w:drawing>
+          <wp:inline distT="0" distB="0" distL="0" distR="0">
+            <wp:extent cx="5400040" cy="4800036"/>
+            <wp:effectExtent l="19050" t="0" r="0" b="0"/>
+            <wp:docPr id="18" name="Imagen 23"/>
+            <wp:cNvGraphicFramePr>
+              <a:graphicFrameLocks xmlns:a="http://schemas.openxmlformats.org/drawingml/2006/main" noChangeAspect="1"/>
+            </wp:cNvGraphicFramePr>
+            <a:graphic xmlns:a="http://schemas.openxmlformats.org/drawingml/2006/main">
+              <a:graphicData uri="http://schemas.openxmlformats.org/drawingml/2006/picture">
+                <pic:pic xmlns:pic="http://schemas.openxmlformats.org/drawingml/2006/picture">
+                  <pic:nvPicPr>
+                    <pic:cNvPr id="0" name="Picture 23"/>
+                    <pic:cNvPicPr>
+                      <a:picLocks noChangeAspect="1" noChangeArrowheads="1"/>
+                    </pic:cNvPicPr>
+                  </pic:nvPicPr>
+                  <pic:blipFill>
+                    <a:blip r:embed="rId26"/>
+                    <a:srcRect/>
+                    <a:stretch>
+                      <a:fillRect/>
+                    </a:stretch>
+                  </pic:blipFill>
+                  <pic:spPr bwMode="auto">
+                    <a:xfrm>
+                      <a:off x="0" y="0"/>
+                      <a:ext cx="5400040" cy="4800036"/>
+                    </a:xfrm>
+                    <a:prstGeom prst="rect">
+                      <a:avLst/>
+                    </a:prstGeom>
+                    <a:noFill/>
+                    <a:ln w="9525">
+                      <a:noFill/>
+                      <a:miter lim="800000"/>
+                      <a:headEnd/>
+                      <a:tailEnd/>
+                    </a:ln>
+                  </pic:spPr>
+                </pic:pic>
+              </a:graphicData>
+            </a:graphic>
+          </wp:inline>
+        </w:drawing>
+      </w:r>
+    </w:p>
+    <w:p>
+      <w:pPr>
+        <w:spacing w:after="0"/>
+        <w:rPr>
+          <w:sz w:val="24"/>
+        </w:rPr>
+      </w:pPr>
+    </w:p>
+    <w:p>
+      <w:pPr>
+        <w:pStyle w:val="HTMLconformatoprevio"/>
+        <w:shd w:val="clear" w:color="auto" w:fill="FFFFFF"/>
+        <w:rPr>
+          <w:rFonts w:asciiTheme="minorHAnsi" w:eastAsiaTheme="minorHAnsi" w:hAnsiTheme="minorHAnsi" w:cstheme="minorBidi"/>
+          <w:sz w:val="24"/>
+          <w:szCs w:val="22"/>
+          <w:lang w:eastAsia="en-US"/>
+        </w:rPr>
+      </w:pPr>
+      <w:proofErr w:type="spellStart"/>
+      <w:r>
+        <w:rPr>
+          <w:rFonts w:asciiTheme="minorHAnsi" w:eastAsiaTheme="minorHAnsi" w:hAnsiTheme="minorHAnsi" w:cstheme="minorBidi"/>
+          <w:sz w:val="24"/>
+          <w:szCs w:val="22"/>
+          <w:lang w:eastAsia="en-US"/>
+        </w:rPr>
+        <w:t>Make</w:t>
+      </w:r>
+      <w:proofErr w:type="spellEnd"/>
+      <w:r>
+        <w:rPr>
+          <w:rFonts w:asciiTheme="minorHAnsi" w:eastAsiaTheme="minorHAnsi" w:hAnsiTheme="minorHAnsi" w:cstheme="minorBidi"/>
+          <w:sz w:val="24"/>
+          <w:szCs w:val="22"/>
+          <w:lang w:eastAsia="en-US"/>
+        </w:rPr>
+        <w:t xml:space="preserve"> </w:t>
+      </w:r>
+      <w:proofErr w:type="spellStart"/>
+      <w:r>
+        <w:rPr>
+          <w:rFonts w:asciiTheme="minorHAnsi" w:eastAsiaTheme="minorHAnsi" w:hAnsiTheme="minorHAnsi" w:cstheme="minorBidi"/>
+          <w:sz w:val="24"/>
+          <w:szCs w:val="22"/>
+          <w:lang w:eastAsia="en-US"/>
+        </w:rPr>
+        <w:t>sure</w:t>
+      </w:r>
+      <w:proofErr w:type="spellEnd"/>
+      <w:r>
+        <w:rPr>
+          <w:rFonts w:asciiTheme="minorHAnsi" w:eastAsiaTheme="minorHAnsi" w:hAnsiTheme="minorHAnsi" w:cstheme="minorBidi"/>
+          <w:sz w:val="24"/>
+          <w:szCs w:val="22"/>
+          <w:lang w:eastAsia="en-US"/>
+        </w:rPr>
+        <w:t xml:space="preserve"> </w:t>
+      </w:r>
+      <w:proofErr w:type="spellStart"/>
+      <w:r>
+        <w:rPr>
+          <w:rFonts w:asciiTheme="minorHAnsi" w:eastAsiaTheme="minorHAnsi" w:hAnsiTheme="minorHAnsi" w:cstheme="minorBidi"/>
+          <w:sz w:val="24"/>
+          <w:szCs w:val="22"/>
+          <w:lang w:eastAsia="en-US"/>
+        </w:rPr>
+        <w:t>the</w:t>
+      </w:r>
+      <w:proofErr w:type="spellEnd"/>
+      <w:r>
+        <w:rPr>
+          <w:rFonts w:asciiTheme="minorHAnsi" w:eastAsiaTheme="minorHAnsi" w:hAnsiTheme="minorHAnsi" w:cstheme="minorBidi"/>
+          <w:sz w:val="24"/>
+          <w:szCs w:val="22"/>
+          <w:lang w:eastAsia="en-US"/>
+        </w:rPr>
+        <w:t xml:space="preserve"> </w:t>
+      </w:r>
+      <w:proofErr w:type="spellStart"/>
+      <w:r>
+        <w:rPr>
+          <w:rFonts w:asciiTheme="minorHAnsi" w:eastAsiaTheme="minorHAnsi" w:hAnsiTheme="minorHAnsi" w:cstheme="minorBidi"/>
+          <w:sz w:val="24"/>
+          <w:szCs w:val="22"/>
+          <w:lang w:eastAsia="en-US"/>
+        </w:rPr>
+        <w:t>connector</w:t>
+      </w:r>
+      <w:proofErr w:type="spellEnd"/>
+      <w:r>
+        <w:rPr>
+          <w:rFonts w:asciiTheme="minorHAnsi" w:eastAsiaTheme="minorHAnsi" w:hAnsiTheme="minorHAnsi" w:cstheme="minorBidi"/>
+          <w:sz w:val="24"/>
+          <w:szCs w:val="22"/>
+          <w:lang w:eastAsia="en-US"/>
+        </w:rPr>
+        <w:t xml:space="preserve"> </w:t>
+      </w:r>
+      <w:proofErr w:type="spellStart"/>
+      <w:r>
+        <w:rPr>
+          <w:rFonts w:asciiTheme="minorHAnsi" w:eastAsiaTheme="minorHAnsi" w:hAnsiTheme="minorHAnsi" w:cstheme="minorBidi"/>
+          <w:sz w:val="24"/>
+          <w:szCs w:val="22"/>
+          <w:lang w:eastAsia="en-US"/>
+        </w:rPr>
+        <w:t>is</w:t>
+      </w:r>
+      <w:proofErr w:type="spellEnd"/>
+      <w:r>
+        <w:rPr>
+          <w:rFonts w:asciiTheme="minorHAnsi" w:eastAsiaTheme="minorHAnsi" w:hAnsiTheme="minorHAnsi" w:cstheme="minorBidi"/>
+          <w:sz w:val="24"/>
+          <w:szCs w:val="22"/>
+          <w:lang w:eastAsia="en-US"/>
+        </w:rPr>
+        <w:t xml:space="preserve"> up and </w:t>
+      </w:r>
+      <w:proofErr w:type="spellStart"/>
+      <w:r>
+        <w:rPr>
+          <w:rFonts w:asciiTheme="minorHAnsi" w:eastAsiaTheme="minorHAnsi" w:hAnsiTheme="minorHAnsi" w:cstheme="minorBidi"/>
+          <w:sz w:val="24"/>
+          <w:szCs w:val="22"/>
+          <w:lang w:eastAsia="en-US"/>
+        </w:rPr>
+        <w:t>running</w:t>
+      </w:r>
+      <w:proofErr w:type="spellEnd"/>
+      <w:r>
+        <w:rPr>
+          <w:rFonts w:asciiTheme="minorHAnsi" w:eastAsiaTheme="minorHAnsi" w:hAnsiTheme="minorHAnsi" w:cstheme="minorBidi"/>
+          <w:sz w:val="24"/>
+          <w:szCs w:val="22"/>
+          <w:lang w:eastAsia="en-US"/>
+        </w:rPr>
+        <w:t>:</w:t>
+      </w:r>
+    </w:p>
+    <w:p>
+      <w:pPr>
+        <w:pStyle w:val="HTMLconformatoprevio"/>
+        <w:shd w:val="clear" w:color="auto" w:fill="FFFFFF"/>
+        <w:rPr>
+          <w:rFonts w:asciiTheme="minorHAnsi" w:eastAsiaTheme="minorHAnsi" w:hAnsiTheme="minorHAnsi" w:cstheme="minorBidi"/>
+          <w:sz w:val="24"/>
+          <w:szCs w:val="22"/>
+          <w:lang w:eastAsia="en-US"/>
+        </w:rPr>
+      </w:pPr>
+    </w:p>
+    <w:p>
+      <w:pPr>
+        <w:pStyle w:val="HTMLconformatoprevio"/>
+        <w:shd w:val="clear" w:color="auto" w:fill="FFFFFF"/>
+        <w:rPr>
+          <w:rFonts w:asciiTheme="minorHAnsi" w:eastAsiaTheme="minorHAnsi" w:hAnsiTheme="minorHAnsi" w:cstheme="minorBidi"/>
+          <w:sz w:val="24"/>
+          <w:szCs w:val="22"/>
+          <w:lang w:eastAsia="en-US"/>
+        </w:rPr>
+      </w:pPr>
+      <w:r>
+        <w:rPr>
+          <w:noProof/>
+          <w:sz w:val="24"/>
+        </w:rPr>
+        <w:drawing>
+          <wp:inline distT="0" distB="0" distL="0" distR="0">
+            <wp:extent cx="5400040" cy="2767114"/>
+            <wp:effectExtent l="19050" t="0" r="0" b="0"/>
+            <wp:docPr id="21" name="Imagen 1"/>
+            <wp:cNvGraphicFramePr>
+              <a:graphicFrameLocks xmlns:a="http://schemas.openxmlformats.org/drawingml/2006/main" noChangeAspect="1"/>
+            </wp:cNvGraphicFramePr>
+            <a:graphic xmlns:a="http://schemas.openxmlformats.org/drawingml/2006/main">
+              <a:graphicData uri="http://schemas.openxmlformats.org/drawingml/2006/picture">
+                <pic:pic xmlns:pic="http://schemas.openxmlformats.org/drawingml/2006/picture">
+                  <pic:nvPicPr>
+                    <pic:cNvPr id="0" name="Picture 1"/>
+                    <pic:cNvPicPr>
+                      <a:picLocks noChangeAspect="1" noChangeArrowheads="1"/>
+                    </pic:cNvPicPr>
+                  </pic:nvPicPr>
+                  <pic:blipFill>
+                    <a:blip r:embed="rId27"/>
+                    <a:srcRect/>
+                    <a:stretch>
+                      <a:fillRect/>
+                    </a:stretch>
+                  </pic:blipFill>
+                  <pic:spPr bwMode="auto">
+                    <a:xfrm>
+                      <a:off x="0" y="0"/>
+                      <a:ext cx="5400040" cy="2767114"/>
+                    </a:xfrm>
+                    <a:prstGeom prst="rect">
+                      <a:avLst/>
+                    </a:prstGeom>
+                    <a:noFill/>
+                    <a:ln w="9525">
+                      <a:noFill/>
+                      <a:miter lim="800000"/>
+                      <a:headEnd/>
+                      <a:tailEnd/>
+                    </a:ln>
+                  </pic:spPr>
+                </pic:pic>
+              </a:graphicData>
+            </a:graphic>
+          </wp:inline>
+        </w:drawing>
+      </w:r>
+    </w:p>
+    <w:p>
+      <w:pPr>
+        <w:pStyle w:val="HTMLconformatoprevio"/>
+        <w:shd w:val="clear" w:color="auto" w:fill="FFFFFF"/>
+        <w:rPr>
+          <w:rFonts w:asciiTheme="minorHAnsi" w:eastAsiaTheme="minorHAnsi" w:hAnsiTheme="minorHAnsi" w:cstheme="minorBidi"/>
+          <w:sz w:val="24"/>
+          <w:szCs w:val="22"/>
+          <w:lang w:eastAsia="en-US"/>
+        </w:rPr>
+      </w:pPr>
+    </w:p>
+    <w:p>
+      <w:pPr>
+        <w:pStyle w:val="HTMLconformatoprevio"/>
+        <w:shd w:val="clear" w:color="auto" w:fill="FFFFFF"/>
+        <w:rPr>
+          <w:rFonts w:asciiTheme="minorHAnsi" w:eastAsiaTheme="minorHAnsi" w:hAnsiTheme="minorHAnsi" w:cstheme="minorBidi"/>
+          <w:sz w:val="24"/>
+          <w:szCs w:val="22"/>
+          <w:lang w:eastAsia="en-US"/>
+        </w:rPr>
+      </w:pPr>
+      <w:r>
+        <w:rPr>
+          <w:noProof/>
+          <w:sz w:val="24"/>
+        </w:rPr>
+        <w:lastRenderedPageBreak/>
+        <w:drawing>
+          <wp:inline distT="0" distB="0" distL="0" distR="0">
+            <wp:extent cx="5400040" cy="1509158"/>
+            <wp:effectExtent l="19050" t="0" r="0" b="0"/>
+            <wp:docPr id="23" name="Imagen 4"/>
+            <wp:cNvGraphicFramePr>
+              <a:graphicFrameLocks xmlns:a="http://schemas.openxmlformats.org/drawingml/2006/main" noChangeAspect="1"/>
+            </wp:cNvGraphicFramePr>
+            <a:graphic xmlns:a="http://schemas.openxmlformats.org/drawingml/2006/main">
+              <a:graphicData uri="http://schemas.openxmlformats.org/drawingml/2006/picture">
+                <pic:pic xmlns:pic="http://schemas.openxmlformats.org/drawingml/2006/picture">
+                  <pic:nvPicPr>
+                    <pic:cNvPr id="0" name="Picture 4"/>
+                    <pic:cNvPicPr>
+                      <a:picLocks noChangeAspect="1" noChangeArrowheads="1"/>
+                    </pic:cNvPicPr>
+                  </pic:nvPicPr>
+                  <pic:blipFill>
+                    <a:blip r:embed="rId28"/>
+                    <a:srcRect/>
+                    <a:stretch>
+                      <a:fillRect/>
+                    </a:stretch>
+                  </pic:blipFill>
+                  <pic:spPr bwMode="auto">
+                    <a:xfrm>
+                      <a:off x="0" y="0"/>
+                      <a:ext cx="5400040" cy="1509158"/>
+                    </a:xfrm>
+                    <a:prstGeom prst="rect">
+                      <a:avLst/>
+                    </a:prstGeom>
+                    <a:noFill/>
+                    <a:ln w="9525">
+                      <a:noFill/>
+                      <a:miter lim="800000"/>
+                      <a:headEnd/>
+                      <a:tailEnd/>
+                    </a:ln>
+                  </pic:spPr>
+                </pic:pic>
+              </a:graphicData>
+            </a:graphic>
+          </wp:inline>
+        </w:drawing>
+      </w:r>
+    </w:p>
+    <w:p>
+      <w:pPr>
+        <w:spacing w:after="0"/>
+        <w:rPr>
+          <w:rFonts w:ascii="Courier New" w:hAnsi="Courier New" w:cs="Courier New"/>
+          <w:i/>
+          <w:sz w:val="14"/>
+        </w:rPr>
+      </w:pPr>
+    </w:p>
+    <w:p>
+      <w:pPr>
+        <w:spacing w:after="0"/>
+        <w:rPr>
+          <w:rFonts w:ascii="Courier New" w:hAnsi="Courier New" w:cs="Courier New"/>
+          <w:i/>
+          <w:sz w:val="14"/>
+        </w:rPr>
+      </w:pPr>
+    </w:p>
+    <w:p>
+      <w:pPr>
+        <w:spacing w:after="0"/>
+        <w:rPr>
+          <w:rFonts w:ascii="Courier New" w:hAnsi="Courier New" w:cs="Courier New"/>
+          <w:i/>
+          <w:sz w:val="14"/>
+        </w:rPr>
+      </w:pPr>
+    </w:p>
+    <w:p>
+      <w:pPr>
+        <w:pStyle w:val="HTMLconformatoprevio"/>
+        <w:shd w:val="clear" w:color="auto" w:fill="FFFFFF"/>
+        <w:rPr>
+          <w:rFonts w:asciiTheme="minorHAnsi" w:eastAsiaTheme="minorHAnsi" w:hAnsiTheme="minorHAnsi" w:cstheme="minorBidi"/>
+          <w:sz w:val="24"/>
+          <w:szCs w:val="22"/>
+          <w:lang w:eastAsia="en-US"/>
+        </w:rPr>
+      </w:pPr>
+      <w:proofErr w:type="spellStart"/>
+      <w:r>
+        <w:rPr>
+          <w:rFonts w:asciiTheme="minorHAnsi" w:eastAsiaTheme="minorHAnsi" w:hAnsiTheme="minorHAnsi" w:cstheme="minorBidi"/>
+          <w:sz w:val="24"/>
+          <w:szCs w:val="22"/>
+          <w:lang w:eastAsia="en-US"/>
+        </w:rPr>
+        <w:t>Insert</w:t>
+      </w:r>
+      <w:proofErr w:type="spellEnd"/>
+      <w:r>
+        <w:rPr>
+          <w:rFonts w:asciiTheme="minorHAnsi" w:eastAsiaTheme="minorHAnsi" w:hAnsiTheme="minorHAnsi" w:cstheme="minorBidi"/>
+          <w:sz w:val="24"/>
+          <w:szCs w:val="22"/>
+          <w:lang w:eastAsia="en-US"/>
+        </w:rPr>
+        <w:t xml:space="preserve"> 20</w:t>
+      </w:r>
+      <w:r>
+        <w:rPr>
+          <w:rFonts w:asciiTheme="minorHAnsi" w:eastAsiaTheme="minorHAnsi" w:hAnsiTheme="minorHAnsi" w:cstheme="minorBidi"/>
+          <w:sz w:val="24"/>
+          <w:szCs w:val="22"/>
+          <w:lang w:eastAsia="en-US"/>
+        </w:rPr>
+        <w:t>0</w:t>
+      </w:r>
+      <w:r>
+        <w:rPr>
+          <w:rFonts w:asciiTheme="minorHAnsi" w:eastAsiaTheme="minorHAnsi" w:hAnsiTheme="minorHAnsi" w:cstheme="minorBidi"/>
+          <w:sz w:val="24"/>
+          <w:szCs w:val="22"/>
+          <w:lang w:eastAsia="en-US"/>
+        </w:rPr>
+        <w:t xml:space="preserve"> </w:t>
+      </w:r>
+      <w:proofErr w:type="spellStart"/>
+      <w:r>
+        <w:rPr>
+          <w:rFonts w:asciiTheme="minorHAnsi" w:eastAsiaTheme="minorHAnsi" w:hAnsiTheme="minorHAnsi" w:cstheme="minorBidi"/>
+          <w:sz w:val="24"/>
+          <w:szCs w:val="22"/>
+          <w:lang w:eastAsia="en-US"/>
+        </w:rPr>
+        <w:t>values</w:t>
+      </w:r>
+      <w:proofErr w:type="spellEnd"/>
+      <w:r>
+        <w:rPr>
+          <w:rFonts w:asciiTheme="minorHAnsi" w:eastAsiaTheme="minorHAnsi" w:hAnsiTheme="minorHAnsi" w:cstheme="minorBidi"/>
+          <w:sz w:val="24"/>
+          <w:szCs w:val="22"/>
+          <w:lang w:eastAsia="en-US"/>
+        </w:rPr>
+        <w:t xml:space="preserve"> in </w:t>
+      </w:r>
+      <w:proofErr w:type="spellStart"/>
+      <w:r>
+        <w:rPr>
+          <w:rFonts w:asciiTheme="minorHAnsi" w:eastAsiaTheme="minorHAnsi" w:hAnsiTheme="minorHAnsi" w:cstheme="minorBidi"/>
+          <w:sz w:val="24"/>
+          <w:szCs w:val="22"/>
+          <w:lang w:eastAsia="en-US"/>
+        </w:rPr>
+        <w:t>the</w:t>
+      </w:r>
+      <w:proofErr w:type="spellEnd"/>
+      <w:r>
+        <w:rPr>
+          <w:rFonts w:asciiTheme="minorHAnsi" w:eastAsiaTheme="minorHAnsi" w:hAnsiTheme="minorHAnsi" w:cstheme="minorBidi"/>
+          <w:sz w:val="24"/>
+          <w:szCs w:val="22"/>
+          <w:lang w:eastAsia="en-US"/>
+        </w:rPr>
+        <w:t xml:space="preserve"> </w:t>
+      </w:r>
+      <w:proofErr w:type="spellStart"/>
+      <w:r>
+        <w:rPr>
+          <w:rFonts w:asciiTheme="minorHAnsi" w:eastAsiaTheme="minorHAnsi" w:hAnsiTheme="minorHAnsi" w:cstheme="minorBidi"/>
+          <w:sz w:val="24"/>
+          <w:szCs w:val="22"/>
+          <w:lang w:eastAsia="en-US"/>
+        </w:rPr>
+        <w:t>users</w:t>
+      </w:r>
+      <w:proofErr w:type="spellEnd"/>
+      <w:r>
+        <w:rPr>
+          <w:rFonts w:asciiTheme="minorHAnsi" w:eastAsiaTheme="minorHAnsi" w:hAnsiTheme="minorHAnsi" w:cstheme="minorBidi"/>
+          <w:sz w:val="24"/>
+          <w:szCs w:val="22"/>
+          <w:lang w:eastAsia="en-US"/>
+        </w:rPr>
+        <w:t xml:space="preserve"> </w:t>
+      </w:r>
+      <w:proofErr w:type="spellStart"/>
+      <w:r>
+        <w:rPr>
+          <w:rFonts w:asciiTheme="minorHAnsi" w:eastAsiaTheme="minorHAnsi" w:hAnsiTheme="minorHAnsi" w:cstheme="minorBidi"/>
+          <w:sz w:val="24"/>
+          <w:szCs w:val="22"/>
+          <w:lang w:eastAsia="en-US"/>
+        </w:rPr>
+        <w:t>table</w:t>
+      </w:r>
+      <w:proofErr w:type="spellEnd"/>
+      <w:r>
+        <w:rPr>
+          <w:rFonts w:asciiTheme="minorHAnsi" w:eastAsiaTheme="minorHAnsi" w:hAnsiTheme="minorHAnsi" w:cstheme="minorBidi"/>
+          <w:sz w:val="24"/>
+          <w:szCs w:val="22"/>
+          <w:lang w:eastAsia="en-US"/>
+        </w:rPr>
+        <w:t xml:space="preserve"> and observe </w:t>
+      </w:r>
+      <w:proofErr w:type="spellStart"/>
+      <w:r>
+        <w:rPr>
+          <w:rFonts w:asciiTheme="minorHAnsi" w:eastAsiaTheme="minorHAnsi" w:hAnsiTheme="minorHAnsi" w:cstheme="minorBidi"/>
+          <w:sz w:val="24"/>
+          <w:szCs w:val="22"/>
+          <w:lang w:eastAsia="en-US"/>
+        </w:rPr>
+        <w:t>how</w:t>
+      </w:r>
+      <w:proofErr w:type="spellEnd"/>
+      <w:r>
+        <w:rPr>
+          <w:rFonts w:asciiTheme="minorHAnsi" w:eastAsiaTheme="minorHAnsi" w:hAnsiTheme="minorHAnsi" w:cstheme="minorBidi"/>
+          <w:sz w:val="24"/>
+          <w:szCs w:val="22"/>
+          <w:lang w:eastAsia="en-US"/>
+        </w:rPr>
+        <w:t xml:space="preserve"> </w:t>
+      </w:r>
+      <w:proofErr w:type="spellStart"/>
+      <w:r>
+        <w:rPr>
+          <w:rFonts w:asciiTheme="minorHAnsi" w:eastAsiaTheme="minorHAnsi" w:hAnsiTheme="minorHAnsi" w:cstheme="minorBidi"/>
+          <w:sz w:val="24"/>
+          <w:szCs w:val="22"/>
+          <w:lang w:eastAsia="en-US"/>
+        </w:rPr>
+        <w:t>the</w:t>
+      </w:r>
+      <w:proofErr w:type="spellEnd"/>
+      <w:r>
+        <w:rPr>
+          <w:rFonts w:asciiTheme="minorHAnsi" w:eastAsiaTheme="minorHAnsi" w:hAnsiTheme="minorHAnsi" w:cstheme="minorBidi"/>
+          <w:sz w:val="24"/>
+          <w:szCs w:val="22"/>
+          <w:lang w:eastAsia="en-US"/>
+        </w:rPr>
+        <w:t xml:space="preserve"> </w:t>
+      </w:r>
+      <w:proofErr w:type="spellStart"/>
+      <w:r>
+        <w:rPr>
+          <w:rFonts w:asciiTheme="minorHAnsi" w:eastAsiaTheme="minorHAnsi" w:hAnsiTheme="minorHAnsi" w:cstheme="minorBidi"/>
+          <w:sz w:val="24"/>
+          <w:szCs w:val="22"/>
+          <w:lang w:eastAsia="en-US"/>
+        </w:rPr>
+        <w:t>Postgres</w:t>
+      </w:r>
+      <w:proofErr w:type="spellEnd"/>
+      <w:r>
+        <w:rPr>
+          <w:rFonts w:asciiTheme="minorHAnsi" w:eastAsiaTheme="minorHAnsi" w:hAnsiTheme="minorHAnsi" w:cstheme="minorBidi"/>
+          <w:sz w:val="24"/>
+          <w:szCs w:val="22"/>
+          <w:lang w:eastAsia="en-US"/>
+        </w:rPr>
+        <w:t xml:space="preserve"> </w:t>
+      </w:r>
+      <w:proofErr w:type="spellStart"/>
+      <w:r>
+        <w:rPr>
+          <w:rFonts w:asciiTheme="minorHAnsi" w:eastAsiaTheme="minorHAnsi" w:hAnsiTheme="minorHAnsi" w:cstheme="minorBidi"/>
+          <w:sz w:val="24"/>
+          <w:szCs w:val="22"/>
+          <w:lang w:eastAsia="en-US"/>
+        </w:rPr>
+        <w:t>Source</w:t>
+      </w:r>
+      <w:proofErr w:type="spellEnd"/>
+      <w:r>
+        <w:rPr>
+          <w:rFonts w:asciiTheme="minorHAnsi" w:eastAsiaTheme="minorHAnsi" w:hAnsiTheme="minorHAnsi" w:cstheme="minorBidi"/>
+          <w:sz w:val="24"/>
+          <w:szCs w:val="22"/>
+          <w:lang w:eastAsia="en-US"/>
+        </w:rPr>
+        <w:t xml:space="preserve"> </w:t>
+      </w:r>
+      <w:proofErr w:type="spellStart"/>
+      <w:r>
+        <w:rPr>
+          <w:rFonts w:asciiTheme="minorHAnsi" w:eastAsiaTheme="minorHAnsi" w:hAnsiTheme="minorHAnsi" w:cstheme="minorBidi"/>
+          <w:sz w:val="24"/>
+          <w:szCs w:val="22"/>
+          <w:lang w:eastAsia="en-US"/>
+        </w:rPr>
+        <w:t>connector</w:t>
+      </w:r>
+      <w:proofErr w:type="spellEnd"/>
+      <w:r>
+        <w:rPr>
+          <w:rFonts w:asciiTheme="minorHAnsi" w:eastAsiaTheme="minorHAnsi" w:hAnsiTheme="minorHAnsi" w:cstheme="minorBidi"/>
+          <w:sz w:val="24"/>
+          <w:szCs w:val="22"/>
+          <w:lang w:eastAsia="en-US"/>
+        </w:rPr>
+        <w:t xml:space="preserve"> </w:t>
+      </w:r>
+      <w:proofErr w:type="spellStart"/>
+      <w:r>
+        <w:rPr>
+          <w:rFonts w:asciiTheme="minorHAnsi" w:eastAsiaTheme="minorHAnsi" w:hAnsiTheme="minorHAnsi" w:cstheme="minorBidi"/>
+          <w:sz w:val="24"/>
+          <w:szCs w:val="22"/>
+          <w:lang w:eastAsia="en-US"/>
+        </w:rPr>
+        <w:t>writes</w:t>
+      </w:r>
+      <w:proofErr w:type="spellEnd"/>
+      <w:r>
+        <w:rPr>
+          <w:rFonts w:asciiTheme="minorHAnsi" w:eastAsiaTheme="minorHAnsi" w:hAnsiTheme="minorHAnsi" w:cstheme="minorBidi"/>
+          <w:sz w:val="24"/>
+          <w:szCs w:val="22"/>
+          <w:lang w:eastAsia="en-US"/>
+        </w:rPr>
+        <w:t xml:space="preserve"> </w:t>
+      </w:r>
+      <w:proofErr w:type="spellStart"/>
+      <w:r>
+        <w:rPr>
+          <w:rFonts w:asciiTheme="minorHAnsi" w:eastAsiaTheme="minorHAnsi" w:hAnsiTheme="minorHAnsi" w:cstheme="minorBidi"/>
+          <w:sz w:val="24"/>
+          <w:szCs w:val="22"/>
+          <w:lang w:eastAsia="en-US"/>
+        </w:rPr>
+        <w:t>the</w:t>
+      </w:r>
+      <w:proofErr w:type="spellEnd"/>
+      <w:r>
+        <w:rPr>
+          <w:rFonts w:asciiTheme="minorHAnsi" w:eastAsiaTheme="minorHAnsi" w:hAnsiTheme="minorHAnsi" w:cstheme="minorBidi"/>
+          <w:sz w:val="24"/>
+          <w:szCs w:val="22"/>
+          <w:lang w:eastAsia="en-US"/>
+        </w:rPr>
+        <w:t xml:space="preserve"> </w:t>
+      </w:r>
+      <w:proofErr w:type="spellStart"/>
+      <w:r>
+        <w:rPr>
+          <w:rFonts w:asciiTheme="minorHAnsi" w:eastAsiaTheme="minorHAnsi" w:hAnsiTheme="minorHAnsi" w:cstheme="minorBidi"/>
+          <w:sz w:val="24"/>
+          <w:szCs w:val="22"/>
+          <w:lang w:eastAsia="en-US"/>
+        </w:rPr>
+        <w:t>rows</w:t>
+      </w:r>
+      <w:proofErr w:type="spellEnd"/>
+      <w:r>
+        <w:rPr>
+          <w:rFonts w:asciiTheme="minorHAnsi" w:eastAsiaTheme="minorHAnsi" w:hAnsiTheme="minorHAnsi" w:cstheme="minorBidi"/>
+          <w:sz w:val="24"/>
+          <w:szCs w:val="22"/>
+          <w:lang w:eastAsia="en-US"/>
+        </w:rPr>
+        <w:t xml:space="preserve"> in </w:t>
+      </w:r>
+      <w:proofErr w:type="spellStart"/>
+      <w:r>
+        <w:rPr>
+          <w:rFonts w:asciiTheme="minorHAnsi" w:eastAsiaTheme="minorHAnsi" w:hAnsiTheme="minorHAnsi" w:cstheme="minorBidi"/>
+          <w:sz w:val="24"/>
+          <w:szCs w:val="22"/>
+          <w:lang w:eastAsia="en-US"/>
+        </w:rPr>
+        <w:t>the</w:t>
+      </w:r>
+      <w:proofErr w:type="spellEnd"/>
+      <w:r>
+        <w:rPr>
+          <w:rFonts w:asciiTheme="minorHAnsi" w:eastAsiaTheme="minorHAnsi" w:hAnsiTheme="minorHAnsi" w:cstheme="minorBidi"/>
+          <w:sz w:val="24"/>
+          <w:szCs w:val="22"/>
+          <w:lang w:eastAsia="en-US"/>
+        </w:rPr>
+        <w:t xml:space="preserve"> </w:t>
+      </w:r>
+      <w:proofErr w:type="spellStart"/>
+      <w:r>
+        <w:rPr>
+          <w:rFonts w:asciiTheme="minorHAnsi" w:eastAsiaTheme="minorHAnsi" w:hAnsiTheme="minorHAnsi" w:cstheme="minorBidi"/>
+          <w:sz w:val="24"/>
+          <w:szCs w:val="22"/>
+          <w:lang w:eastAsia="en-US"/>
+        </w:rPr>
+        <w:t>user-updates-value</w:t>
+      </w:r>
+      <w:proofErr w:type="spellEnd"/>
+      <w:r>
+        <w:rPr>
+          <w:rFonts w:asciiTheme="minorHAnsi" w:eastAsiaTheme="minorHAnsi" w:hAnsiTheme="minorHAnsi" w:cstheme="minorBidi"/>
+          <w:sz w:val="24"/>
+          <w:szCs w:val="22"/>
+          <w:lang w:eastAsia="en-US"/>
+        </w:rPr>
+        <w:t xml:space="preserve"> Kafka </w:t>
+      </w:r>
+      <w:proofErr w:type="spellStart"/>
+      <w:r>
+        <w:rPr>
+          <w:rFonts w:asciiTheme="minorHAnsi" w:eastAsiaTheme="minorHAnsi" w:hAnsiTheme="minorHAnsi" w:cstheme="minorBidi"/>
+          <w:sz w:val="24"/>
+          <w:szCs w:val="22"/>
+          <w:lang w:eastAsia="en-US"/>
+        </w:rPr>
+        <w:t>topic</w:t>
+      </w:r>
+      <w:proofErr w:type="spellEnd"/>
+      <w:r>
+        <w:rPr>
+          <w:rFonts w:asciiTheme="minorHAnsi" w:eastAsiaTheme="minorHAnsi" w:hAnsiTheme="minorHAnsi" w:cstheme="minorBidi"/>
+          <w:sz w:val="24"/>
+          <w:szCs w:val="22"/>
+          <w:lang w:eastAsia="en-US"/>
+        </w:rPr>
+        <w:t>:</w:t>
+      </w:r>
+    </w:p>
+    <w:p>
+      <w:pPr>
+        <w:spacing w:after="0"/>
+        <w:rPr>
+          <w:rFonts w:ascii="Courier New" w:hAnsi="Courier New" w:cs="Courier New"/>
+          <w:i/>
+          <w:sz w:val="14"/>
+        </w:rPr>
+      </w:pPr>
+    </w:p>
+    <w:p>
+      <w:pPr>
+        <w:spacing w:after="0"/>
+        <w:rPr>
+          <w:rFonts w:ascii="Courier New" w:hAnsi="Courier New" w:cs="Courier New"/>
+          <w:i/>
+          <w:sz w:val="14"/>
+        </w:rPr>
+      </w:pPr>
+      <w:r>
+        <w:rPr>
+          <w:rFonts w:ascii="Courier New" w:hAnsi="Courier New" w:cs="Courier New"/>
+          <w:i/>
+          <w:sz w:val="14"/>
+        </w:rPr>
+        <w:t>DO $$</w:t>
+      </w:r>
+    </w:p>
+    <w:p>
+      <w:pPr>
+        <w:spacing w:after="0"/>
+        <w:rPr>
+          <w:rFonts w:ascii="Courier New" w:hAnsi="Courier New" w:cs="Courier New"/>
+          <w:i/>
+          <w:sz w:val="14"/>
+        </w:rPr>
+      </w:pPr>
+      <w:r>
+        <w:rPr>
+          <w:rFonts w:ascii="Courier New" w:hAnsi="Courier New" w:cs="Courier New"/>
+          <w:i/>
+          <w:sz w:val="14"/>
+        </w:rPr>
+        <w:t>BEGIN</w:t>
+      </w:r>
+    </w:p>
+    <w:p>
+      <w:pPr>
+        <w:spacing w:after="0"/>
+        <w:rPr>
+          <w:rFonts w:ascii="Courier New" w:hAnsi="Courier New" w:cs="Courier New"/>
+          <w:i/>
+          <w:sz w:val="14"/>
+        </w:rPr>
+      </w:pPr>
+      <w:r>
+        <w:rPr>
+          <w:rFonts w:ascii="Courier New" w:hAnsi="Courier New" w:cs="Courier New"/>
+          <w:i/>
+          <w:sz w:val="14"/>
+        </w:rPr>
+        <w:t xml:space="preserve">   FOR i IN 11</w:t>
+      </w:r>
+      <w:proofErr w:type="gramStart"/>
+      <w:r>
+        <w:rPr>
+          <w:rFonts w:ascii="Courier New" w:hAnsi="Courier New" w:cs="Courier New"/>
+          <w:i/>
+          <w:sz w:val="14"/>
+        </w:rPr>
+        <w:t>..20</w:t>
+      </w:r>
+      <w:r>
+        <w:rPr>
+          <w:rFonts w:ascii="Courier New" w:hAnsi="Courier New" w:cs="Courier New"/>
+          <w:i/>
+          <w:sz w:val="14"/>
+        </w:rPr>
+        <w:t>0</w:t>
+      </w:r>
+      <w:proofErr w:type="gramEnd"/>
+      <w:r>
+        <w:rPr>
+          <w:rFonts w:ascii="Courier New" w:hAnsi="Courier New" w:cs="Courier New"/>
+          <w:i/>
+          <w:sz w:val="14"/>
+        </w:rPr>
+        <w:t xml:space="preserve"> LOOP</w:t>
+      </w:r>
+    </w:p>
+    <w:p>
+      <w:pPr>
+        <w:spacing w:after="0"/>
+        <w:rPr>
+          <w:rFonts w:ascii="Courier New" w:hAnsi="Courier New" w:cs="Courier New"/>
+          <w:i/>
+          <w:sz w:val="14"/>
+        </w:rPr>
+      </w:pPr>
+      <w:r>
+        <w:rPr>
+          <w:rFonts w:ascii="Courier New" w:hAnsi="Courier New" w:cs="Courier New"/>
+          <w:i/>
+          <w:sz w:val="14"/>
+        </w:rPr>
+        <w:t xml:space="preserve">      INSERT INTO </w:t>
+      </w:r>
+      <w:proofErr w:type="spellStart"/>
+      <w:r>
+        <w:rPr>
+          <w:rFonts w:ascii="Courier New" w:hAnsi="Courier New" w:cs="Courier New"/>
+          <w:i/>
+          <w:sz w:val="14"/>
+        </w:rPr>
+        <w:t>users</w:t>
+      </w:r>
+      <w:proofErr w:type="spellEnd"/>
+      <w:r>
+        <w:rPr>
+          <w:rFonts w:ascii="Courier New" w:hAnsi="Courier New" w:cs="Courier New"/>
+          <w:i/>
+          <w:sz w:val="14"/>
+        </w:rPr>
+        <w:t xml:space="preserve"> (</w:t>
+      </w:r>
+      <w:proofErr w:type="spellStart"/>
+      <w:r>
+        <w:rPr>
+          <w:rFonts w:ascii="Courier New" w:hAnsi="Courier New" w:cs="Courier New"/>
+          <w:i/>
+          <w:sz w:val="14"/>
+        </w:rPr>
+        <w:t>user_id</w:t>
+      </w:r>
+      <w:proofErr w:type="spellEnd"/>
+      <w:r>
+        <w:rPr>
+          <w:rFonts w:ascii="Courier New" w:hAnsi="Courier New" w:cs="Courier New"/>
+          <w:i/>
+          <w:sz w:val="14"/>
+        </w:rPr>
+        <w:t xml:space="preserve">, </w:t>
+      </w:r>
+      <w:proofErr w:type="spellStart"/>
+      <w:r>
+        <w:rPr>
+          <w:rFonts w:ascii="Courier New" w:hAnsi="Courier New" w:cs="Courier New"/>
+          <w:i/>
+          <w:sz w:val="14"/>
+        </w:rPr>
+        <w:t>name</w:t>
+      </w:r>
+      <w:proofErr w:type="spellEnd"/>
+      <w:r>
+        <w:rPr>
+          <w:rFonts w:ascii="Courier New" w:hAnsi="Courier New" w:cs="Courier New"/>
+          <w:i/>
+          <w:sz w:val="14"/>
+        </w:rPr>
+        <w:t xml:space="preserve">, </w:t>
+      </w:r>
+      <w:proofErr w:type="spellStart"/>
+      <w:r>
+        <w:rPr>
+          <w:rFonts w:ascii="Courier New" w:hAnsi="Courier New" w:cs="Courier New"/>
+          <w:i/>
+          <w:sz w:val="14"/>
+        </w:rPr>
+        <w:t>last_name</w:t>
+      </w:r>
+      <w:proofErr w:type="spellEnd"/>
+      <w:r>
+        <w:rPr>
+          <w:rFonts w:ascii="Courier New" w:hAnsi="Courier New" w:cs="Courier New"/>
+          <w:i/>
+          <w:sz w:val="14"/>
+        </w:rPr>
+        <w:t>)</w:t>
+      </w:r>
+    </w:p>
+    <w:p>
+      <w:pPr>
+        <w:spacing w:after="0"/>
+        <w:rPr>
+          <w:rFonts w:ascii="Courier New" w:hAnsi="Courier New" w:cs="Courier New"/>
+          <w:i/>
+          <w:sz w:val="14"/>
+        </w:rPr>
+      </w:pPr>
+      <w:r>
+        <w:rPr>
+          <w:rFonts w:ascii="Courier New" w:hAnsi="Courier New" w:cs="Courier New"/>
+          <w:i/>
+          <w:sz w:val="14"/>
+        </w:rPr>
+        <w:t xml:space="preserve">      VALUES (i, '</w:t>
+      </w:r>
+      <w:proofErr w:type="spellStart"/>
+      <w:r>
+        <w:rPr>
+          <w:rFonts w:ascii="Courier New" w:hAnsi="Courier New" w:cs="Courier New"/>
+          <w:i/>
+          <w:sz w:val="14"/>
+        </w:rPr>
+        <w:t>User</w:t>
+      </w:r>
+      <w:proofErr w:type="spellEnd"/>
+      <w:r>
+        <w:rPr>
+          <w:rFonts w:ascii="Courier New" w:hAnsi="Courier New" w:cs="Courier New"/>
+          <w:i/>
+          <w:sz w:val="14"/>
+        </w:rPr>
+        <w:t>_' || i, '</w:t>
+      </w:r>
+      <w:proofErr w:type="spellStart"/>
+      <w:r>
+        <w:rPr>
+          <w:rFonts w:ascii="Courier New" w:hAnsi="Courier New" w:cs="Courier New"/>
+          <w:i/>
+          <w:sz w:val="14"/>
+        </w:rPr>
+        <w:t>LastName</w:t>
+      </w:r>
+      <w:proofErr w:type="spellEnd"/>
+      <w:r>
+        <w:rPr>
+          <w:rFonts w:ascii="Courier New" w:hAnsi="Courier New" w:cs="Courier New"/>
+          <w:i/>
+          <w:sz w:val="14"/>
+        </w:rPr>
+        <w:t>_' || i);</w:t>
+      </w:r>
+    </w:p>
+    <w:p>
+      <w:pPr>
+        <w:spacing w:after="0"/>
+        <w:rPr>
+          <w:rFonts w:ascii="Courier New" w:hAnsi="Courier New" w:cs="Courier New"/>
+          <w:i/>
+          <w:sz w:val="14"/>
+        </w:rPr>
+      </w:pPr>
+      <w:r>
+        <w:rPr>
+          <w:rFonts w:ascii="Courier New" w:hAnsi="Courier New" w:cs="Courier New"/>
+          <w:i/>
+          <w:sz w:val="14"/>
+        </w:rPr>
+        <w:t xml:space="preserve">   END LOOP;</w:t>
+      </w:r>
+    </w:p>
+    <w:p>
+      <w:pPr>
+        <w:spacing w:after="0"/>
+        <w:rPr>
+          <w:rFonts w:ascii="Courier New" w:hAnsi="Courier New" w:cs="Courier New"/>
+          <w:i/>
+          <w:sz w:val="14"/>
+        </w:rPr>
+      </w:pPr>
+      <w:r>
+        <w:rPr>
+          <w:rFonts w:ascii="Courier New" w:hAnsi="Courier New" w:cs="Courier New"/>
+          <w:i/>
+          <w:sz w:val="14"/>
+        </w:rPr>
+        <w:t>END $$;</w:t>
+      </w:r>
+    </w:p>
+    <w:p>
+      <w:pPr>
+        <w:spacing w:after="0"/>
+        <w:rPr>
+          <w:rFonts w:ascii="Courier New" w:hAnsi="Courier New" w:cs="Courier New"/>
+          <w:i/>
+          <w:noProof/>
+          <w:sz w:val="14"/>
+          <w:lang w:eastAsia="es-ES"/>
+        </w:rPr>
+      </w:pPr>
+    </w:p>
+    <w:p>
+      <w:pPr>
+        <w:spacing w:after="0"/>
+        <w:rPr>
+          <w:rFonts w:ascii="Courier New" w:hAnsi="Courier New" w:cs="Courier New"/>
+          <w:i/>
+          <w:noProof/>
+          <w:sz w:val="14"/>
+          <w:lang w:eastAsia="es-ES"/>
+        </w:rPr>
+      </w:pPr>
+    </w:p>
+    <w:p>
+      <w:pPr>
+        <w:spacing w:after="0"/>
+        <w:rPr>
+          <w:rFonts w:ascii="Courier New" w:hAnsi="Courier New" w:cs="Courier New"/>
+          <w:i/>
+          <w:sz w:val="14"/>
+        </w:rPr>
+      </w:pPr>
+      <w:r>
+        <w:rPr>
+          <w:rFonts w:ascii="Courier New" w:hAnsi="Courier New" w:cs="Courier New"/>
+          <w:i/>
+          <w:noProof/>
+          <w:sz w:val="14"/>
+          <w:lang w:eastAsia="es-ES"/>
+        </w:rPr>
+        <w:drawing>
+          <wp:inline distT="0" distB="0" distL="0" distR="0">
+            <wp:extent cx="5400040" cy="3054767"/>
+            <wp:effectExtent l="19050" t="0" r="0" b="0"/>
+            <wp:docPr id="20" name="Imagen 26"/>
+            <wp:cNvGraphicFramePr>
+              <a:graphicFrameLocks xmlns:a="http://schemas.openxmlformats.org/drawingml/2006/main" noChangeAspect="1"/>
+            </wp:cNvGraphicFramePr>
+            <a:graphic xmlns:a="http://schemas.openxmlformats.org/drawingml/2006/main">
+              <a:graphicData uri="http://schemas.openxmlformats.org/drawingml/2006/picture">
+                <pic:pic xmlns:pic="http://schemas.openxmlformats.org/drawingml/2006/picture">
+                  <pic:nvPicPr>
+                    <pic:cNvPr id="0" name="Picture 26"/>
+                    <pic:cNvPicPr>
+                      <a:picLocks noChangeAspect="1" noChangeArrowheads="1"/>
+                    </pic:cNvPicPr>
+                  </pic:nvPicPr>
+                  <pic:blipFill>
+                    <a:blip r:embed="rId29"/>
+                    <a:srcRect/>
+                    <a:stretch>
+                      <a:fillRect/>
+                    </a:stretch>
+                  </pic:blipFill>
+                  <pic:spPr bwMode="auto">
+                    <a:xfrm>
+                      <a:off x="0" y="0"/>
+                      <a:ext cx="5400040" cy="3054767"/>
+                    </a:xfrm>
+                    <a:prstGeom prst="rect">
+                      <a:avLst/>
+                    </a:prstGeom>
+                    <a:noFill/>
+                    <a:ln w="9525">
+                      <a:noFill/>
+                      <a:miter lim="800000"/>
+                      <a:headEnd/>
+                      <a:tailEnd/>
+                    </a:ln>
+                  </pic:spPr>
+                </pic:pic>
+              </a:graphicData>
+            </a:graphic>
+          </wp:inline>
+        </w:drawing>
+      </w:r>
+    </w:p>
+    <w:p>
+      <w:pPr>
+        <w:spacing w:after="0"/>
+        <w:rPr>
+          <w:rFonts w:ascii="Courier New" w:hAnsi="Courier New" w:cs="Courier New"/>
+          <w:i/>
+          <w:sz w:val="14"/>
+        </w:rPr>
+      </w:pPr>
+    </w:p>
+    <w:p>
+      <w:pPr>
+        <w:spacing w:after="0"/>
+        <w:rPr>
+          <w:rFonts w:ascii="Courier New" w:hAnsi="Courier New" w:cs="Courier New"/>
+          <w:i/>
+          <w:sz w:val="14"/>
+        </w:rPr>
+      </w:pPr>
+    </w:p>
+    <w:p>
+      <w:pPr>
+        <w:pStyle w:val="HTMLconformatoprevio"/>
+        <w:shd w:val="clear" w:color="auto" w:fill="FFFFFF"/>
+        <w:rPr>
+          <w:rFonts w:asciiTheme="minorHAnsi" w:eastAsiaTheme="minorHAnsi" w:hAnsiTheme="minorHAnsi" w:cstheme="minorBidi"/>
+          <w:sz w:val="24"/>
+          <w:szCs w:val="22"/>
+          <w:lang w:eastAsia="en-US"/>
+        </w:rPr>
+      </w:pPr>
+      <w:proofErr w:type="spellStart"/>
+      <w:r>
+        <w:rPr>
+          <w:rFonts w:asciiTheme="minorHAnsi" w:eastAsiaTheme="minorHAnsi" w:hAnsiTheme="minorHAnsi" w:cstheme="minorBidi"/>
+          <w:sz w:val="24"/>
+          <w:szCs w:val="22"/>
+          <w:lang w:eastAsia="en-US"/>
+        </w:rPr>
+        <w:t>We</w:t>
+      </w:r>
+      <w:proofErr w:type="spellEnd"/>
+      <w:r>
+        <w:rPr>
+          <w:rFonts w:asciiTheme="minorHAnsi" w:eastAsiaTheme="minorHAnsi" w:hAnsiTheme="minorHAnsi" w:cstheme="minorBidi"/>
+          <w:sz w:val="24"/>
+          <w:szCs w:val="22"/>
+          <w:lang w:eastAsia="en-US"/>
+        </w:rPr>
+        <w:t xml:space="preserve"> </w:t>
+      </w:r>
+      <w:proofErr w:type="spellStart"/>
+      <w:r>
+        <w:rPr>
+          <w:rFonts w:asciiTheme="minorHAnsi" w:eastAsiaTheme="minorHAnsi" w:hAnsiTheme="minorHAnsi" w:cstheme="minorBidi"/>
+          <w:sz w:val="24"/>
+          <w:szCs w:val="22"/>
+          <w:lang w:eastAsia="en-US"/>
+        </w:rPr>
+        <w:t>have</w:t>
+      </w:r>
+      <w:proofErr w:type="spellEnd"/>
+      <w:r>
+        <w:rPr>
+          <w:rFonts w:asciiTheme="minorHAnsi" w:eastAsiaTheme="minorHAnsi" w:hAnsiTheme="minorHAnsi" w:cstheme="minorBidi"/>
+          <w:sz w:val="24"/>
+          <w:szCs w:val="22"/>
+          <w:lang w:eastAsia="en-US"/>
+        </w:rPr>
+        <w:t xml:space="preserve"> </w:t>
+      </w:r>
+      <w:proofErr w:type="spellStart"/>
+      <w:r>
+        <w:rPr>
+          <w:rFonts w:asciiTheme="minorHAnsi" w:eastAsiaTheme="minorHAnsi" w:hAnsiTheme="minorHAnsi" w:cstheme="minorBidi"/>
+          <w:sz w:val="24"/>
+          <w:szCs w:val="22"/>
+          <w:lang w:eastAsia="en-US"/>
+        </w:rPr>
+        <w:t>implemented</w:t>
+      </w:r>
+      <w:proofErr w:type="spellEnd"/>
+      <w:r>
+        <w:rPr>
+          <w:rFonts w:asciiTheme="minorHAnsi" w:eastAsiaTheme="minorHAnsi" w:hAnsiTheme="minorHAnsi" w:cstheme="minorBidi"/>
+          <w:sz w:val="24"/>
+          <w:szCs w:val="22"/>
+          <w:lang w:eastAsia="en-US"/>
+        </w:rPr>
+        <w:t xml:space="preserve"> a </w:t>
+      </w:r>
+      <w:proofErr w:type="spellStart"/>
+      <w:r>
+        <w:rPr>
+          <w:rFonts w:asciiTheme="minorHAnsi" w:eastAsiaTheme="minorHAnsi" w:hAnsiTheme="minorHAnsi" w:cstheme="minorBidi"/>
+          <w:sz w:val="24"/>
+          <w:szCs w:val="22"/>
+          <w:lang w:eastAsia="en-US"/>
+        </w:rPr>
+        <w:t>a</w:t>
+      </w:r>
+      <w:proofErr w:type="spellEnd"/>
+      <w:r>
+        <w:rPr>
+          <w:rFonts w:asciiTheme="minorHAnsi" w:eastAsiaTheme="minorHAnsi" w:hAnsiTheme="minorHAnsi" w:cstheme="minorBidi"/>
+          <w:sz w:val="24"/>
+          <w:szCs w:val="22"/>
+          <w:lang w:eastAsia="en-US"/>
+        </w:rPr>
+        <w:t xml:space="preserve"> simple fan-in </w:t>
+      </w:r>
+      <w:proofErr w:type="spellStart"/>
+      <w:r>
+        <w:rPr>
+          <w:rFonts w:asciiTheme="minorHAnsi" w:eastAsiaTheme="minorHAnsi" w:hAnsiTheme="minorHAnsi" w:cstheme="minorBidi"/>
+          <w:sz w:val="24"/>
+          <w:szCs w:val="22"/>
+          <w:lang w:eastAsia="en-US"/>
+        </w:rPr>
+        <w:t>architecture</w:t>
+      </w:r>
+      <w:proofErr w:type="spellEnd"/>
+      <w:r>
+        <w:rPr>
+          <w:rFonts w:asciiTheme="minorHAnsi" w:eastAsiaTheme="minorHAnsi" w:hAnsiTheme="minorHAnsi" w:cstheme="minorBidi"/>
+          <w:sz w:val="24"/>
+          <w:szCs w:val="22"/>
+          <w:lang w:eastAsia="en-US"/>
+        </w:rPr>
+        <w:t>:</w:t>
+      </w:r>
+    </w:p>
+    <w:p>
+      <w:pPr>
+        <w:pStyle w:val="HTMLconformatoprevio"/>
+        <w:shd w:val="clear" w:color="auto" w:fill="FFFFFF"/>
+        <w:rPr>
+          <w:rFonts w:asciiTheme="minorHAnsi" w:eastAsiaTheme="minorHAnsi" w:hAnsiTheme="minorHAnsi" w:cstheme="minorBidi"/>
+          <w:sz w:val="24"/>
+          <w:szCs w:val="22"/>
+          <w:lang w:eastAsia="en-US"/>
+        </w:rPr>
+      </w:pPr>
+    </w:p>
+    <w:p>
+      <w:pPr>
+        <w:pStyle w:val="HTMLconformatoprevio"/>
+        <w:numPr>
+          <w:ilvl w:val="0"/>
+          <w:numId w:val="1"/>
+        </w:numPr>
+        <w:shd w:val="clear" w:color="auto" w:fill="FFFFFF"/>
+        <w:rPr>
+          <w:rFonts w:asciiTheme="minorHAnsi" w:eastAsiaTheme="minorHAnsi" w:hAnsiTheme="minorHAnsi" w:cstheme="minorBidi"/>
+          <w:sz w:val="24"/>
+          <w:szCs w:val="22"/>
+          <w:lang w:eastAsia="en-US"/>
+        </w:rPr>
+      </w:pPr>
+      <w:proofErr w:type="spellStart"/>
+      <w:r>
+        <w:rPr>
+          <w:rFonts w:asciiTheme="minorHAnsi" w:eastAsiaTheme="minorHAnsi" w:hAnsiTheme="minorHAnsi" w:cstheme="minorBidi"/>
+          <w:sz w:val="24"/>
+          <w:szCs w:val="22"/>
+          <w:lang w:eastAsia="en-US"/>
+        </w:rPr>
+        <w:t>both</w:t>
+      </w:r>
+      <w:proofErr w:type="spellEnd"/>
+      <w:r>
+        <w:rPr>
+          <w:rFonts w:asciiTheme="minorHAnsi" w:eastAsiaTheme="minorHAnsi" w:hAnsiTheme="minorHAnsi" w:cstheme="minorBidi"/>
+          <w:sz w:val="24"/>
+          <w:szCs w:val="22"/>
+          <w:lang w:eastAsia="en-US"/>
+        </w:rPr>
+        <w:t xml:space="preserve"> </w:t>
+      </w:r>
+      <w:proofErr w:type="spellStart"/>
+      <w:r>
+        <w:rPr>
+          <w:rFonts w:asciiTheme="minorHAnsi" w:eastAsiaTheme="minorHAnsi" w:hAnsiTheme="minorHAnsi" w:cstheme="minorBidi"/>
+          <w:sz w:val="24"/>
+          <w:szCs w:val="22"/>
+          <w:lang w:eastAsia="en-US"/>
+        </w:rPr>
+        <w:t>the</w:t>
+      </w:r>
+      <w:proofErr w:type="spellEnd"/>
+      <w:r>
+        <w:rPr>
+          <w:rFonts w:asciiTheme="minorHAnsi" w:eastAsiaTheme="minorHAnsi" w:hAnsiTheme="minorHAnsi" w:cstheme="minorBidi"/>
+          <w:sz w:val="24"/>
+          <w:szCs w:val="22"/>
+          <w:lang w:eastAsia="en-US"/>
+        </w:rPr>
+        <w:t xml:space="preserve"> </w:t>
+      </w:r>
+      <w:proofErr w:type="spellStart"/>
+      <w:r>
+        <w:rPr>
+          <w:rFonts w:asciiTheme="minorHAnsi" w:eastAsiaTheme="minorHAnsi" w:hAnsiTheme="minorHAnsi" w:cstheme="minorBidi"/>
+          <w:sz w:val="24"/>
+          <w:szCs w:val="22"/>
+          <w:lang w:eastAsia="en-US"/>
+        </w:rPr>
+        <w:t>Go</w:t>
+      </w:r>
+      <w:proofErr w:type="spellEnd"/>
+      <w:r>
+        <w:rPr>
+          <w:rFonts w:asciiTheme="minorHAnsi" w:eastAsiaTheme="minorHAnsi" w:hAnsiTheme="minorHAnsi" w:cstheme="minorBidi"/>
+          <w:sz w:val="24"/>
+          <w:szCs w:val="22"/>
+          <w:lang w:eastAsia="en-US"/>
+        </w:rPr>
+        <w:t xml:space="preserve"> </w:t>
+      </w:r>
+      <w:proofErr w:type="spellStart"/>
+      <w:r>
+        <w:rPr>
+          <w:rFonts w:asciiTheme="minorHAnsi" w:eastAsiaTheme="minorHAnsi" w:hAnsiTheme="minorHAnsi" w:cstheme="minorBidi"/>
+          <w:sz w:val="24"/>
+          <w:szCs w:val="22"/>
+          <w:lang w:eastAsia="en-US"/>
+        </w:rPr>
+        <w:t>producer</w:t>
+      </w:r>
+      <w:proofErr w:type="spellEnd"/>
+      <w:r>
+        <w:rPr>
+          <w:rFonts w:asciiTheme="minorHAnsi" w:eastAsiaTheme="minorHAnsi" w:hAnsiTheme="minorHAnsi" w:cstheme="minorBidi"/>
+          <w:sz w:val="24"/>
+          <w:szCs w:val="22"/>
+          <w:lang w:eastAsia="en-US"/>
+        </w:rPr>
+        <w:t xml:space="preserve"> </w:t>
+      </w:r>
+      <w:r>
+        <w:rPr>
+          <w:rFonts w:asciiTheme="minorHAnsi" w:eastAsiaTheme="minorHAnsi" w:hAnsiTheme="minorHAnsi" w:cstheme="minorBidi"/>
+          <w:sz w:val="24"/>
+          <w:szCs w:val="22"/>
+          <w:lang w:eastAsia="en-US"/>
+        </w:rPr>
+        <w:t xml:space="preserve">and </w:t>
+      </w:r>
+      <w:proofErr w:type="spellStart"/>
+      <w:r>
+        <w:rPr>
+          <w:rFonts w:asciiTheme="minorHAnsi" w:eastAsiaTheme="minorHAnsi" w:hAnsiTheme="minorHAnsi" w:cstheme="minorBidi"/>
+          <w:sz w:val="24"/>
+          <w:szCs w:val="22"/>
+          <w:lang w:eastAsia="en-US"/>
+        </w:rPr>
+        <w:t>the</w:t>
+      </w:r>
+      <w:proofErr w:type="spellEnd"/>
+      <w:r>
+        <w:rPr>
+          <w:rFonts w:asciiTheme="minorHAnsi" w:eastAsiaTheme="minorHAnsi" w:hAnsiTheme="minorHAnsi" w:cstheme="minorBidi"/>
+          <w:sz w:val="24"/>
+          <w:szCs w:val="22"/>
+          <w:lang w:eastAsia="en-US"/>
+        </w:rPr>
+        <w:t xml:space="preserve"> </w:t>
+      </w:r>
+      <w:proofErr w:type="spellStart"/>
+      <w:r>
+        <w:rPr>
+          <w:rFonts w:asciiTheme="minorHAnsi" w:eastAsiaTheme="minorHAnsi" w:hAnsiTheme="minorHAnsi" w:cstheme="minorBidi"/>
+          <w:sz w:val="24"/>
+          <w:szCs w:val="22"/>
+          <w:lang w:eastAsia="en-US"/>
+        </w:rPr>
+        <w:t>kafka</w:t>
+      </w:r>
+      <w:proofErr w:type="spellEnd"/>
+      <w:r>
+        <w:rPr>
+          <w:rFonts w:asciiTheme="minorHAnsi" w:eastAsiaTheme="minorHAnsi" w:hAnsiTheme="minorHAnsi" w:cstheme="minorBidi"/>
+          <w:sz w:val="24"/>
+          <w:szCs w:val="22"/>
+          <w:lang w:eastAsia="en-US"/>
+        </w:rPr>
+        <w:t xml:space="preserve"> </w:t>
+      </w:r>
+      <w:proofErr w:type="spellStart"/>
+      <w:r>
+        <w:rPr>
+          <w:rFonts w:asciiTheme="minorHAnsi" w:eastAsiaTheme="minorHAnsi" w:hAnsiTheme="minorHAnsi" w:cstheme="minorBidi"/>
+          <w:sz w:val="24"/>
+          <w:szCs w:val="22"/>
+          <w:lang w:eastAsia="en-US"/>
+        </w:rPr>
+        <w:t>connector</w:t>
+      </w:r>
+      <w:proofErr w:type="spellEnd"/>
+      <w:r>
+        <w:rPr>
+          <w:rFonts w:asciiTheme="minorHAnsi" w:eastAsiaTheme="minorHAnsi" w:hAnsiTheme="minorHAnsi" w:cstheme="minorBidi"/>
+          <w:sz w:val="24"/>
+          <w:szCs w:val="22"/>
+          <w:lang w:eastAsia="en-US"/>
+        </w:rPr>
+        <w:t xml:space="preserve"> </w:t>
+      </w:r>
+      <w:proofErr w:type="spellStart"/>
+      <w:r>
+        <w:rPr>
+          <w:rFonts w:asciiTheme="minorHAnsi" w:eastAsiaTheme="minorHAnsi" w:hAnsiTheme="minorHAnsi" w:cstheme="minorBidi"/>
+          <w:sz w:val="24"/>
+          <w:szCs w:val="22"/>
+          <w:lang w:eastAsia="en-US"/>
+        </w:rPr>
+        <w:t>write</w:t>
+      </w:r>
+      <w:proofErr w:type="spellEnd"/>
+      <w:r>
+        <w:rPr>
+          <w:rFonts w:asciiTheme="minorHAnsi" w:eastAsiaTheme="minorHAnsi" w:hAnsiTheme="minorHAnsi" w:cstheme="minorBidi"/>
+          <w:sz w:val="24"/>
+          <w:szCs w:val="22"/>
+          <w:lang w:eastAsia="en-US"/>
+        </w:rPr>
+        <w:t xml:space="preserve"> </w:t>
+      </w:r>
+      <w:proofErr w:type="spellStart"/>
+      <w:r>
+        <w:rPr>
+          <w:rFonts w:asciiTheme="minorHAnsi" w:eastAsiaTheme="minorHAnsi" w:hAnsiTheme="minorHAnsi" w:cstheme="minorBidi"/>
+          <w:sz w:val="24"/>
+          <w:szCs w:val="22"/>
+          <w:lang w:eastAsia="en-US"/>
+        </w:rPr>
+        <w:t>to</w:t>
+      </w:r>
+      <w:proofErr w:type="spellEnd"/>
+      <w:r>
+        <w:rPr>
+          <w:rFonts w:asciiTheme="minorHAnsi" w:eastAsiaTheme="minorHAnsi" w:hAnsiTheme="minorHAnsi" w:cstheme="minorBidi"/>
+          <w:sz w:val="24"/>
+          <w:szCs w:val="22"/>
+          <w:lang w:eastAsia="en-US"/>
+        </w:rPr>
+        <w:t xml:space="preserve"> </w:t>
+      </w:r>
+      <w:proofErr w:type="spellStart"/>
+      <w:r>
+        <w:rPr>
+          <w:rFonts w:asciiTheme="minorHAnsi" w:eastAsiaTheme="minorHAnsi" w:hAnsiTheme="minorHAnsi" w:cstheme="minorBidi"/>
+          <w:sz w:val="24"/>
+          <w:szCs w:val="22"/>
+          <w:lang w:eastAsia="en-US"/>
+        </w:rPr>
+        <w:t>the</w:t>
+      </w:r>
+      <w:proofErr w:type="spellEnd"/>
+      <w:r>
+        <w:rPr>
+          <w:rFonts w:asciiTheme="minorHAnsi" w:eastAsiaTheme="minorHAnsi" w:hAnsiTheme="minorHAnsi" w:cstheme="minorBidi"/>
+          <w:sz w:val="24"/>
+          <w:szCs w:val="22"/>
+          <w:lang w:eastAsia="en-US"/>
+        </w:rPr>
+        <w:t xml:space="preserve"> </w:t>
+      </w:r>
+      <w:proofErr w:type="spellStart"/>
+      <w:r>
+        <w:rPr>
+          <w:rFonts w:asciiTheme="minorHAnsi" w:eastAsiaTheme="minorHAnsi" w:hAnsiTheme="minorHAnsi" w:cstheme="minorBidi"/>
+          <w:sz w:val="24"/>
+          <w:szCs w:val="22"/>
+          <w:lang w:eastAsia="en-US"/>
+        </w:rPr>
+        <w:t>same</w:t>
+      </w:r>
+      <w:proofErr w:type="spellEnd"/>
+      <w:r>
+        <w:rPr>
+          <w:rFonts w:asciiTheme="minorHAnsi" w:eastAsiaTheme="minorHAnsi" w:hAnsiTheme="minorHAnsi" w:cstheme="minorBidi"/>
+          <w:sz w:val="24"/>
+          <w:szCs w:val="22"/>
+          <w:lang w:eastAsia="en-US"/>
+        </w:rPr>
+        <w:t xml:space="preserve"> </w:t>
+      </w:r>
+      <w:proofErr w:type="spellStart"/>
+      <w:r>
+        <w:rPr>
+          <w:rFonts w:asciiTheme="minorHAnsi" w:eastAsiaTheme="minorHAnsi" w:hAnsiTheme="minorHAnsi" w:cstheme="minorBidi"/>
+          <w:sz w:val="24"/>
+          <w:szCs w:val="22"/>
+          <w:lang w:eastAsia="en-US"/>
+        </w:rPr>
+        <w:t>topic</w:t>
+      </w:r>
+      <w:proofErr w:type="spellEnd"/>
+      <w:r>
+        <w:rPr>
+          <w:rFonts w:asciiTheme="minorHAnsi" w:eastAsiaTheme="minorHAnsi" w:hAnsiTheme="minorHAnsi" w:cstheme="minorBidi"/>
+          <w:sz w:val="24"/>
+          <w:szCs w:val="22"/>
+          <w:lang w:eastAsia="en-US"/>
+        </w:rPr>
+        <w:t xml:space="preserve"> </w:t>
+      </w:r>
+    </w:p>
+    <w:p>
+      <w:pPr>
+        <w:pStyle w:val="HTMLconformatoprevio"/>
+        <w:numPr>
+          <w:ilvl w:val="0"/>
+          <w:numId w:val="1"/>
+        </w:numPr>
+        <w:shd w:val="clear" w:color="auto" w:fill="FFFFFF"/>
+        <w:rPr>
+          <w:rFonts w:asciiTheme="minorHAnsi" w:eastAsiaTheme="minorHAnsi" w:hAnsiTheme="minorHAnsi" w:cstheme="minorBidi"/>
+          <w:sz w:val="24"/>
+          <w:szCs w:val="22"/>
+          <w:lang w:eastAsia="en-US"/>
+        </w:rPr>
+      </w:pPr>
+      <w:proofErr w:type="spellStart"/>
+      <w:r>
+        <w:rPr>
+          <w:rFonts w:asciiTheme="minorHAnsi" w:eastAsiaTheme="minorHAnsi" w:hAnsiTheme="minorHAnsi" w:cstheme="minorBidi"/>
+          <w:sz w:val="24"/>
+          <w:szCs w:val="22"/>
+          <w:lang w:eastAsia="en-US"/>
+        </w:rPr>
+        <w:t>Both</w:t>
+      </w:r>
+      <w:proofErr w:type="spellEnd"/>
+      <w:r>
+        <w:rPr>
+          <w:rFonts w:asciiTheme="minorHAnsi" w:eastAsiaTheme="minorHAnsi" w:hAnsiTheme="minorHAnsi" w:cstheme="minorBidi"/>
+          <w:sz w:val="24"/>
+          <w:szCs w:val="22"/>
+          <w:lang w:eastAsia="en-US"/>
+        </w:rPr>
+        <w:t xml:space="preserve"> </w:t>
+      </w:r>
+      <w:proofErr w:type="spellStart"/>
+      <w:r>
+        <w:rPr>
+          <w:rFonts w:asciiTheme="minorHAnsi" w:eastAsiaTheme="minorHAnsi" w:hAnsiTheme="minorHAnsi" w:cstheme="minorBidi"/>
+          <w:sz w:val="24"/>
+          <w:szCs w:val="22"/>
+          <w:lang w:eastAsia="en-US"/>
+        </w:rPr>
+        <w:t>the</w:t>
+      </w:r>
+      <w:proofErr w:type="spellEnd"/>
+      <w:r>
+        <w:rPr>
+          <w:rFonts w:asciiTheme="minorHAnsi" w:eastAsiaTheme="minorHAnsi" w:hAnsiTheme="minorHAnsi" w:cstheme="minorBidi"/>
+          <w:sz w:val="24"/>
+          <w:szCs w:val="22"/>
+          <w:lang w:eastAsia="en-US"/>
+        </w:rPr>
+        <w:t xml:space="preserve"> </w:t>
+      </w:r>
+      <w:proofErr w:type="spellStart"/>
+      <w:r>
+        <w:rPr>
+          <w:rFonts w:asciiTheme="minorHAnsi" w:eastAsiaTheme="minorHAnsi" w:hAnsiTheme="minorHAnsi" w:cstheme="minorBidi"/>
+          <w:sz w:val="24"/>
+          <w:szCs w:val="22"/>
+          <w:lang w:eastAsia="en-US"/>
+        </w:rPr>
+        <w:t>Go</w:t>
+      </w:r>
+      <w:proofErr w:type="spellEnd"/>
+      <w:r>
+        <w:rPr>
+          <w:rFonts w:asciiTheme="minorHAnsi" w:eastAsiaTheme="minorHAnsi" w:hAnsiTheme="minorHAnsi" w:cstheme="minorBidi"/>
+          <w:sz w:val="24"/>
+          <w:szCs w:val="22"/>
+          <w:lang w:eastAsia="en-US"/>
+        </w:rPr>
+        <w:t xml:space="preserve"> </w:t>
+      </w:r>
+      <w:proofErr w:type="spellStart"/>
+      <w:r>
+        <w:rPr>
+          <w:rFonts w:asciiTheme="minorHAnsi" w:eastAsiaTheme="minorHAnsi" w:hAnsiTheme="minorHAnsi" w:cstheme="minorBidi"/>
+          <w:sz w:val="24"/>
+          <w:szCs w:val="22"/>
+          <w:lang w:eastAsia="en-US"/>
+        </w:rPr>
+        <w:t>producer</w:t>
+      </w:r>
+      <w:proofErr w:type="spellEnd"/>
+      <w:r>
+        <w:rPr>
+          <w:rFonts w:asciiTheme="minorHAnsi" w:eastAsiaTheme="minorHAnsi" w:hAnsiTheme="minorHAnsi" w:cstheme="minorBidi"/>
+          <w:sz w:val="24"/>
+          <w:szCs w:val="22"/>
+          <w:lang w:eastAsia="en-US"/>
+        </w:rPr>
+        <w:t xml:space="preserve"> and </w:t>
+      </w:r>
+      <w:proofErr w:type="spellStart"/>
+      <w:r>
+        <w:rPr>
+          <w:rFonts w:asciiTheme="minorHAnsi" w:eastAsiaTheme="minorHAnsi" w:hAnsiTheme="minorHAnsi" w:cstheme="minorBidi"/>
+          <w:sz w:val="24"/>
+          <w:szCs w:val="22"/>
+          <w:lang w:eastAsia="en-US"/>
+        </w:rPr>
+        <w:t>the</w:t>
+      </w:r>
+      <w:proofErr w:type="spellEnd"/>
+      <w:r>
+        <w:rPr>
+          <w:rFonts w:asciiTheme="minorHAnsi" w:eastAsiaTheme="minorHAnsi" w:hAnsiTheme="minorHAnsi" w:cstheme="minorBidi"/>
+          <w:sz w:val="24"/>
+          <w:szCs w:val="22"/>
+          <w:lang w:eastAsia="en-US"/>
+        </w:rPr>
+        <w:t xml:space="preserve"> Kafka </w:t>
+      </w:r>
+      <w:proofErr w:type="spellStart"/>
+      <w:r>
+        <w:rPr>
+          <w:rFonts w:asciiTheme="minorHAnsi" w:eastAsiaTheme="minorHAnsi" w:hAnsiTheme="minorHAnsi" w:cstheme="minorBidi"/>
+          <w:sz w:val="24"/>
+          <w:szCs w:val="22"/>
+          <w:lang w:eastAsia="en-US"/>
+        </w:rPr>
+        <w:t>connector</w:t>
+      </w:r>
+      <w:proofErr w:type="spellEnd"/>
+      <w:r>
+        <w:rPr>
+          <w:rFonts w:asciiTheme="minorHAnsi" w:eastAsiaTheme="minorHAnsi" w:hAnsiTheme="minorHAnsi" w:cstheme="minorBidi"/>
+          <w:sz w:val="24"/>
+          <w:szCs w:val="22"/>
+          <w:lang w:eastAsia="en-US"/>
+        </w:rPr>
+        <w:t xml:space="preserve"> share </w:t>
+      </w:r>
+      <w:proofErr w:type="spellStart"/>
+      <w:r>
+        <w:rPr>
+          <w:rFonts w:asciiTheme="minorHAnsi" w:eastAsiaTheme="minorHAnsi" w:hAnsiTheme="minorHAnsi" w:cstheme="minorBidi"/>
+          <w:sz w:val="24"/>
+          <w:szCs w:val="22"/>
+          <w:lang w:eastAsia="en-US"/>
+        </w:rPr>
+        <w:t>the</w:t>
+      </w:r>
+      <w:proofErr w:type="spellEnd"/>
+      <w:r>
+        <w:rPr>
+          <w:rFonts w:asciiTheme="minorHAnsi" w:eastAsiaTheme="minorHAnsi" w:hAnsiTheme="minorHAnsi" w:cstheme="minorBidi"/>
+          <w:sz w:val="24"/>
+          <w:szCs w:val="22"/>
+          <w:lang w:eastAsia="en-US"/>
+        </w:rPr>
+        <w:t xml:space="preserve"> </w:t>
+      </w:r>
+      <w:proofErr w:type="spellStart"/>
+      <w:r>
+        <w:rPr>
+          <w:rFonts w:asciiTheme="minorHAnsi" w:eastAsiaTheme="minorHAnsi" w:hAnsiTheme="minorHAnsi" w:cstheme="minorBidi"/>
+          <w:sz w:val="24"/>
+          <w:szCs w:val="22"/>
+          <w:lang w:eastAsia="en-US"/>
+        </w:rPr>
+        <w:t>same</w:t>
+      </w:r>
+      <w:proofErr w:type="spellEnd"/>
+      <w:r>
+        <w:rPr>
+          <w:rFonts w:asciiTheme="minorHAnsi" w:eastAsiaTheme="minorHAnsi" w:hAnsiTheme="minorHAnsi" w:cstheme="minorBidi"/>
+          <w:sz w:val="24"/>
+          <w:szCs w:val="22"/>
+          <w:lang w:eastAsia="en-US"/>
+        </w:rPr>
+        <w:t xml:space="preserve"> </w:t>
+      </w:r>
+      <w:proofErr w:type="spellStart"/>
+      <w:r>
+        <w:rPr>
+          <w:rFonts w:asciiTheme="minorHAnsi" w:eastAsiaTheme="minorHAnsi" w:hAnsiTheme="minorHAnsi" w:cstheme="minorBidi"/>
+          <w:sz w:val="24"/>
+          <w:szCs w:val="22"/>
+          <w:lang w:eastAsia="en-US"/>
+        </w:rPr>
+        <w:t>protobuf</w:t>
+      </w:r>
+      <w:proofErr w:type="spellEnd"/>
+      <w:r>
+        <w:rPr>
+          <w:rFonts w:asciiTheme="minorHAnsi" w:eastAsiaTheme="minorHAnsi" w:hAnsiTheme="minorHAnsi" w:cstheme="minorBidi"/>
+          <w:sz w:val="24"/>
+          <w:szCs w:val="22"/>
+          <w:lang w:eastAsia="en-US"/>
+        </w:rPr>
+        <w:t xml:space="preserve"> </w:t>
+      </w:r>
+      <w:proofErr w:type="spellStart"/>
+      <w:r>
+        <w:rPr>
+          <w:rFonts w:asciiTheme="minorHAnsi" w:eastAsiaTheme="minorHAnsi" w:hAnsiTheme="minorHAnsi" w:cstheme="minorBidi"/>
+          <w:sz w:val="24"/>
+          <w:szCs w:val="22"/>
+          <w:lang w:eastAsia="en-US"/>
+        </w:rPr>
+        <w:t>schema</w:t>
+      </w:r>
+      <w:proofErr w:type="spellEnd"/>
+      <w:r>
+        <w:rPr>
+          <w:rFonts w:asciiTheme="minorHAnsi" w:eastAsiaTheme="minorHAnsi" w:hAnsiTheme="minorHAnsi" w:cstheme="minorBidi"/>
+          <w:sz w:val="24"/>
+          <w:szCs w:val="22"/>
+          <w:lang w:eastAsia="en-US"/>
+        </w:rPr>
+        <w:t xml:space="preserve"> </w:t>
+      </w:r>
+      <w:proofErr w:type="spellStart"/>
+      <w:r>
+        <w:rPr>
+          <w:rFonts w:asciiTheme="minorHAnsi" w:eastAsiaTheme="minorHAnsi" w:hAnsiTheme="minorHAnsi" w:cstheme="minorBidi"/>
+          <w:sz w:val="24"/>
+          <w:szCs w:val="22"/>
+          <w:lang w:eastAsia="en-US"/>
+        </w:rPr>
+        <w:t>contract</w:t>
+      </w:r>
+      <w:proofErr w:type="spellEnd"/>
+      <w:r>
+        <w:rPr>
+          <w:rFonts w:asciiTheme="minorHAnsi" w:eastAsiaTheme="minorHAnsi" w:hAnsiTheme="minorHAnsi" w:cstheme="minorBidi"/>
+          <w:sz w:val="24"/>
+          <w:szCs w:val="22"/>
+          <w:lang w:eastAsia="en-US"/>
+        </w:rPr>
+        <w:t>.</w:t>
+      </w:r>
+    </w:p>
+    <w:p>
+      <w:pPr>
+        <w:spacing w:after="0"/>
+        <w:rPr>
+          <w:sz w:val="24"/>
+        </w:rPr>
+      </w:pPr>
+    </w:p>
     <w:sectPr>
       <w:pgSz w:w="11906" w:h="16838"/>
       <w:pgMar w:top="1417" w:right="1701" w:bottom="1417" w:left="1701" w:header="708" w:footer="708" w:gutter="0"/>
@@ -16320,6 +20219,126 @@
     </w:sectPr>
   </w:body>
 </w:document>
+</file>
+
+<file path=word/numbering.xml><?xml version="1.0" encoding="utf-8"?>
+<w:numbering xmlns:ve="http://schemas.openxmlformats.org/markup-compatibility/2006" xmlns:o="urn:schemas-microsoft-com:office:office" xmlns:r="http://schemas.openxmlformats.org/officeDocument/2006/relationships" xmlns:m="http://schemas.openxmlformats.org/officeDocument/2006/math" xmlns:v="urn:schemas-microsoft-com:vml" xmlns:wp="http://schemas.openxmlformats.org/drawingml/2006/wordprocessingDrawing" xmlns:w10="urn:schemas-microsoft-com:office:word" xmlns:w="http://schemas.openxmlformats.org/wordprocessingml/2006/main" xmlns:wne="http://schemas.microsoft.com/office/word/2006/wordml">
+  <w:abstractNum w:abstractNumId="0">
+    <w:nsid w:val="35011F32"/>
+    <w:multiLevelType w:val="hybridMultilevel"/>
+    <w:tmpl w:val="4B6E3448"/>
+    <w:lvl w:ilvl="0" w:tplc="5F3CDB9A">
+      <w:numFmt w:val="bullet"/>
+      <w:lvlText w:val=""/>
+      <w:lvlJc w:val="left"/>
+      <w:pPr>
+        <w:ind w:left="720" w:hanging="360"/>
+      </w:pPr>
+      <w:rPr>
+        <w:rFonts w:ascii="Symbol" w:eastAsiaTheme="minorHAnsi" w:hAnsi="Symbol" w:cstheme="minorBidi" w:hint="default"/>
+      </w:rPr>
+    </w:lvl>
+    <w:lvl w:ilvl="1" w:tplc="0C0A0003" w:tentative="1">
+      <w:start w:val="1"/>
+      <w:numFmt w:val="bullet"/>
+      <w:lvlText w:val="o"/>
+      <w:lvlJc w:val="left"/>
+      <w:pPr>
+        <w:ind w:left="1440" w:hanging="360"/>
+      </w:pPr>
+      <w:rPr>
+        <w:rFonts w:ascii="Courier New" w:hAnsi="Courier New" w:cs="Courier New" w:hint="default"/>
+      </w:rPr>
+    </w:lvl>
+    <w:lvl w:ilvl="2" w:tplc="0C0A0005" w:tentative="1">
+      <w:start w:val="1"/>
+      <w:numFmt w:val="bullet"/>
+      <w:lvlText w:val=""/>
+      <w:lvlJc w:val="left"/>
+      <w:pPr>
+        <w:ind w:left="2160" w:hanging="360"/>
+      </w:pPr>
+      <w:rPr>
+        <w:rFonts w:ascii="Wingdings" w:hAnsi="Wingdings" w:hint="default"/>
+      </w:rPr>
+    </w:lvl>
+    <w:lvl w:ilvl="3" w:tplc="0C0A0001" w:tentative="1">
+      <w:start w:val="1"/>
+      <w:numFmt w:val="bullet"/>
+      <w:lvlText w:val=""/>
+      <w:lvlJc w:val="left"/>
+      <w:pPr>
+        <w:ind w:left="2880" w:hanging="360"/>
+      </w:pPr>
+      <w:rPr>
+        <w:rFonts w:ascii="Symbol" w:hAnsi="Symbol" w:hint="default"/>
+      </w:rPr>
+    </w:lvl>
+    <w:lvl w:ilvl="4" w:tplc="0C0A0003" w:tentative="1">
+      <w:start w:val="1"/>
+      <w:numFmt w:val="bullet"/>
+      <w:lvlText w:val="o"/>
+      <w:lvlJc w:val="left"/>
+      <w:pPr>
+        <w:ind w:left="3600" w:hanging="360"/>
+      </w:pPr>
+      <w:rPr>
+        <w:rFonts w:ascii="Courier New" w:hAnsi="Courier New" w:cs="Courier New" w:hint="default"/>
+      </w:rPr>
+    </w:lvl>
+    <w:lvl w:ilvl="5" w:tplc="0C0A0005" w:tentative="1">
+      <w:start w:val="1"/>
+      <w:numFmt w:val="bullet"/>
+      <w:lvlText w:val=""/>
+      <w:lvlJc w:val="left"/>
+      <w:pPr>
+        <w:ind w:left="4320" w:hanging="360"/>
+      </w:pPr>
+      <w:rPr>
+        <w:rFonts w:ascii="Wingdings" w:hAnsi="Wingdings" w:hint="default"/>
+      </w:rPr>
+    </w:lvl>
+    <w:lvl w:ilvl="6" w:tplc="0C0A0001" w:tentative="1">
+      <w:start w:val="1"/>
+      <w:numFmt w:val="bullet"/>
+      <w:lvlText w:val=""/>
+      <w:lvlJc w:val="left"/>
+      <w:pPr>
+        <w:ind w:left="5040" w:hanging="360"/>
+      </w:pPr>
+      <w:rPr>
+        <w:rFonts w:ascii="Symbol" w:hAnsi="Symbol" w:hint="default"/>
+      </w:rPr>
+    </w:lvl>
+    <w:lvl w:ilvl="7" w:tplc="0C0A0003" w:tentative="1">
+      <w:start w:val="1"/>
+      <w:numFmt w:val="bullet"/>
+      <w:lvlText w:val="o"/>
+      <w:lvlJc w:val="left"/>
+      <w:pPr>
+        <w:ind w:left="5760" w:hanging="360"/>
+      </w:pPr>
+      <w:rPr>
+        <w:rFonts w:ascii="Courier New" w:hAnsi="Courier New" w:cs="Courier New" w:hint="default"/>
+      </w:rPr>
+    </w:lvl>
+    <w:lvl w:ilvl="8" w:tplc="0C0A0005" w:tentative="1">
+      <w:start w:val="1"/>
+      <w:numFmt w:val="bullet"/>
+      <w:lvlText w:val=""/>
+      <w:lvlJc w:val="left"/>
+      <w:pPr>
+        <w:ind w:left="6480" w:hanging="360"/>
+      </w:pPr>
+      <w:rPr>
+        <w:rFonts w:ascii="Wingdings" w:hAnsi="Wingdings" w:hint="default"/>
+      </w:rPr>
+    </w:lvl>
+  </w:abstractNum>
+  <w:num w:numId="1">
+    <w:abstractNumId w:val="0"/>
+  </w:num>
+</w:numbering>
 </file>
 
 <file path=word/styles.xml><?xml version="1.0" encoding="utf-8"?>
@@ -16481,7 +20500,7 @@
   <w:style w:type="paragraph" w:default="1" w:styleId="Normal">
     <w:name w:val="Normal"/>
     <w:qFormat/>
-    <w:rsid w:val="00B42EB9"/>
+    <w:rsid w:val="002A7A77"/>
   </w:style>
   <w:style w:type="character" w:default="1" w:styleId="Fuentedeprrafopredeter">
     <w:name w:val="Default Paragraph Font"/>
@@ -16588,6 +20607,16 @@
       <w:szCs w:val="20"/>
       <w:lang w:eastAsia="es-ES"/>
     </w:rPr>
+  </w:style>
+  <w:style w:type="character" w:customStyle="1" w:styleId="hljs-keyword">
+    <w:name w:val="hljs-keyword"/>
+    <w:basedOn w:val="Fuentedeprrafopredeter"/>
+    <w:rsid w:val="002A7A77"/>
+  </w:style>
+  <w:style w:type="character" w:customStyle="1" w:styleId="hljs-type">
+    <w:name w:val="hljs-type"/>
+    <w:basedOn w:val="Fuentedeprrafopredeter"/>
+    <w:rsid w:val="002A7A77"/>
   </w:style>
 </w:styles>
 </file>

</xml_diff>

<commit_message>
Documenting the redis sink connector section
</commit_message>
<xml_diff>
--- a/grpc-go-kafka-producer-and-consumer-communication.docx
+++ b/grpc-go-kafka-producer-and-consumer-communication.docx
@@ -11385,14 +11385,6 @@
       <w:pPr>
         <w:spacing w:after="0"/>
         <w:rPr>
-          <w:sz w:val="24"/>
-        </w:rPr>
-      </w:pPr>
-    </w:p>
-    <w:p>
-      <w:pPr>
-        <w:spacing w:after="0"/>
-        <w:rPr>
           <w:b/>
           <w:sz w:val="28"/>
           <w:u w:val="single"/>
@@ -11455,7 +11447,7 @@
           <wp:inline distT="0" distB="0" distL="0" distR="0">
             <wp:extent cx="5400040" cy="4443764"/>
             <wp:effectExtent l="19050" t="0" r="0" b="0"/>
-            <wp:docPr id="26" name="Imagen 4"/>
+            <wp:docPr id="17" name="Imagen 4"/>
             <wp:cNvGraphicFramePr>
               <a:graphicFrameLocks xmlns:a="http://schemas.openxmlformats.org/drawingml/2006/main" noChangeAspect="1"/>
             </wp:cNvGraphicFramePr>
@@ -11531,23 +11523,7 @@
           <w:i/>
           <w:sz w:val="16"/>
         </w:rPr>
-        <w:t xml:space="preserve"> compose down; docker compose build </w:t>
-      </w:r>
-      <w:r>
-        <w:rPr>
-          <w:rFonts w:ascii="Courier New" w:hAnsi="Courier New" w:cs="Courier New"/>
-          <w:i/>
-          <w:sz w:val="16"/>
-        </w:rPr>
-        <w:t xml:space="preserve">--no-cache </w:t>
-      </w:r>
-      <w:r>
-        <w:rPr>
-          <w:rFonts w:ascii="Courier New" w:hAnsi="Courier New" w:cs="Courier New"/>
-          <w:i/>
-          <w:sz w:val="16"/>
-        </w:rPr>
-        <w:t>kafka-connect; docker compose up –d</w:t>
+        <w:t xml:space="preserve"> compose down; docker compose build --no-cache kafka-connect; docker compose up –d</w:t>
       </w:r>
     </w:p>
     <w:p>
@@ -11575,7 +11551,7 @@
           <wp:inline distT="0" distB="0" distL="0" distR="0">
             <wp:extent cx="5400040" cy="647660"/>
             <wp:effectExtent l="19050" t="0" r="0" b="0"/>
-            <wp:docPr id="24" name="Imagen 1"/>
+            <wp:docPr id="31" name="Imagen 1"/>
             <wp:cNvGraphicFramePr>
               <a:graphicFrameLocks xmlns:a="http://schemas.openxmlformats.org/drawingml/2006/main" noChangeAspect="1"/>
             </wp:cNvGraphicFramePr>
@@ -11641,131 +11617,68 @@
           <w:sz w:val="24"/>
         </w:rPr>
       </w:pPr>
-      <w:r>
-        <w:rPr>
-          <w:noProof/>
-          <w:sz w:val="24"/>
-          <w:lang w:eastAsia="es-ES"/>
-        </w:rPr>
-        <w:drawing>
-          <wp:inline distT="0" distB="0" distL="0" distR="0">
-            <wp:extent cx="5400040" cy="553850"/>
-            <wp:effectExtent l="19050" t="0" r="0" b="0"/>
-            <wp:docPr id="27" name="Imagen 7"/>
-            <wp:cNvGraphicFramePr>
-              <a:graphicFrameLocks xmlns:a="http://schemas.openxmlformats.org/drawingml/2006/main" noChangeAspect="1"/>
-            </wp:cNvGraphicFramePr>
-            <a:graphic xmlns:a="http://schemas.openxmlformats.org/drawingml/2006/main">
-              <a:graphicData uri="http://schemas.openxmlformats.org/drawingml/2006/picture">
-                <pic:pic xmlns:pic="http://schemas.openxmlformats.org/drawingml/2006/picture">
-                  <pic:nvPicPr>
-                    <pic:cNvPr id="0" name="Picture 7"/>
-                    <pic:cNvPicPr>
-                      <a:picLocks noChangeAspect="1" noChangeArrowheads="1"/>
-                    </pic:cNvPicPr>
-                  </pic:nvPicPr>
-                  <pic:blipFill>
-                    <a:blip r:embed="rId34"/>
-                    <a:srcRect/>
-                    <a:stretch>
-                      <a:fillRect/>
-                    </a:stretch>
-                  </pic:blipFill>
-                  <pic:spPr bwMode="auto">
-                    <a:xfrm>
-                      <a:off x="0" y="0"/>
-                      <a:ext cx="5400040" cy="553850"/>
-                    </a:xfrm>
-                    <a:prstGeom prst="rect">
-                      <a:avLst/>
-                    </a:prstGeom>
-                    <a:noFill/>
-                    <a:ln w="9525">
-                      <a:noFill/>
-                      <a:miter lim="800000"/>
-                      <a:headEnd/>
-                      <a:tailEnd/>
-                    </a:ln>
-                  </pic:spPr>
-                </pic:pic>
-              </a:graphicData>
-            </a:graphic>
-          </wp:inline>
-        </w:drawing>
-      </w:r>
-    </w:p>
-    <w:p>
-      <w:pPr>
-        <w:spacing w:after="0"/>
-        <w:rPr>
-          <w:sz w:val="24"/>
-        </w:rPr>
-      </w:pPr>
-    </w:p>
-    <w:p>
-      <w:pPr>
-        <w:spacing w:after="0"/>
-        <w:rPr>
-          <w:sz w:val="24"/>
-        </w:rPr>
-      </w:pPr>
-    </w:p>
-    <w:p>
-      <w:pPr>
-        <w:spacing w:after="0"/>
-        <w:rPr>
-          <w:sz w:val="24"/>
-        </w:rPr>
-      </w:pPr>
-    </w:p>
-    <w:p>
-      <w:pPr>
-        <w:spacing w:after="0"/>
-        <w:rPr>
-          <w:sz w:val="24"/>
-        </w:rPr>
-      </w:pPr>
-    </w:p>
-    <w:p>
-      <w:pPr>
-        <w:spacing w:after="0"/>
-        <w:rPr>
-          <w:sz w:val="24"/>
-        </w:rPr>
-      </w:pPr>
-    </w:p>
-    <w:p>
-      <w:pPr>
-        <w:spacing w:after="0"/>
-        <w:rPr>
-          <w:sz w:val="24"/>
-        </w:rPr>
-      </w:pPr>
-    </w:p>
-    <w:p>
-      <w:pPr>
-        <w:spacing w:after="0"/>
-        <w:rPr>
-          <w:sz w:val="24"/>
-        </w:rPr>
-      </w:pPr>
-      <w:r>
-        <w:rPr>
-          <w:sz w:val="24"/>
-        </w:rPr>
-        <w:t xml:space="preserve">Create a </w:t>
-      </w:r>
-      <w:r>
-        <w:rPr>
-          <w:sz w:val="24"/>
-        </w:rPr>
-        <w:t xml:space="preserve">Redis sink </w:t>
-      </w:r>
-      <w:r>
-        <w:rPr>
-          <w:sz w:val="24"/>
-        </w:rPr>
-        <w:t>connector</w:t>
+    </w:p>
+    <w:p>
+      <w:pPr>
+        <w:spacing w:after="0"/>
+        <w:rPr>
+          <w:sz w:val="24"/>
+        </w:rPr>
+      </w:pPr>
+    </w:p>
+    <w:p>
+      <w:pPr>
+        <w:spacing w:after="0"/>
+        <w:rPr>
+          <w:sz w:val="24"/>
+        </w:rPr>
+      </w:pPr>
+    </w:p>
+    <w:p>
+      <w:pPr>
+        <w:spacing w:after="0"/>
+        <w:rPr>
+          <w:sz w:val="24"/>
+        </w:rPr>
+      </w:pPr>
+    </w:p>
+    <w:p>
+      <w:pPr>
+        <w:spacing w:after="0"/>
+        <w:rPr>
+          <w:sz w:val="24"/>
+        </w:rPr>
+      </w:pPr>
+    </w:p>
+    <w:p>
+      <w:pPr>
+        <w:spacing w:after="0"/>
+        <w:rPr>
+          <w:sz w:val="24"/>
+        </w:rPr>
+      </w:pPr>
+    </w:p>
+    <w:p>
+      <w:pPr>
+        <w:spacing w:after="0"/>
+        <w:rPr>
+          <w:sz w:val="24"/>
+        </w:rPr>
+      </w:pPr>
+    </w:p>
+    <w:p>
+      <w:pPr>
+        <w:spacing w:after="0"/>
+        <w:rPr>
+          <w:sz w:val="24"/>
+        </w:rPr>
+      </w:pPr>
+      <w:r>
+        <w:rPr>
+          <w:sz w:val="24"/>
+        </w:rPr>
+        <w:lastRenderedPageBreak/>
+        <w:t>Create a Redis sink connector</w:t>
       </w:r>
     </w:p>
     <w:p>
@@ -11793,7 +11706,7 @@
           <wp:inline distT="0" distB="0" distL="0" distR="0">
             <wp:extent cx="5400040" cy="2235068"/>
             <wp:effectExtent l="19050" t="0" r="0" b="0"/>
-            <wp:docPr id="29" name="Imagen 10"/>
+            <wp:docPr id="34" name="Imagen 10"/>
             <wp:cNvGraphicFramePr>
               <a:graphicFrameLocks xmlns:a="http://schemas.openxmlformats.org/drawingml/2006/main" noChangeAspect="1"/>
             </wp:cNvGraphicFramePr>
@@ -11807,7 +11720,7 @@
                     </pic:cNvPicPr>
                   </pic:nvPicPr>
                   <pic:blipFill>
-                    <a:blip r:embed="rId35" cstate="print"/>
+                    <a:blip r:embed="rId34" cstate="print"/>
                     <a:srcRect/>
                     <a:stretch>
                       <a:fillRect/>
@@ -11951,7 +11864,7 @@
           <w:i/>
           <w:sz w:val="16"/>
         </w:rPr>
-        <w:t xml:space="preserve">      "connector.class": "io.github.jaredpetersen.kafkaconnectredis.sink.RedisSinkConnector",</w:t>
+        <w:t xml:space="preserve">      "connector.class": "com.redis.kafka.connect.RedisSinkConnector",</w:t>
       </w:r>
     </w:p>
     <w:p>
@@ -11999,60 +11912,60 @@
           <w:sz w:val="16"/>
         </w:rPr>
       </w:pPr>
-    </w:p>
-    <w:p>
-      <w:pPr>
-        <w:spacing w:after="0"/>
+      <w:r>
         <w:rPr>
           <w:rFonts w:ascii="Courier New" w:hAnsi="Courier New" w:cs="Courier New"/>
           <w:i/>
           <w:sz w:val="16"/>
         </w:rPr>
-      </w:pPr>
+        <w:t xml:space="preserve">      "redis.uri": "redis</w:t>
+      </w:r>
+      <w:proofErr w:type="gramStart"/>
       <w:r>
         <w:rPr>
           <w:rFonts w:ascii="Courier New" w:hAnsi="Courier New" w:cs="Courier New"/>
           <w:i/>
           <w:sz w:val="16"/>
         </w:rPr>
-        <w:t xml:space="preserve">      "redis.uri": "redis</w:t>
-      </w:r>
-      <w:proofErr w:type="gramStart"/>
+        <w:t>:/</w:t>
+      </w:r>
+      <w:proofErr w:type="gramEnd"/>
       <w:r>
         <w:rPr>
           <w:rFonts w:ascii="Courier New" w:hAnsi="Courier New" w:cs="Courier New"/>
           <w:i/>
           <w:sz w:val="16"/>
         </w:rPr>
-        <w:t>:/</w:t>
-      </w:r>
-      <w:proofErr w:type="gramEnd"/>
-      <w:r>
+        <w:t>/redis:6379",</w:t>
+      </w:r>
+    </w:p>
+    <w:p>
+      <w:pPr>
+        <w:spacing w:after="0"/>
         <w:rPr>
           <w:rFonts w:ascii="Courier New" w:hAnsi="Courier New" w:cs="Courier New"/>
           <w:i/>
           <w:sz w:val="16"/>
         </w:rPr>
-        <w:t>/redis:6379",</w:t>
-      </w:r>
-    </w:p>
-    <w:p>
-      <w:pPr>
-        <w:spacing w:after="0"/>
+      </w:pPr>
+      <w:r>
         <w:rPr>
           <w:rFonts w:ascii="Courier New" w:hAnsi="Courier New" w:cs="Courier New"/>
           <w:i/>
           <w:sz w:val="16"/>
         </w:rPr>
-      </w:pPr>
-      <w:r>
+        <w:t xml:space="preserve">      "redis.commands": "HSET",</w:t>
+      </w:r>
+    </w:p>
+    <w:p>
+      <w:pPr>
+        <w:spacing w:after="0"/>
         <w:rPr>
           <w:rFonts w:ascii="Courier New" w:hAnsi="Courier New" w:cs="Courier New"/>
           <w:i/>
           <w:sz w:val="16"/>
         </w:rPr>
-        <w:t xml:space="preserve">      "redis.cluster.enabled": "false",</w:t>
-      </w:r>
+      </w:pPr>
     </w:p>
     <w:p>
       <w:pPr>
@@ -12063,22 +11976,76 @@
           <w:sz w:val="16"/>
         </w:rPr>
       </w:pPr>
-    </w:p>
-    <w:p>
-      <w:pPr>
-        <w:spacing w:after="0"/>
+      <w:r>
         <w:rPr>
           <w:rFonts w:ascii="Courier New" w:hAnsi="Courier New" w:cs="Courier New"/>
           <w:i/>
           <w:sz w:val="16"/>
         </w:rPr>
-      </w:pPr>
-      <w:r>
+        <w:t xml:space="preserve">      "transforms": "extractKey",</w:t>
+      </w:r>
+    </w:p>
+    <w:p>
+      <w:pPr>
+        <w:spacing w:after="0"/>
         <w:rPr>
           <w:rFonts w:ascii="Courier New" w:hAnsi="Courier New" w:cs="Courier New"/>
           <w:i/>
           <w:sz w:val="16"/>
         </w:rPr>
+      </w:pPr>
+      <w:r>
+        <w:rPr>
+          <w:rFonts w:ascii="Courier New" w:hAnsi="Courier New" w:cs="Courier New"/>
+          <w:i/>
+          <w:sz w:val="16"/>
+        </w:rPr>
+        <w:t xml:space="preserve">      "transforms.extractKey.type": "org.apache.kafka.connect.transforms.ValueToKey",</w:t>
+      </w:r>
+    </w:p>
+    <w:p>
+      <w:pPr>
+        <w:spacing w:after="0"/>
+        <w:rPr>
+          <w:rFonts w:ascii="Courier New" w:hAnsi="Courier New" w:cs="Courier New"/>
+          <w:i/>
+          <w:sz w:val="16"/>
+        </w:rPr>
+      </w:pPr>
+      <w:r>
+        <w:rPr>
+          <w:rFonts w:ascii="Courier New" w:hAnsi="Courier New" w:cs="Courier New"/>
+          <w:i/>
+          <w:sz w:val="16"/>
+        </w:rPr>
+        <w:t xml:space="preserve">      "transforms.extractKey.fields": "userId",</w:t>
+      </w:r>
+    </w:p>
+    <w:p>
+      <w:pPr>
+        <w:spacing w:after="0"/>
+        <w:rPr>
+          <w:rFonts w:ascii="Courier New" w:hAnsi="Courier New" w:cs="Courier New"/>
+          <w:i/>
+          <w:sz w:val="16"/>
+        </w:rPr>
+      </w:pPr>
+    </w:p>
+    <w:p>
+      <w:pPr>
+        <w:spacing w:after="0"/>
+        <w:rPr>
+          <w:rFonts w:ascii="Courier New" w:hAnsi="Courier New" w:cs="Courier New"/>
+          <w:i/>
+          <w:sz w:val="16"/>
+        </w:rPr>
+      </w:pPr>
+      <w:r>
+        <w:rPr>
+          <w:rFonts w:ascii="Courier New" w:hAnsi="Courier New" w:cs="Courier New"/>
+          <w:i/>
+          <w:sz w:val="16"/>
+        </w:rPr>
         <w:t xml:space="preserve">      "key.converter": "org.apache.kafka.connect.storage.StringConverter",</w:t>
       </w:r>
     </w:p>
@@ -12097,7 +12064,7 @@
           <w:i/>
           <w:sz w:val="16"/>
         </w:rPr>
-        <w:t xml:space="preserve">      "value.converter": "org.apache.kafka.connect.json.JsonConverter",</w:t>
+        <w:t xml:space="preserve">      "value.converter": "io.confluent.connect.protobuf.ProtobufConverter",</w:t>
       </w:r>
     </w:p>
     <w:p>
@@ -12115,7 +12082,61 @@
           <w:i/>
           <w:sz w:val="16"/>
         </w:rPr>
-        <w:t xml:space="preserve">      "value.converter.schemas.enable": "false"</w:t>
+        <w:t xml:space="preserve">      "value.converter.schema.registry.url": "http://schema-registry:8081",</w:t>
+      </w:r>
+    </w:p>
+    <w:p>
+      <w:pPr>
+        <w:spacing w:after="0"/>
+        <w:rPr>
+          <w:rFonts w:ascii="Courier New" w:hAnsi="Courier New" w:cs="Courier New"/>
+          <w:i/>
+          <w:sz w:val="16"/>
+        </w:rPr>
+      </w:pPr>
+      <w:r>
+        <w:rPr>
+          <w:rFonts w:ascii="Courier New" w:hAnsi="Courier New" w:cs="Courier New"/>
+          <w:i/>
+          <w:sz w:val="16"/>
+        </w:rPr>
+        <w:t xml:space="preserve">      "value.converter.use.latest.version": "true",</w:t>
+      </w:r>
+    </w:p>
+    <w:p>
+      <w:pPr>
+        <w:spacing w:after="0"/>
+        <w:rPr>
+          <w:rFonts w:ascii="Courier New" w:hAnsi="Courier New" w:cs="Courier New"/>
+          <w:i/>
+          <w:sz w:val="16"/>
+        </w:rPr>
+      </w:pPr>
+      <w:r>
+        <w:rPr>
+          <w:rFonts w:ascii="Courier New" w:hAnsi="Courier New" w:cs="Courier New"/>
+          <w:i/>
+          <w:sz w:val="16"/>
+        </w:rPr>
+        <w:t xml:space="preserve">      "value.converter.auto.register.schemas": "false",</w:t>
+      </w:r>
+    </w:p>
+    <w:p>
+      <w:pPr>
+        <w:spacing w:after="0"/>
+        <w:rPr>
+          <w:rFonts w:ascii="Courier New" w:hAnsi="Courier New" w:cs="Courier New"/>
+          <w:i/>
+          <w:sz w:val="16"/>
+        </w:rPr>
+      </w:pPr>
+      <w:r>
+        <w:rPr>
+          <w:rFonts w:ascii="Courier New" w:hAnsi="Courier New" w:cs="Courier New"/>
+          <w:i/>
+          <w:sz w:val="16"/>
+        </w:rPr>
+        <w:t xml:space="preserve">      "value.converter.latest.compatibility.strict": "false"</w:t>
       </w:r>
     </w:p>
     <w:p>
@@ -12177,9 +12198,9 @@
         </w:rPr>
         <w:drawing>
           <wp:inline distT="0" distB="0" distL="0" distR="0">
-            <wp:extent cx="5400040" cy="2728669"/>
+            <wp:extent cx="5400040" cy="2579134"/>
             <wp:effectExtent l="19050" t="0" r="0" b="0"/>
-            <wp:docPr id="30" name="Imagen 13"/>
+            <wp:docPr id="38" name="Imagen 22"/>
             <wp:cNvGraphicFramePr>
               <a:graphicFrameLocks xmlns:a="http://schemas.openxmlformats.org/drawingml/2006/main" noChangeAspect="1"/>
             </wp:cNvGraphicFramePr>
@@ -12187,13 +12208,13 @@
               <a:graphicData uri="http://schemas.openxmlformats.org/drawingml/2006/picture">
                 <pic:pic xmlns:pic="http://schemas.openxmlformats.org/drawingml/2006/picture">
                   <pic:nvPicPr>
-                    <pic:cNvPr id="0" name="Picture 13"/>
+                    <pic:cNvPr id="0" name="Picture 22"/>
                     <pic:cNvPicPr>
                       <a:picLocks noChangeAspect="1" noChangeArrowheads="1"/>
                     </pic:cNvPicPr>
                   </pic:nvPicPr>
                   <pic:blipFill>
-                    <a:blip r:embed="rId36"/>
+                    <a:blip r:embed="rId35"/>
                     <a:srcRect/>
                     <a:stretch>
                       <a:fillRect/>
@@ -12202,7 +12223,7 @@
                   <pic:spPr bwMode="auto">
                     <a:xfrm>
                       <a:off x="0" y="0"/>
-                      <a:ext cx="5400040" cy="2728669"/>
+                      <a:ext cx="5400040" cy="2579134"/>
                     </a:xfrm>
                     <a:prstGeom prst="rect">
                       <a:avLst/>
@@ -12234,44 +12255,27 @@
       <w:pPr>
         <w:spacing w:after="0"/>
         <w:rPr>
-          <w:sz w:val="24"/>
-        </w:rPr>
-      </w:pPr>
-    </w:p>
-    <w:p>
-      <w:pPr>
-        <w:spacing w:after="0"/>
-        <w:rPr>
-          <w:sz w:val="24"/>
-        </w:rPr>
-      </w:pPr>
-    </w:p>
-    <w:p>
-      <w:pPr>
-        <w:spacing w:after="0"/>
-        <w:rPr>
-          <w:sz w:val="24"/>
-        </w:rPr>
-      </w:pPr>
-    </w:p>
-    <w:p>
-      <w:pPr>
-        <w:spacing w:after="0"/>
-        <w:rPr>
-          <w:sz w:val="24"/>
+          <w:rFonts w:ascii="Courier New" w:hAnsi="Courier New" w:cs="Courier New"/>
+          <w:i/>
+          <w:sz w:val="18"/>
         </w:rPr>
       </w:pPr>
       <w:proofErr w:type="gramStart"/>
       <w:r>
         <w:rPr>
-          <w:sz w:val="24"/>
-        </w:rPr>
+          <w:rFonts w:ascii="Courier New" w:hAnsi="Courier New" w:cs="Courier New"/>
+          <w:i/>
+          <w:sz w:val="18"/>
+        </w:rPr>
+        <w:lastRenderedPageBreak/>
         <w:t>curl</w:t>
       </w:r>
       <w:proofErr w:type="gramEnd"/>
       <w:r>
         <w:rPr>
-          <w:sz w:val="24"/>
+          <w:rFonts w:ascii="Courier New" w:hAnsi="Courier New" w:cs="Courier New"/>
+          <w:i/>
+          <w:sz w:val="18"/>
         </w:rPr>
         <w:t xml:space="preserve"> -s http://localhost:8083/connectors/redis-user-updates-sink/status | jq</w:t>
       </w:r>
@@ -12291,130 +12295,1415 @@
           <w:sz w:val="24"/>
         </w:rPr>
       </w:pPr>
-    </w:p>
-    <w:p>
-      <w:pPr>
-        <w:spacing w:after="0"/>
-        <w:rPr>
-          <w:sz w:val="24"/>
-        </w:rPr>
-      </w:pPr>
-    </w:p>
-    <w:p>
-      <w:pPr>
-        <w:spacing w:after="0"/>
-        <w:rPr>
-          <w:sz w:val="24"/>
-        </w:rPr>
-      </w:pPr>
-    </w:p>
-    <w:p>
-      <w:pPr>
-        <w:spacing w:after="0"/>
-        <w:rPr>
-          <w:sz w:val="24"/>
-        </w:rPr>
-      </w:pPr>
-      <w:r>
-        <w:rPr>
-          <w:sz w:val="24"/>
-        </w:rPr>
-        <w:t>Next, log in the redis cluster and list the user hash:</w:t>
-      </w:r>
-    </w:p>
-    <w:p>
-      <w:pPr>
-        <w:spacing w:after="0"/>
-        <w:rPr>
-          <w:sz w:val="24"/>
-        </w:rPr>
-      </w:pPr>
-    </w:p>
-    <w:p>
-      <w:pPr>
-        <w:spacing w:after="0"/>
-      </w:pPr>
-      <w:r>
-        <w:rPr>
-          <w:rStyle w:val="token"/>
-          <w:color w:val="6E7687"/>
-        </w:rPr>
-        <w:t># List all user keys</w:t>
-      </w:r>
-      <w:r>
+      <w:r>
+        <w:rPr>
+          <w:noProof/>
+          <w:sz w:val="24"/>
+          <w:lang w:eastAsia="es-ES"/>
+        </w:rPr>
+        <w:drawing>
+          <wp:inline distT="0" distB="0" distL="0" distR="0">
+            <wp:extent cx="5400040" cy="981586"/>
+            <wp:effectExtent l="19050" t="0" r="0" b="0"/>
+            <wp:docPr id="35" name="Imagen 7"/>
+            <wp:cNvGraphicFramePr>
+              <a:graphicFrameLocks xmlns:a="http://schemas.openxmlformats.org/drawingml/2006/main" noChangeAspect="1"/>
+            </wp:cNvGraphicFramePr>
+            <a:graphic xmlns:a="http://schemas.openxmlformats.org/drawingml/2006/main">
+              <a:graphicData uri="http://schemas.openxmlformats.org/drawingml/2006/picture">
+                <pic:pic xmlns:pic="http://schemas.openxmlformats.org/drawingml/2006/picture">
+                  <pic:nvPicPr>
+                    <pic:cNvPr id="0" name="Picture 7"/>
+                    <pic:cNvPicPr>
+                      <a:picLocks noChangeAspect="1" noChangeArrowheads="1"/>
+                    </pic:cNvPicPr>
+                  </pic:nvPicPr>
+                  <pic:blipFill>
+                    <a:blip r:embed="rId36"/>
+                    <a:srcRect/>
+                    <a:stretch>
+                      <a:fillRect/>
+                    </a:stretch>
+                  </pic:blipFill>
+                  <pic:spPr bwMode="auto">
+                    <a:xfrm>
+                      <a:off x="0" y="0"/>
+                      <a:ext cx="5400040" cy="981586"/>
+                    </a:xfrm>
+                    <a:prstGeom prst="rect">
+                      <a:avLst/>
+                    </a:prstGeom>
+                    <a:noFill/>
+                    <a:ln w="9525">
+                      <a:noFill/>
+                      <a:miter lim="800000"/>
+                      <a:headEnd/>
+                      <a:tailEnd/>
+                    </a:ln>
+                  </pic:spPr>
+                </pic:pic>
+              </a:graphicData>
+            </a:graphic>
+          </wp:inline>
+        </w:drawing>
+      </w:r>
+    </w:p>
+    <w:p>
+      <w:pPr>
+        <w:spacing w:after="0"/>
+        <w:rPr>
+          <w:sz w:val="24"/>
+        </w:rPr>
+      </w:pPr>
+    </w:p>
+    <w:p>
+      <w:pPr>
+        <w:spacing w:after="0"/>
+        <w:rPr>
+          <w:sz w:val="24"/>
+        </w:rPr>
+      </w:pPr>
+      <w:r>
+        <w:rPr>
+          <w:noProof/>
+          <w:sz w:val="24"/>
+          <w:lang w:eastAsia="es-ES"/>
+        </w:rPr>
+        <w:drawing>
+          <wp:inline distT="0" distB="0" distL="0" distR="0">
+            <wp:extent cx="5400040" cy="2751606"/>
+            <wp:effectExtent l="19050" t="0" r="0" b="0"/>
+            <wp:docPr id="36" name="Imagen 10"/>
+            <wp:cNvGraphicFramePr>
+              <a:graphicFrameLocks xmlns:a="http://schemas.openxmlformats.org/drawingml/2006/main" noChangeAspect="1"/>
+            </wp:cNvGraphicFramePr>
+            <a:graphic xmlns:a="http://schemas.openxmlformats.org/drawingml/2006/main">
+              <a:graphicData uri="http://schemas.openxmlformats.org/drawingml/2006/picture">
+                <pic:pic xmlns:pic="http://schemas.openxmlformats.org/drawingml/2006/picture">
+                  <pic:nvPicPr>
+                    <pic:cNvPr id="0" name="Picture 10"/>
+                    <pic:cNvPicPr>
+                      <a:picLocks noChangeAspect="1" noChangeArrowheads="1"/>
+                    </pic:cNvPicPr>
+                  </pic:nvPicPr>
+                  <pic:blipFill>
+                    <a:blip r:embed="rId37"/>
+                    <a:srcRect/>
+                    <a:stretch>
+                      <a:fillRect/>
+                    </a:stretch>
+                  </pic:blipFill>
+                  <pic:spPr bwMode="auto">
+                    <a:xfrm>
+                      <a:off x="0" y="0"/>
+                      <a:ext cx="5400040" cy="2751606"/>
+                    </a:xfrm>
+                    <a:prstGeom prst="rect">
+                      <a:avLst/>
+                    </a:prstGeom>
+                    <a:noFill/>
+                    <a:ln w="9525">
+                      <a:noFill/>
+                      <a:miter lim="800000"/>
+                      <a:headEnd/>
+                      <a:tailEnd/>
+                    </a:ln>
+                  </pic:spPr>
+                </pic:pic>
+              </a:graphicData>
+            </a:graphic>
+          </wp:inline>
+        </w:drawing>
+      </w:r>
+    </w:p>
+    <w:p>
+      <w:pPr>
+        <w:spacing w:after="0"/>
+        <w:rPr>
+          <w:rFonts w:ascii="Courier New" w:hAnsi="Courier New" w:cs="Courier New"/>
+          <w:i/>
+          <w:sz w:val="16"/>
+        </w:rPr>
+      </w:pPr>
+      <w:proofErr w:type="gramStart"/>
+      <w:r>
+        <w:rPr>
+          <w:rFonts w:ascii="Courier New" w:hAnsi="Courier New" w:cs="Courier New"/>
+          <w:i/>
+          <w:sz w:val="16"/>
+        </w:rPr>
+        <w:t>curl</w:t>
+      </w:r>
+      <w:proofErr w:type="gramEnd"/>
+      <w:r>
+        <w:rPr>
+          <w:rFonts w:ascii="Courier New" w:hAnsi="Courier New" w:cs="Courier New"/>
+          <w:i/>
+          <w:sz w:val="16"/>
+        </w:rPr>
+        <w:t xml:space="preserve"> -s http://localhost:8083/connector-plugins | jq '.[].class' | grep -i redis</w:t>
+      </w:r>
+    </w:p>
+    <w:p>
+      <w:pPr>
+        <w:spacing w:after="0"/>
+        <w:rPr>
+          <w:sz w:val="24"/>
+        </w:rPr>
+      </w:pPr>
+    </w:p>
+    <w:p>
+      <w:pPr>
+        <w:spacing w:after="0"/>
+        <w:rPr>
+          <w:sz w:val="24"/>
+        </w:rPr>
+      </w:pPr>
+      <w:r>
+        <w:rPr>
+          <w:noProof/>
+          <w:sz w:val="24"/>
+          <w:lang w:eastAsia="es-ES"/>
+        </w:rPr>
+        <w:drawing>
+          <wp:inline distT="0" distB="0" distL="0" distR="0">
+            <wp:extent cx="5400040" cy="381338"/>
+            <wp:effectExtent l="19050" t="0" r="0" b="0"/>
+            <wp:docPr id="40" name="Imagen 31"/>
+            <wp:cNvGraphicFramePr>
+              <a:graphicFrameLocks xmlns:a="http://schemas.openxmlformats.org/drawingml/2006/main" noChangeAspect="1"/>
+            </wp:cNvGraphicFramePr>
+            <a:graphic xmlns:a="http://schemas.openxmlformats.org/drawingml/2006/main">
+              <a:graphicData uri="http://schemas.openxmlformats.org/drawingml/2006/picture">
+                <pic:pic xmlns:pic="http://schemas.openxmlformats.org/drawingml/2006/picture">
+                  <pic:nvPicPr>
+                    <pic:cNvPr id="0" name="Picture 31"/>
+                    <pic:cNvPicPr>
+                      <a:picLocks noChangeAspect="1" noChangeArrowheads="1"/>
+                    </pic:cNvPicPr>
+                  </pic:nvPicPr>
+                  <pic:blipFill>
+                    <a:blip r:embed="rId38"/>
+                    <a:srcRect/>
+                    <a:stretch>
+                      <a:fillRect/>
+                    </a:stretch>
+                  </pic:blipFill>
+                  <pic:spPr bwMode="auto">
+                    <a:xfrm>
+                      <a:off x="0" y="0"/>
+                      <a:ext cx="5400040" cy="381338"/>
+                    </a:xfrm>
+                    <a:prstGeom prst="rect">
+                      <a:avLst/>
+                    </a:prstGeom>
+                    <a:noFill/>
+                    <a:ln w="9525">
+                      <a:noFill/>
+                      <a:miter lim="800000"/>
+                      <a:headEnd/>
+                      <a:tailEnd/>
+                    </a:ln>
+                  </pic:spPr>
+                </pic:pic>
+              </a:graphicData>
+            </a:graphic>
+          </wp:inline>
+        </w:drawing>
+      </w:r>
+    </w:p>
+    <w:p>
+      <w:pPr>
+        <w:spacing w:before="100" w:beforeAutospacing="1" w:after="100" w:afterAutospacing="1" w:line="240" w:lineRule="auto"/>
+        <w:rPr>
+          <w:rFonts w:ascii="Times New Roman" w:eastAsia="Times New Roman" w:hAnsi="Times New Roman" w:cs="Times New Roman"/>
+          <w:sz w:val="24"/>
+          <w:szCs w:val="24"/>
+          <w:lang w:eastAsia="es-ES"/>
+        </w:rPr>
+      </w:pPr>
+      <w:r>
+        <w:rPr>
+          <w:sz w:val="24"/>
+        </w:rPr>
+        <w:t xml:space="preserve">Redis sink Kafka connector is now up and running. </w:t>
+      </w:r>
+      <w:r>
+        <w:rPr>
+          <w:rFonts w:ascii="Times New Roman" w:eastAsia="Times New Roman" w:hAnsi="Times New Roman" w:cs="Times New Roman"/>
+          <w:sz w:val="24"/>
+          <w:szCs w:val="24"/>
+          <w:lang w:eastAsia="es-ES"/>
+        </w:rPr>
+        <w:t>Redis is a key-value store, not a relational database, so there are no "tables" in the SQL sense. The equivalent in Redis is a</w:t>
+      </w:r>
+      <w:r>
+        <w:rPr>
+          <w:rFonts w:ascii="Times New Roman" w:eastAsia="Times New Roman" w:hAnsi="Times New Roman" w:cs="Times New Roman"/>
+          <w:sz w:val="24"/>
+          <w:szCs w:val="24"/>
+          <w:lang w:eastAsia="es-ES"/>
+        </w:rPr>
+        <w:t xml:space="preserve"> Hash, so you expect to see </w:t>
+      </w:r>
+      <w:r>
+        <w:rPr>
+          <w:rFonts w:ascii="Times New Roman" w:eastAsia="Times New Roman" w:hAnsi="Times New Roman" w:cs="Times New Roman"/>
+          <w:sz w:val="24"/>
+          <w:szCs w:val="24"/>
+          <w:lang w:eastAsia="es-ES"/>
+        </w:rPr>
+        <w:t xml:space="preserve">one hash per user, keyed by </w:t>
+      </w:r>
+      <w:r>
+        <w:rPr>
+          <w:rFonts w:ascii="Courier New" w:eastAsia="Times New Roman" w:hAnsi="Courier New" w:cs="Courier New"/>
+          <w:sz w:val="20"/>
+          <w:lang w:eastAsia="es-ES"/>
+        </w:rPr>
+        <w:t>user_id</w:t>
+      </w:r>
+      <w:r>
+        <w:rPr>
+          <w:rFonts w:ascii="Times New Roman" w:eastAsia="Times New Roman" w:hAnsi="Times New Roman" w:cs="Times New Roman"/>
+          <w:sz w:val="24"/>
+          <w:szCs w:val="24"/>
+          <w:lang w:eastAsia="es-ES"/>
+        </w:rPr>
+        <w:t>, following this structure:</w:t>
+      </w:r>
+    </w:p>
+    <w:p>
+      <w:pPr>
+        <w:tabs>
+          <w:tab w:val="left" w:pos="916"/>
+          <w:tab w:val="left" w:pos="1832"/>
+          <w:tab w:val="left" w:pos="2748"/>
+          <w:tab w:val="left" w:pos="3664"/>
+          <w:tab w:val="left" w:pos="4580"/>
+          <w:tab w:val="left" w:pos="5496"/>
+          <w:tab w:val="left" w:pos="6412"/>
+          <w:tab w:val="left" w:pos="7328"/>
+          <w:tab w:val="left" w:pos="8244"/>
+          <w:tab w:val="left" w:pos="9160"/>
+          <w:tab w:val="left" w:pos="10076"/>
+          <w:tab w:val="left" w:pos="10992"/>
+          <w:tab w:val="left" w:pos="11908"/>
+          <w:tab w:val="left" w:pos="12824"/>
+          <w:tab w:val="left" w:pos="13740"/>
+          <w:tab w:val="left" w:pos="14656"/>
+        </w:tabs>
+        <w:spacing w:after="0" w:line="240" w:lineRule="auto"/>
+        <w:rPr>
+          <w:rFonts w:ascii="var(--font-mono)" w:eastAsia="Times New Roman" w:hAnsi="var(--font-mono)" w:cs="Courier New"/>
+          <w:color w:val="14181F"/>
+          <w:sz w:val="20"/>
+          <w:szCs w:val="20"/>
+          <w:lang w:eastAsia="es-ES"/>
+        </w:rPr>
+      </w:pPr>
+      <w:proofErr w:type="gramStart"/>
+      <w:r>
+        <w:rPr>
+          <w:rFonts w:ascii="var(--font-mono)" w:eastAsia="Times New Roman" w:hAnsi="var(--font-mono)" w:cs="Courier New"/>
+          <w:color w:val="14181F"/>
+          <w:sz w:val="20"/>
+          <w:lang w:eastAsia="es-ES"/>
+        </w:rPr>
+        <w:t>user</w:t>
+      </w:r>
+      <w:proofErr w:type="gramEnd"/>
+      <w:r>
+        <w:rPr>
+          <w:rFonts w:ascii="var(--font-mono)" w:eastAsia="Times New Roman" w:hAnsi="var(--font-mono)" w:cs="Courier New"/>
+          <w:color w:val="14181F"/>
+          <w:sz w:val="20"/>
+          <w:lang w:eastAsia="es-ES"/>
+        </w:rPr>
+        <w:t>:{user_id}  →  Hash { user_id, name, last_name }</w:t>
+      </w:r>
+    </w:p>
+    <w:p>
+      <w:pPr>
+        <w:spacing w:before="100" w:beforeAutospacing="1" w:after="100" w:afterAutospacing="1" w:line="240" w:lineRule="auto"/>
+        <w:rPr>
+          <w:rFonts w:ascii="Times New Roman" w:eastAsia="Times New Roman" w:hAnsi="Times New Roman" w:cs="Times New Roman"/>
+          <w:sz w:val="24"/>
+          <w:szCs w:val="24"/>
+          <w:lang w:eastAsia="es-ES"/>
+        </w:rPr>
+      </w:pPr>
+      <w:r>
+        <w:rPr>
+          <w:rFonts w:ascii="Times New Roman" w:eastAsia="Times New Roman" w:hAnsi="Times New Roman" w:cs="Times New Roman"/>
+          <w:sz w:val="24"/>
+          <w:szCs w:val="24"/>
+          <w:lang w:eastAsia="es-ES"/>
+        </w:rPr>
+        <w:t>Verify the redis keys created by the connector:</w:t>
+      </w:r>
+    </w:p>
+    <w:p>
+      <w:pPr>
+        <w:spacing w:before="100" w:beforeAutospacing="1" w:after="100" w:afterAutospacing="1" w:line="240" w:lineRule="auto"/>
+        <w:rPr>
+          <w:rFonts w:ascii="Courier New" w:eastAsia="Times New Roman" w:hAnsi="Courier New" w:cs="Courier New"/>
+          <w:i/>
+          <w:sz w:val="16"/>
+          <w:szCs w:val="24"/>
+          <w:lang w:eastAsia="es-ES"/>
+        </w:rPr>
+      </w:pPr>
+      <w:proofErr w:type="gramStart"/>
+      <w:r>
+        <w:rPr>
+          <w:rFonts w:ascii="Courier New" w:eastAsia="Times New Roman" w:hAnsi="Courier New" w:cs="Courier New"/>
+          <w:i/>
+          <w:sz w:val="16"/>
+          <w:szCs w:val="24"/>
+          <w:lang w:eastAsia="es-ES"/>
+        </w:rPr>
+        <w:t>docker</w:t>
+      </w:r>
+      <w:proofErr w:type="gramEnd"/>
+      <w:r>
+        <w:rPr>
+          <w:rFonts w:ascii="Courier New" w:eastAsia="Times New Roman" w:hAnsi="Courier New" w:cs="Courier New"/>
+          <w:i/>
+          <w:sz w:val="16"/>
+          <w:szCs w:val="24"/>
+          <w:lang w:eastAsia="es-ES"/>
+        </w:rPr>
+        <w:t xml:space="preserve"> exec -it redis redis-cli --scan | head -20</w:t>
+      </w:r>
+    </w:p>
+    <w:p>
+      <w:pPr>
+        <w:spacing w:before="100" w:beforeAutospacing="1" w:after="100" w:afterAutospacing="1" w:line="240" w:lineRule="auto"/>
+        <w:rPr>
+          <w:rFonts w:ascii="Times New Roman" w:eastAsia="Times New Roman" w:hAnsi="Times New Roman" w:cs="Times New Roman"/>
+          <w:sz w:val="24"/>
+          <w:szCs w:val="24"/>
+          <w:lang w:eastAsia="es-ES"/>
+        </w:rPr>
+      </w:pPr>
+      <w:r>
+        <w:rPr>
+          <w:rFonts w:ascii="Times New Roman" w:eastAsia="Times New Roman" w:hAnsi="Times New Roman" w:cs="Times New Roman"/>
+          <w:noProof/>
+          <w:sz w:val="24"/>
+          <w:szCs w:val="24"/>
+          <w:lang w:eastAsia="es-ES"/>
+        </w:rPr>
+        <w:drawing>
+          <wp:inline distT="0" distB="0" distL="0" distR="0">
+            <wp:extent cx="5400040" cy="255914"/>
+            <wp:effectExtent l="19050" t="0" r="0" b="0"/>
+            <wp:docPr id="42" name="Imagen 35"/>
+            <wp:cNvGraphicFramePr>
+              <a:graphicFrameLocks xmlns:a="http://schemas.openxmlformats.org/drawingml/2006/main" noChangeAspect="1"/>
+            </wp:cNvGraphicFramePr>
+            <a:graphic xmlns:a="http://schemas.openxmlformats.org/drawingml/2006/main">
+              <a:graphicData uri="http://schemas.openxmlformats.org/drawingml/2006/picture">
+                <pic:pic xmlns:pic="http://schemas.openxmlformats.org/drawingml/2006/picture">
+                  <pic:nvPicPr>
+                    <pic:cNvPr id="0" name="Picture 35"/>
+                    <pic:cNvPicPr>
+                      <a:picLocks noChangeAspect="1" noChangeArrowheads="1"/>
+                    </pic:cNvPicPr>
+                  </pic:nvPicPr>
+                  <pic:blipFill>
+                    <a:blip r:embed="rId39"/>
+                    <a:srcRect/>
+                    <a:stretch>
+                      <a:fillRect/>
+                    </a:stretch>
+                  </pic:blipFill>
+                  <pic:spPr bwMode="auto">
+                    <a:xfrm>
+                      <a:off x="0" y="0"/>
+                      <a:ext cx="5400040" cy="255914"/>
+                    </a:xfrm>
+                    <a:prstGeom prst="rect">
+                      <a:avLst/>
+                    </a:prstGeom>
+                    <a:noFill/>
+                    <a:ln w="9525">
+                      <a:noFill/>
+                      <a:miter lim="800000"/>
+                      <a:headEnd/>
+                      <a:tailEnd/>
+                    </a:ln>
+                  </pic:spPr>
+                </pic:pic>
+              </a:graphicData>
+            </a:graphic>
+          </wp:inline>
+        </w:drawing>
+      </w:r>
+    </w:p>
+    <w:p>
+      <w:pPr>
+        <w:spacing w:before="100" w:beforeAutospacing="1" w:after="100" w:afterAutospacing="1" w:line="240" w:lineRule="auto"/>
+        <w:rPr>
+          <w:rFonts w:ascii="Times New Roman" w:eastAsia="Times New Roman" w:hAnsi="Times New Roman" w:cs="Times New Roman"/>
+          <w:sz w:val="24"/>
+          <w:szCs w:val="24"/>
+          <w:lang w:eastAsia="es-ES"/>
+        </w:rPr>
+      </w:pPr>
+    </w:p>
+    <w:p>
+      <w:pPr>
+        <w:spacing w:before="100" w:beforeAutospacing="1" w:after="100" w:afterAutospacing="1" w:line="240" w:lineRule="auto"/>
+        <w:rPr>
+          <w:rFonts w:ascii="Times New Roman" w:eastAsia="Times New Roman" w:hAnsi="Times New Roman" w:cs="Times New Roman"/>
+          <w:sz w:val="24"/>
+          <w:szCs w:val="24"/>
+          <w:lang w:eastAsia="es-ES"/>
+        </w:rPr>
+      </w:pPr>
+      <w:r>
+        <w:rPr>
+          <w:rFonts w:ascii="Times New Roman" w:eastAsia="Times New Roman" w:hAnsi="Times New Roman" w:cs="Times New Roman"/>
+          <w:sz w:val="24"/>
+          <w:szCs w:val="24"/>
+          <w:lang w:eastAsia="es-ES"/>
+        </w:rPr>
+        <w:t xml:space="preserve">Redis </w:t>
+      </w:r>
+      <w:r>
+        <w:rPr>
+          <w:rFonts w:ascii="Times New Roman" w:eastAsia="Times New Roman" w:hAnsi="Times New Roman" w:cs="Times New Roman"/>
+          <w:sz w:val="24"/>
+          <w:szCs w:val="24"/>
+          <w:lang w:eastAsia="es-ES"/>
+        </w:rPr>
+        <w:t>has received the data in the above keys:</w:t>
+      </w:r>
+    </w:p>
+    <w:p>
+      <w:pPr>
+        <w:pStyle w:val="Prrafodelista"/>
+        <w:numPr>
+          <w:ilvl w:val="0"/>
+          <w:numId w:val="2"/>
+        </w:numPr>
+        <w:spacing w:before="100" w:beforeAutospacing="1" w:after="100" w:afterAutospacing="1" w:line="240" w:lineRule="auto"/>
+        <w:rPr>
+          <w:rFonts w:ascii="Times New Roman" w:eastAsia="Times New Roman" w:hAnsi="Times New Roman" w:cs="Times New Roman"/>
+          <w:sz w:val="24"/>
+          <w:szCs w:val="24"/>
+          <w:lang w:eastAsia="es-ES"/>
+        </w:rPr>
+      </w:pPr>
+      <w:r>
+        <w:rPr>
+          <w:rFonts w:ascii="Courier New" w:eastAsia="Times New Roman" w:hAnsi="Courier New" w:cs="Courier New"/>
+          <w:sz w:val="20"/>
+          <w:lang w:eastAsia="es-ES"/>
+        </w:rPr>
+        <w:t>com.redis.kafka.connect.sink.offset.user-updates-value.0</w:t>
+      </w:r>
+      <w:r>
+        <w:rPr>
+          <w:rFonts w:ascii="Times New Roman" w:eastAsia="Times New Roman" w:hAnsi="Times New Roman" w:cs="Times New Roman"/>
+          <w:sz w:val="24"/>
+          <w:szCs w:val="24"/>
+          <w:lang w:eastAsia="es-ES"/>
+        </w:rPr>
+        <w:t xml:space="preserve"> contains offset tracking.</w:t>
+      </w:r>
+    </w:p>
+    <w:p>
+      <w:pPr>
+        <w:pStyle w:val="Prrafodelista"/>
+        <w:numPr>
+          <w:ilvl w:val="0"/>
+          <w:numId w:val="2"/>
+        </w:numPr>
+        <w:spacing w:before="100" w:beforeAutospacing="1" w:after="100" w:afterAutospacing="1" w:line="240" w:lineRule="auto"/>
+        <w:rPr>
+          <w:rFonts w:ascii="Times New Roman" w:eastAsia="Times New Roman" w:hAnsi="Times New Roman" w:cs="Times New Roman"/>
+          <w:sz w:val="24"/>
+          <w:szCs w:val="24"/>
+          <w:lang w:eastAsia="es-ES"/>
+        </w:rPr>
+      </w:pPr>
+      <w:r>
+        <w:rPr>
+          <w:rFonts w:ascii="Courier New" w:eastAsia="Times New Roman" w:hAnsi="Courier New" w:cs="Courier New"/>
+          <w:sz w:val="20"/>
+          <w:lang w:eastAsia="es-ES"/>
+        </w:rPr>
+        <w:t xml:space="preserve"> user-updates-valu</w:t>
+      </w:r>
+      <w:r>
+        <w:rPr>
+          <w:rFonts w:ascii="Times New Roman" w:eastAsia="Times New Roman" w:hAnsi="Times New Roman" w:cs="Times New Roman"/>
+          <w:sz w:val="24"/>
+          <w:szCs w:val="24"/>
+          <w:lang w:eastAsia="es-ES"/>
+        </w:rPr>
+        <w:t>e contains our messages.</w:t>
+      </w:r>
+    </w:p>
+    <w:p>
+      <w:pPr>
+        <w:spacing w:before="100" w:beforeAutospacing="1" w:after="100" w:afterAutospacing="1" w:line="240" w:lineRule="auto"/>
+        <w:rPr>
+          <w:rFonts w:ascii="Times New Roman" w:eastAsia="Times New Roman" w:hAnsi="Times New Roman" w:cs="Times New Roman"/>
+          <w:sz w:val="24"/>
+          <w:szCs w:val="24"/>
+          <w:lang w:eastAsia="es-ES"/>
+        </w:rPr>
+      </w:pPr>
+      <w:r>
+        <w:rPr>
+          <w:rFonts w:ascii="Times New Roman" w:eastAsia="Times New Roman" w:hAnsi="Times New Roman" w:cs="Times New Roman"/>
+          <w:sz w:val="24"/>
+          <w:szCs w:val="24"/>
+          <w:lang w:eastAsia="es-ES"/>
+        </w:rPr>
+        <w:lastRenderedPageBreak/>
+        <w:t>Let’s identify what kind of key and value we have in the stream</w:t>
+      </w:r>
+    </w:p>
+    <w:p>
+      <w:pPr>
+        <w:tabs>
+          <w:tab w:val="left" w:pos="916"/>
+          <w:tab w:val="left" w:pos="1832"/>
+          <w:tab w:val="left" w:pos="2748"/>
+          <w:tab w:val="left" w:pos="3664"/>
+          <w:tab w:val="left" w:pos="4580"/>
+          <w:tab w:val="left" w:pos="5496"/>
+          <w:tab w:val="left" w:pos="6412"/>
+          <w:tab w:val="left" w:pos="7328"/>
+          <w:tab w:val="left" w:pos="8244"/>
+          <w:tab w:val="left" w:pos="9160"/>
+          <w:tab w:val="left" w:pos="10076"/>
+          <w:tab w:val="left" w:pos="10992"/>
+          <w:tab w:val="left" w:pos="11908"/>
+          <w:tab w:val="left" w:pos="12824"/>
+          <w:tab w:val="left" w:pos="13740"/>
+          <w:tab w:val="left" w:pos="14656"/>
+        </w:tabs>
+        <w:spacing w:after="0" w:line="240" w:lineRule="auto"/>
+        <w:rPr>
+          <w:rFonts w:ascii="var(--font-mono)" w:eastAsia="Times New Roman" w:hAnsi="var(--font-mono)" w:cs="Courier New"/>
+          <w:color w:val="14181F"/>
+          <w:sz w:val="20"/>
+          <w:lang w:eastAsia="es-ES"/>
+        </w:rPr>
+      </w:pPr>
+      <w:proofErr w:type="gramStart"/>
+      <w:r>
+        <w:rPr>
+          <w:rFonts w:ascii="var(--font-mono)" w:eastAsia="Times New Roman" w:hAnsi="var(--font-mono)" w:cs="Courier New"/>
+          <w:color w:val="0051C2"/>
+          <w:sz w:val="20"/>
+          <w:szCs w:val="20"/>
+          <w:lang w:eastAsia="es-ES"/>
+        </w:rPr>
+        <w:t>docker</w:t>
+      </w:r>
+      <w:proofErr w:type="gramEnd"/>
+      <w:r>
+        <w:rPr>
+          <w:rFonts w:ascii="var(--font-mono)" w:eastAsia="Times New Roman" w:hAnsi="var(--font-mono)" w:cs="Courier New"/>
+          <w:color w:val="14181F"/>
+          <w:sz w:val="20"/>
+          <w:lang w:eastAsia="es-ES"/>
+        </w:rPr>
         <w:t xml:space="preserve"> </w:t>
       </w:r>
-    </w:p>
-    <w:p>
-      <w:pPr>
-        <w:spacing w:after="0"/>
+      <w:r>
+        <w:rPr>
+          <w:rFonts w:ascii="var(--font-mono)" w:eastAsia="Times New Roman" w:hAnsi="var(--font-mono)" w:cs="Courier New"/>
+          <w:color w:val="B34A00"/>
+          <w:sz w:val="20"/>
+          <w:szCs w:val="20"/>
+          <w:lang w:eastAsia="es-ES"/>
+        </w:rPr>
+        <w:t>exec</w:t>
+      </w:r>
+      <w:r>
+        <w:rPr>
+          <w:rFonts w:ascii="var(--font-mono)" w:eastAsia="Times New Roman" w:hAnsi="var(--font-mono)" w:cs="Courier New"/>
+          <w:color w:val="14181F"/>
+          <w:sz w:val="20"/>
+          <w:lang w:eastAsia="es-ES"/>
+        </w:rPr>
+        <w:t xml:space="preserve"> -it redis redis-cli TYPE </w:t>
+      </w:r>
+      <w:r>
+        <w:rPr>
+          <w:rFonts w:ascii="var(--font-mono)" w:eastAsia="Times New Roman" w:hAnsi="var(--font-mono)" w:cs="Courier New"/>
+          <w:color w:val="008000"/>
+          <w:sz w:val="20"/>
+          <w:szCs w:val="20"/>
+          <w:lang w:eastAsia="es-ES"/>
+        </w:rPr>
+        <w:t>"user-updates-value"</w:t>
+      </w:r>
+    </w:p>
+    <w:p>
+      <w:pPr>
+        <w:tabs>
+          <w:tab w:val="left" w:pos="916"/>
+          <w:tab w:val="left" w:pos="1832"/>
+          <w:tab w:val="left" w:pos="2748"/>
+          <w:tab w:val="left" w:pos="3664"/>
+          <w:tab w:val="left" w:pos="4580"/>
+          <w:tab w:val="left" w:pos="5496"/>
+          <w:tab w:val="left" w:pos="6412"/>
+          <w:tab w:val="left" w:pos="7328"/>
+          <w:tab w:val="left" w:pos="8244"/>
+          <w:tab w:val="left" w:pos="9160"/>
+          <w:tab w:val="left" w:pos="10076"/>
+          <w:tab w:val="left" w:pos="10992"/>
+          <w:tab w:val="left" w:pos="11908"/>
+          <w:tab w:val="left" w:pos="12824"/>
+          <w:tab w:val="left" w:pos="13740"/>
+          <w:tab w:val="left" w:pos="14656"/>
+        </w:tabs>
+        <w:spacing w:after="0" w:line="240" w:lineRule="auto"/>
+        <w:rPr>
+          <w:rFonts w:ascii="var(--font-mono)" w:eastAsia="Times New Roman" w:hAnsi="var(--font-mono)" w:cs="Courier New"/>
+          <w:color w:val="14181F"/>
+          <w:sz w:val="20"/>
+          <w:lang w:eastAsia="es-ES"/>
+        </w:rPr>
+      </w:pPr>
+    </w:p>
+    <w:p>
+      <w:pPr>
+        <w:tabs>
+          <w:tab w:val="left" w:pos="916"/>
+          <w:tab w:val="left" w:pos="1832"/>
+          <w:tab w:val="left" w:pos="2748"/>
+          <w:tab w:val="left" w:pos="3664"/>
+          <w:tab w:val="left" w:pos="4580"/>
+          <w:tab w:val="left" w:pos="5496"/>
+          <w:tab w:val="left" w:pos="6412"/>
+          <w:tab w:val="left" w:pos="7328"/>
+          <w:tab w:val="left" w:pos="8244"/>
+          <w:tab w:val="left" w:pos="9160"/>
+          <w:tab w:val="left" w:pos="10076"/>
+          <w:tab w:val="left" w:pos="10992"/>
+          <w:tab w:val="left" w:pos="11908"/>
+          <w:tab w:val="left" w:pos="12824"/>
+          <w:tab w:val="left" w:pos="13740"/>
+          <w:tab w:val="left" w:pos="14656"/>
+        </w:tabs>
+        <w:spacing w:after="0" w:line="240" w:lineRule="auto"/>
+        <w:rPr>
+          <w:rFonts w:ascii="var(--font-mono)" w:eastAsia="Times New Roman" w:hAnsi="var(--font-mono)" w:cs="Courier New"/>
+          <w:color w:val="14181F"/>
+          <w:sz w:val="20"/>
+          <w:lang w:eastAsia="es-ES"/>
+        </w:rPr>
+      </w:pPr>
+      <w:r>
+        <w:rPr>
+          <w:rFonts w:ascii="var(--font-mono)" w:eastAsia="Times New Roman" w:hAnsi="var(--font-mono)" w:cs="Courier New"/>
+          <w:color w:val="14181F"/>
+          <w:sz w:val="20"/>
+          <w:lang w:eastAsia="es-ES"/>
+        </w:rPr>
+        <w:t>It says it is stream.</w:t>
+      </w:r>
+    </w:p>
+    <w:p>
+      <w:pPr>
+        <w:tabs>
+          <w:tab w:val="left" w:pos="916"/>
+          <w:tab w:val="left" w:pos="1832"/>
+          <w:tab w:val="left" w:pos="2748"/>
+          <w:tab w:val="left" w:pos="3664"/>
+          <w:tab w:val="left" w:pos="4580"/>
+          <w:tab w:val="left" w:pos="5496"/>
+          <w:tab w:val="left" w:pos="6412"/>
+          <w:tab w:val="left" w:pos="7328"/>
+          <w:tab w:val="left" w:pos="8244"/>
+          <w:tab w:val="left" w:pos="9160"/>
+          <w:tab w:val="left" w:pos="10076"/>
+          <w:tab w:val="left" w:pos="10992"/>
+          <w:tab w:val="left" w:pos="11908"/>
+          <w:tab w:val="left" w:pos="12824"/>
+          <w:tab w:val="left" w:pos="13740"/>
+          <w:tab w:val="left" w:pos="14656"/>
+        </w:tabs>
+        <w:spacing w:after="0" w:line="240" w:lineRule="auto"/>
+        <w:rPr>
+          <w:rFonts w:ascii="var(--font-mono)" w:eastAsia="Times New Roman" w:hAnsi="var(--font-mono)" w:cs="Courier New"/>
+          <w:color w:val="14181F"/>
+          <w:sz w:val="20"/>
+          <w:lang w:eastAsia="es-ES"/>
+        </w:rPr>
+      </w:pPr>
+    </w:p>
+    <w:p>
+      <w:pPr>
+        <w:tabs>
+          <w:tab w:val="left" w:pos="916"/>
+          <w:tab w:val="left" w:pos="1832"/>
+          <w:tab w:val="left" w:pos="2748"/>
+          <w:tab w:val="left" w:pos="3664"/>
+          <w:tab w:val="left" w:pos="4580"/>
+          <w:tab w:val="left" w:pos="5496"/>
+          <w:tab w:val="left" w:pos="6412"/>
+          <w:tab w:val="left" w:pos="7328"/>
+          <w:tab w:val="left" w:pos="8244"/>
+          <w:tab w:val="left" w:pos="9160"/>
+          <w:tab w:val="left" w:pos="10076"/>
+          <w:tab w:val="left" w:pos="10992"/>
+          <w:tab w:val="left" w:pos="11908"/>
+          <w:tab w:val="left" w:pos="12824"/>
+          <w:tab w:val="left" w:pos="13740"/>
+          <w:tab w:val="left" w:pos="14656"/>
+        </w:tabs>
+        <w:spacing w:after="0" w:line="240" w:lineRule="auto"/>
+        <w:rPr>
+          <w:rFonts w:ascii="var(--font-mono)" w:eastAsia="Times New Roman" w:hAnsi="var(--font-mono)" w:cs="Courier New"/>
+          <w:color w:val="14181F"/>
+          <w:sz w:val="20"/>
+          <w:lang w:eastAsia="es-ES"/>
+        </w:rPr>
+      </w:pPr>
+      <w:r>
+        <w:rPr>
+          <w:rFonts w:ascii="var(--font-mono)" w:eastAsia="Times New Roman" w:hAnsi="var(--font-mono)" w:cs="Courier New"/>
+          <w:color w:val="14181F"/>
+          <w:sz w:val="20"/>
+          <w:lang w:eastAsia="es-ES"/>
+        </w:rPr>
+        <w:t>If it was string we would use this command:</w:t>
+      </w:r>
+    </w:p>
+    <w:p>
+      <w:pPr>
+        <w:tabs>
+          <w:tab w:val="left" w:pos="916"/>
+          <w:tab w:val="left" w:pos="1832"/>
+          <w:tab w:val="left" w:pos="2748"/>
+          <w:tab w:val="left" w:pos="3664"/>
+          <w:tab w:val="left" w:pos="4580"/>
+          <w:tab w:val="left" w:pos="5496"/>
+          <w:tab w:val="left" w:pos="6412"/>
+          <w:tab w:val="left" w:pos="7328"/>
+          <w:tab w:val="left" w:pos="8244"/>
+          <w:tab w:val="left" w:pos="9160"/>
+          <w:tab w:val="left" w:pos="10076"/>
+          <w:tab w:val="left" w:pos="10992"/>
+          <w:tab w:val="left" w:pos="11908"/>
+          <w:tab w:val="left" w:pos="12824"/>
+          <w:tab w:val="left" w:pos="13740"/>
+          <w:tab w:val="left" w:pos="14656"/>
+        </w:tabs>
+        <w:spacing w:after="0" w:line="240" w:lineRule="auto"/>
+        <w:rPr>
+          <w:rFonts w:ascii="var(--font-mono)" w:eastAsia="Times New Roman" w:hAnsi="var(--font-mono)" w:cs="Courier New"/>
+          <w:color w:val="0051C2"/>
+          <w:sz w:val="20"/>
+          <w:szCs w:val="20"/>
+          <w:lang w:eastAsia="es-ES"/>
+        </w:rPr>
+      </w:pPr>
+    </w:p>
+    <w:p>
+      <w:pPr>
+        <w:tabs>
+          <w:tab w:val="left" w:pos="916"/>
+          <w:tab w:val="left" w:pos="1832"/>
+          <w:tab w:val="left" w:pos="2748"/>
+          <w:tab w:val="left" w:pos="3664"/>
+          <w:tab w:val="left" w:pos="4580"/>
+          <w:tab w:val="left" w:pos="5496"/>
+          <w:tab w:val="left" w:pos="6412"/>
+          <w:tab w:val="left" w:pos="7328"/>
+          <w:tab w:val="left" w:pos="8244"/>
+          <w:tab w:val="left" w:pos="9160"/>
+          <w:tab w:val="left" w:pos="10076"/>
+          <w:tab w:val="left" w:pos="10992"/>
+          <w:tab w:val="left" w:pos="11908"/>
+          <w:tab w:val="left" w:pos="12824"/>
+          <w:tab w:val="left" w:pos="13740"/>
+          <w:tab w:val="left" w:pos="14656"/>
+        </w:tabs>
+        <w:spacing w:after="0" w:line="240" w:lineRule="auto"/>
+        <w:rPr>
+          <w:rFonts w:ascii="var(--font-mono)" w:eastAsia="Times New Roman" w:hAnsi="var(--font-mono)" w:cs="Courier New"/>
+          <w:color w:val="14181F"/>
+          <w:sz w:val="20"/>
+          <w:lang w:eastAsia="es-ES"/>
+        </w:rPr>
       </w:pPr>
       <w:proofErr w:type="gramStart"/>
       <w:r>
-        <w:t>redis-cli</w:t>
+        <w:rPr>
+          <w:rFonts w:ascii="var(--font-mono)" w:eastAsia="Times New Roman" w:hAnsi="var(--font-mono)" w:cs="Courier New"/>
+          <w:color w:val="0051C2"/>
+          <w:sz w:val="20"/>
+          <w:szCs w:val="20"/>
+          <w:lang w:eastAsia="es-ES"/>
+        </w:rPr>
+        <w:t>docker</w:t>
       </w:r>
       <w:proofErr w:type="gramEnd"/>
       <w:r>
-        <w:t xml:space="preserve"> -h localhost -p </w:t>
-      </w:r>
-      <w:r>
-        <w:rPr>
-          <w:rStyle w:val="token"/>
-          <w:color w:val="008080"/>
-        </w:rPr>
-        <w:t>6379</w:t>
-      </w:r>
-      <w:r>
-        <w:t xml:space="preserve"> KEYS </w:t>
-      </w:r>
-      <w:r>
-        <w:rPr>
-          <w:rStyle w:val="token"/>
+        <w:rPr>
+          <w:rFonts w:ascii="var(--font-mono)" w:eastAsia="Times New Roman" w:hAnsi="var(--font-mono)" w:cs="Courier New"/>
+          <w:color w:val="14181F"/>
+          <w:sz w:val="20"/>
+          <w:lang w:eastAsia="es-ES"/>
+        </w:rPr>
+        <w:t xml:space="preserve"> </w:t>
+      </w:r>
+      <w:r>
+        <w:rPr>
+          <w:rFonts w:ascii="var(--font-mono)" w:eastAsia="Times New Roman" w:hAnsi="var(--font-mono)" w:cs="Courier New"/>
+          <w:color w:val="B34A00"/>
+          <w:sz w:val="20"/>
+          <w:szCs w:val="20"/>
+          <w:lang w:eastAsia="es-ES"/>
+        </w:rPr>
+        <w:t>exec</w:t>
+      </w:r>
+      <w:r>
+        <w:rPr>
+          <w:rFonts w:ascii="var(--font-mono)" w:eastAsia="Times New Roman" w:hAnsi="var(--font-mono)" w:cs="Courier New"/>
+          <w:color w:val="14181F"/>
+          <w:sz w:val="20"/>
+          <w:lang w:eastAsia="es-ES"/>
+        </w:rPr>
+        <w:t xml:space="preserve"> -it redis redis-cli GET </w:t>
+      </w:r>
+      <w:r>
+        <w:rPr>
+          <w:rFonts w:ascii="var(--font-mono)" w:eastAsia="Times New Roman" w:hAnsi="var(--font-mono)" w:cs="Courier New"/>
           <w:color w:val="008000"/>
-        </w:rPr>
-        <w:t>"user:*"</w:t>
-      </w:r>
-      <w:r>
+          <w:sz w:val="20"/>
+          <w:szCs w:val="20"/>
+          <w:lang w:eastAsia="es-ES"/>
+        </w:rPr>
+        <w:t>"user-updates-value"</w:t>
+      </w:r>
+    </w:p>
+    <w:p>
+      <w:pPr>
+        <w:tabs>
+          <w:tab w:val="left" w:pos="916"/>
+          <w:tab w:val="left" w:pos="1832"/>
+          <w:tab w:val="left" w:pos="2748"/>
+          <w:tab w:val="left" w:pos="3664"/>
+          <w:tab w:val="left" w:pos="4580"/>
+          <w:tab w:val="left" w:pos="5496"/>
+          <w:tab w:val="left" w:pos="6412"/>
+          <w:tab w:val="left" w:pos="7328"/>
+          <w:tab w:val="left" w:pos="8244"/>
+          <w:tab w:val="left" w:pos="9160"/>
+          <w:tab w:val="left" w:pos="10076"/>
+          <w:tab w:val="left" w:pos="10992"/>
+          <w:tab w:val="left" w:pos="11908"/>
+          <w:tab w:val="left" w:pos="12824"/>
+          <w:tab w:val="left" w:pos="13740"/>
+          <w:tab w:val="left" w:pos="14656"/>
+        </w:tabs>
+        <w:spacing w:after="0" w:line="240" w:lineRule="auto"/>
+        <w:rPr>
+          <w:rFonts w:ascii="var(--font-mono)" w:eastAsia="Times New Roman" w:hAnsi="var(--font-mono)" w:cs="Courier New"/>
+          <w:color w:val="14181F"/>
+          <w:sz w:val="20"/>
+          <w:lang w:eastAsia="es-ES"/>
+        </w:rPr>
+      </w:pPr>
+    </w:p>
+    <w:p>
+      <w:pPr>
+        <w:tabs>
+          <w:tab w:val="left" w:pos="916"/>
+          <w:tab w:val="left" w:pos="1832"/>
+          <w:tab w:val="left" w:pos="2748"/>
+          <w:tab w:val="left" w:pos="3664"/>
+          <w:tab w:val="left" w:pos="4580"/>
+          <w:tab w:val="left" w:pos="5496"/>
+          <w:tab w:val="left" w:pos="6412"/>
+          <w:tab w:val="left" w:pos="7328"/>
+          <w:tab w:val="left" w:pos="8244"/>
+          <w:tab w:val="left" w:pos="9160"/>
+          <w:tab w:val="left" w:pos="10076"/>
+          <w:tab w:val="left" w:pos="10992"/>
+          <w:tab w:val="left" w:pos="11908"/>
+          <w:tab w:val="left" w:pos="12824"/>
+          <w:tab w:val="left" w:pos="13740"/>
+          <w:tab w:val="left" w:pos="14656"/>
+        </w:tabs>
+        <w:spacing w:after="0" w:line="240" w:lineRule="auto"/>
+        <w:rPr>
+          <w:rFonts w:ascii="var(--font-mono)" w:eastAsia="Times New Roman" w:hAnsi="var(--font-mono)" w:cs="Courier New"/>
+          <w:color w:val="14181F"/>
+          <w:sz w:val="20"/>
+          <w:lang w:eastAsia="es-ES"/>
+        </w:rPr>
+      </w:pPr>
+      <w:r>
+        <w:rPr>
+          <w:rFonts w:ascii="var(--font-mono)" w:eastAsia="Times New Roman" w:hAnsi="var(--font-mono)" w:cs="Courier New"/>
+          <w:color w:val="14181F"/>
+          <w:sz w:val="20"/>
+          <w:lang w:eastAsia="es-ES"/>
+        </w:rPr>
+        <w:t>If it was hash we would use this command:</w:t>
+      </w:r>
+    </w:p>
+    <w:p>
+      <w:pPr>
+        <w:tabs>
+          <w:tab w:val="left" w:pos="916"/>
+          <w:tab w:val="left" w:pos="1832"/>
+          <w:tab w:val="left" w:pos="2748"/>
+          <w:tab w:val="left" w:pos="3664"/>
+          <w:tab w:val="left" w:pos="4580"/>
+          <w:tab w:val="left" w:pos="5496"/>
+          <w:tab w:val="left" w:pos="6412"/>
+          <w:tab w:val="left" w:pos="7328"/>
+          <w:tab w:val="left" w:pos="8244"/>
+          <w:tab w:val="left" w:pos="9160"/>
+          <w:tab w:val="left" w:pos="10076"/>
+          <w:tab w:val="left" w:pos="10992"/>
+          <w:tab w:val="left" w:pos="11908"/>
+          <w:tab w:val="left" w:pos="12824"/>
+          <w:tab w:val="left" w:pos="13740"/>
+          <w:tab w:val="left" w:pos="14656"/>
+        </w:tabs>
+        <w:spacing w:after="0" w:line="240" w:lineRule="auto"/>
+        <w:rPr>
+          <w:rFonts w:ascii="var(--font-mono)" w:eastAsia="Times New Roman" w:hAnsi="var(--font-mono)" w:cs="Courier New"/>
+          <w:color w:val="0051C2"/>
+          <w:sz w:val="20"/>
+          <w:szCs w:val="20"/>
+          <w:lang w:eastAsia="es-ES"/>
+        </w:rPr>
+      </w:pPr>
+    </w:p>
+    <w:p>
+      <w:pPr>
+        <w:tabs>
+          <w:tab w:val="left" w:pos="916"/>
+          <w:tab w:val="left" w:pos="1832"/>
+          <w:tab w:val="left" w:pos="2748"/>
+          <w:tab w:val="left" w:pos="3664"/>
+          <w:tab w:val="left" w:pos="4580"/>
+          <w:tab w:val="left" w:pos="5496"/>
+          <w:tab w:val="left" w:pos="6412"/>
+          <w:tab w:val="left" w:pos="7328"/>
+          <w:tab w:val="left" w:pos="8244"/>
+          <w:tab w:val="left" w:pos="9160"/>
+          <w:tab w:val="left" w:pos="10076"/>
+          <w:tab w:val="left" w:pos="10992"/>
+          <w:tab w:val="left" w:pos="11908"/>
+          <w:tab w:val="left" w:pos="12824"/>
+          <w:tab w:val="left" w:pos="13740"/>
+          <w:tab w:val="left" w:pos="14656"/>
+        </w:tabs>
+        <w:spacing w:after="0" w:line="240" w:lineRule="auto"/>
+        <w:rPr>
+          <w:rFonts w:ascii="var(--font-mono)" w:eastAsia="Times New Roman" w:hAnsi="var(--font-mono)" w:cs="Courier New"/>
+          <w:color w:val="14181F"/>
+          <w:sz w:val="20"/>
+          <w:lang w:eastAsia="es-ES"/>
+        </w:rPr>
+      </w:pPr>
+      <w:proofErr w:type="gramStart"/>
+      <w:r>
+        <w:rPr>
+          <w:rFonts w:ascii="var(--font-mono)" w:eastAsia="Times New Roman" w:hAnsi="var(--font-mono)" w:cs="Courier New"/>
+          <w:color w:val="0051C2"/>
+          <w:sz w:val="20"/>
+          <w:szCs w:val="20"/>
+          <w:lang w:eastAsia="es-ES"/>
+        </w:rPr>
+        <w:t>docker</w:t>
+      </w:r>
+      <w:proofErr w:type="gramEnd"/>
+      <w:r>
+        <w:rPr>
+          <w:rFonts w:ascii="var(--font-mono)" w:eastAsia="Times New Roman" w:hAnsi="var(--font-mono)" w:cs="Courier New"/>
+          <w:color w:val="14181F"/>
+          <w:sz w:val="20"/>
+          <w:lang w:eastAsia="es-ES"/>
+        </w:rPr>
         <w:t xml:space="preserve"> </w:t>
       </w:r>
-    </w:p>
-    <w:p>
-      <w:pPr>
-        <w:spacing w:after="0"/>
-      </w:pPr>
-      <w:r>
-        <w:rPr>
-          <w:rStyle w:val="token"/>
-          <w:color w:val="6E7687"/>
-        </w:rPr>
-        <w:t># Read a specific user</w:t>
-      </w:r>
-      <w:r>
+      <w:r>
+        <w:rPr>
+          <w:rFonts w:ascii="var(--font-mono)" w:eastAsia="Times New Roman" w:hAnsi="var(--font-mono)" w:cs="Courier New"/>
+          <w:color w:val="B34A00"/>
+          <w:sz w:val="20"/>
+          <w:szCs w:val="20"/>
+          <w:lang w:eastAsia="es-ES"/>
+        </w:rPr>
+        <w:t>exec</w:t>
+      </w:r>
+      <w:r>
+        <w:rPr>
+          <w:rFonts w:ascii="var(--font-mono)" w:eastAsia="Times New Roman" w:hAnsi="var(--font-mono)" w:cs="Courier New"/>
+          <w:color w:val="14181F"/>
+          <w:sz w:val="20"/>
+          <w:lang w:eastAsia="es-ES"/>
+        </w:rPr>
+        <w:t xml:space="preserve"> -it redis redis-cli HGETALL </w:t>
+      </w:r>
+      <w:r>
+        <w:rPr>
+          <w:rFonts w:ascii="var(--font-mono)" w:eastAsia="Times New Roman" w:hAnsi="var(--font-mono)" w:cs="Courier New"/>
+          <w:color w:val="008000"/>
+          <w:sz w:val="20"/>
+          <w:szCs w:val="20"/>
+          <w:lang w:eastAsia="es-ES"/>
+        </w:rPr>
+        <w:t>"user-updates-value"</w:t>
+      </w:r>
+    </w:p>
+    <w:p>
+      <w:pPr>
+        <w:tabs>
+          <w:tab w:val="left" w:pos="916"/>
+          <w:tab w:val="left" w:pos="1832"/>
+          <w:tab w:val="left" w:pos="2748"/>
+          <w:tab w:val="left" w:pos="3664"/>
+          <w:tab w:val="left" w:pos="4580"/>
+          <w:tab w:val="left" w:pos="5496"/>
+          <w:tab w:val="left" w:pos="6412"/>
+          <w:tab w:val="left" w:pos="7328"/>
+          <w:tab w:val="left" w:pos="8244"/>
+          <w:tab w:val="left" w:pos="9160"/>
+          <w:tab w:val="left" w:pos="10076"/>
+          <w:tab w:val="left" w:pos="10992"/>
+          <w:tab w:val="left" w:pos="11908"/>
+          <w:tab w:val="left" w:pos="12824"/>
+          <w:tab w:val="left" w:pos="13740"/>
+          <w:tab w:val="left" w:pos="14656"/>
+        </w:tabs>
+        <w:spacing w:after="0" w:line="240" w:lineRule="auto"/>
+        <w:rPr>
+          <w:rFonts w:ascii="var(--font-mono)" w:eastAsia="Times New Roman" w:hAnsi="var(--font-mono)" w:cs="Courier New"/>
+          <w:color w:val="14181F"/>
+          <w:sz w:val="20"/>
+          <w:lang w:eastAsia="es-ES"/>
+        </w:rPr>
+      </w:pPr>
+    </w:p>
+    <w:p>
+      <w:pPr>
+        <w:tabs>
+          <w:tab w:val="left" w:pos="916"/>
+          <w:tab w:val="left" w:pos="1832"/>
+          <w:tab w:val="left" w:pos="2748"/>
+          <w:tab w:val="left" w:pos="3664"/>
+          <w:tab w:val="left" w:pos="4580"/>
+          <w:tab w:val="left" w:pos="5496"/>
+          <w:tab w:val="left" w:pos="6412"/>
+          <w:tab w:val="left" w:pos="7328"/>
+          <w:tab w:val="left" w:pos="8244"/>
+          <w:tab w:val="left" w:pos="9160"/>
+          <w:tab w:val="left" w:pos="10076"/>
+          <w:tab w:val="left" w:pos="10992"/>
+          <w:tab w:val="left" w:pos="11908"/>
+          <w:tab w:val="left" w:pos="12824"/>
+          <w:tab w:val="left" w:pos="13740"/>
+          <w:tab w:val="left" w:pos="14656"/>
+        </w:tabs>
+        <w:spacing w:after="0" w:line="240" w:lineRule="auto"/>
+        <w:rPr>
+          <w:rFonts w:ascii="var(--font-mono)" w:eastAsia="Times New Roman" w:hAnsi="var(--font-mono)" w:cs="Courier New"/>
+          <w:color w:val="14181F"/>
+          <w:sz w:val="20"/>
+          <w:lang w:eastAsia="es-ES"/>
+        </w:rPr>
+      </w:pPr>
+      <w:r>
+        <w:rPr>
+          <w:rFonts w:ascii="var(--font-mono)" w:eastAsia="Times New Roman" w:hAnsi="var(--font-mono)" w:cs="Courier New"/>
+          <w:color w:val="14181F"/>
+          <w:sz w:val="20"/>
+          <w:lang w:eastAsia="es-ES"/>
+        </w:rPr>
+        <w:t>As it is stream we will use this command:</w:t>
+      </w:r>
+    </w:p>
+    <w:p>
+      <w:pPr>
+        <w:tabs>
+          <w:tab w:val="left" w:pos="916"/>
+          <w:tab w:val="left" w:pos="1832"/>
+          <w:tab w:val="left" w:pos="2748"/>
+          <w:tab w:val="left" w:pos="3664"/>
+          <w:tab w:val="left" w:pos="4580"/>
+          <w:tab w:val="left" w:pos="5496"/>
+          <w:tab w:val="left" w:pos="6412"/>
+          <w:tab w:val="left" w:pos="7328"/>
+          <w:tab w:val="left" w:pos="8244"/>
+          <w:tab w:val="left" w:pos="9160"/>
+          <w:tab w:val="left" w:pos="10076"/>
+          <w:tab w:val="left" w:pos="10992"/>
+          <w:tab w:val="left" w:pos="11908"/>
+          <w:tab w:val="left" w:pos="12824"/>
+          <w:tab w:val="left" w:pos="13740"/>
+          <w:tab w:val="left" w:pos="14656"/>
+        </w:tabs>
+        <w:spacing w:after="0" w:line="240" w:lineRule="auto"/>
+        <w:rPr>
+          <w:rFonts w:ascii="var(--font-mono)" w:eastAsia="Times New Roman" w:hAnsi="var(--font-mono)" w:cs="Courier New"/>
+          <w:color w:val="14181F"/>
+          <w:sz w:val="20"/>
+          <w:lang w:eastAsia="es-ES"/>
+        </w:rPr>
+      </w:pPr>
+    </w:p>
+    <w:p>
+      <w:pPr>
+        <w:tabs>
+          <w:tab w:val="left" w:pos="916"/>
+          <w:tab w:val="left" w:pos="1832"/>
+          <w:tab w:val="left" w:pos="2748"/>
+          <w:tab w:val="left" w:pos="3664"/>
+          <w:tab w:val="left" w:pos="4580"/>
+          <w:tab w:val="left" w:pos="5496"/>
+          <w:tab w:val="left" w:pos="6412"/>
+          <w:tab w:val="left" w:pos="7328"/>
+          <w:tab w:val="left" w:pos="8244"/>
+          <w:tab w:val="left" w:pos="9160"/>
+          <w:tab w:val="left" w:pos="10076"/>
+          <w:tab w:val="left" w:pos="10992"/>
+          <w:tab w:val="left" w:pos="11908"/>
+          <w:tab w:val="left" w:pos="12824"/>
+          <w:tab w:val="left" w:pos="13740"/>
+          <w:tab w:val="left" w:pos="14656"/>
+        </w:tabs>
+        <w:spacing w:after="0" w:line="240" w:lineRule="auto"/>
+        <w:rPr>
+          <w:rFonts w:ascii="var(--font-mono)" w:eastAsia="Times New Roman" w:hAnsi="var(--font-mono)" w:cs="Courier New"/>
+          <w:color w:val="14181F"/>
+          <w:sz w:val="20"/>
+          <w:szCs w:val="20"/>
+          <w:lang w:eastAsia="es-ES"/>
+        </w:rPr>
+      </w:pPr>
+      <w:proofErr w:type="gramStart"/>
+      <w:r>
+        <w:rPr>
+          <w:rFonts w:ascii="var(--font-mono)" w:eastAsia="Times New Roman" w:hAnsi="var(--font-mono)" w:cs="Courier New"/>
+          <w:color w:val="0051C2"/>
+          <w:sz w:val="20"/>
+          <w:szCs w:val="20"/>
+          <w:lang w:eastAsia="es-ES"/>
+        </w:rPr>
+        <w:t>docker</w:t>
+      </w:r>
+      <w:proofErr w:type="gramEnd"/>
+      <w:r>
+        <w:rPr>
+          <w:rFonts w:ascii="var(--font-mono)" w:eastAsia="Times New Roman" w:hAnsi="var(--font-mono)" w:cs="Courier New"/>
+          <w:color w:val="14181F"/>
+          <w:sz w:val="20"/>
+          <w:lang w:eastAsia="es-ES"/>
+        </w:rPr>
         <w:t xml:space="preserve"> </w:t>
       </w:r>
-    </w:p>
-    <w:p>
-      <w:pPr>
-        <w:spacing w:after="0"/>
-      </w:pPr>
-      <w:proofErr w:type="gramStart"/>
-      <w:r>
-        <w:t>redis-cli</w:t>
-      </w:r>
-      <w:proofErr w:type="gramEnd"/>
-      <w:r>
-        <w:t xml:space="preserve"> -h localhost -p </w:t>
-      </w:r>
-      <w:r>
-        <w:rPr>
-          <w:rStyle w:val="token"/>
-          <w:color w:val="008080"/>
-        </w:rPr>
-        <w:t>6379</w:t>
-      </w:r>
-      <w:r>
-        <w:t xml:space="preserve"> HGETALL user:1</w:t>
-      </w:r>
+      <w:r>
+        <w:rPr>
+          <w:rFonts w:ascii="var(--font-mono)" w:eastAsia="Times New Roman" w:hAnsi="var(--font-mono)" w:cs="Courier New"/>
+          <w:color w:val="B34A00"/>
+          <w:sz w:val="20"/>
+          <w:szCs w:val="20"/>
+          <w:lang w:eastAsia="es-ES"/>
+        </w:rPr>
+        <w:t>exec</w:t>
+      </w:r>
+      <w:r>
+        <w:rPr>
+          <w:rFonts w:ascii="var(--font-mono)" w:eastAsia="Times New Roman" w:hAnsi="var(--font-mono)" w:cs="Courier New"/>
+          <w:color w:val="14181F"/>
+          <w:sz w:val="20"/>
+          <w:lang w:eastAsia="es-ES"/>
+        </w:rPr>
+        <w:t xml:space="preserve"> -it redis redis-cli XRANGE </w:t>
+      </w:r>
+      <w:r>
+        <w:rPr>
+          <w:rFonts w:ascii="var(--font-mono)" w:eastAsia="Times New Roman" w:hAnsi="var(--font-mono)" w:cs="Courier New"/>
+          <w:color w:val="008000"/>
+          <w:sz w:val="20"/>
+          <w:szCs w:val="20"/>
+          <w:lang w:eastAsia="es-ES"/>
+        </w:rPr>
+        <w:t>"user-updates-value"</w:t>
+      </w:r>
+      <w:r>
+        <w:rPr>
+          <w:rFonts w:ascii="var(--font-mono)" w:eastAsia="Times New Roman" w:hAnsi="var(--font-mono)" w:cs="Courier New"/>
+          <w:color w:val="14181F"/>
+          <w:sz w:val="20"/>
+          <w:lang w:eastAsia="es-ES"/>
+        </w:rPr>
+        <w:t xml:space="preserve"> - +</w:t>
+      </w:r>
+    </w:p>
+    <w:p>
+      <w:pPr>
+        <w:spacing w:after="0"/>
+        <w:rPr>
+          <w:sz w:val="24"/>
+        </w:rPr>
+      </w:pPr>
+    </w:p>
+    <w:p>
+      <w:pPr>
+        <w:spacing w:after="0"/>
+        <w:rPr>
+          <w:sz w:val="24"/>
+        </w:rPr>
+      </w:pPr>
+      <w:r>
+        <w:rPr>
+          <w:noProof/>
+          <w:sz w:val="24"/>
+          <w:lang w:eastAsia="es-ES"/>
+        </w:rPr>
+        <w:drawing>
+          <wp:inline distT="0" distB="0" distL="0" distR="0">
+            <wp:extent cx="5400040" cy="583476"/>
+            <wp:effectExtent l="19050" t="0" r="0" b="0"/>
+            <wp:docPr id="37" name="Imagen 16"/>
+            <wp:cNvGraphicFramePr>
+              <a:graphicFrameLocks xmlns:a="http://schemas.openxmlformats.org/drawingml/2006/main" noChangeAspect="1"/>
+            </wp:cNvGraphicFramePr>
+            <a:graphic xmlns:a="http://schemas.openxmlformats.org/drawingml/2006/main">
+              <a:graphicData uri="http://schemas.openxmlformats.org/drawingml/2006/picture">
+                <pic:pic xmlns:pic="http://schemas.openxmlformats.org/drawingml/2006/picture">
+                  <pic:nvPicPr>
+                    <pic:cNvPr id="0" name="Picture 16"/>
+                    <pic:cNvPicPr>
+                      <a:picLocks noChangeAspect="1" noChangeArrowheads="1"/>
+                    </pic:cNvPicPr>
+                  </pic:nvPicPr>
+                  <pic:blipFill>
+                    <a:blip r:embed="rId40"/>
+                    <a:srcRect/>
+                    <a:stretch>
+                      <a:fillRect/>
+                    </a:stretch>
+                  </pic:blipFill>
+                  <pic:spPr bwMode="auto">
+                    <a:xfrm>
+                      <a:off x="0" y="0"/>
+                      <a:ext cx="5400040" cy="583476"/>
+                    </a:xfrm>
+                    <a:prstGeom prst="rect">
+                      <a:avLst/>
+                    </a:prstGeom>
+                    <a:noFill/>
+                    <a:ln w="9525">
+                      <a:noFill/>
+                      <a:miter lim="800000"/>
+                      <a:headEnd/>
+                      <a:tailEnd/>
+                    </a:ln>
+                  </pic:spPr>
+                </pic:pic>
+              </a:graphicData>
+            </a:graphic>
+          </wp:inline>
+        </w:drawing>
+      </w:r>
+    </w:p>
+    <w:p>
+      <w:pPr>
+        <w:spacing w:after="0"/>
+        <w:rPr>
+          <w:sz w:val="24"/>
+        </w:rPr>
+      </w:pPr>
+    </w:p>
+    <w:p>
+      <w:pPr>
+        <w:spacing w:after="0"/>
+      </w:pPr>
+    </w:p>
+    <w:p>
+      <w:pPr>
+        <w:spacing w:after="0"/>
+      </w:pPr>
+      <w:r>
+        <w:t>The values will start flowing to the user Redis stream hash</w:t>
+      </w:r>
+    </w:p>
+    <w:p>
+      <w:pPr>
+        <w:spacing w:after="0"/>
+      </w:pPr>
+      <w:r>
+        <w:rPr>
+          <w:noProof/>
+          <w:lang w:eastAsia="es-ES"/>
+        </w:rPr>
+        <w:drawing>
+          <wp:inline distT="0" distB="0" distL="0" distR="0">
+            <wp:extent cx="5392420" cy="3135630"/>
+            <wp:effectExtent l="19050" t="0" r="0" b="0"/>
+            <wp:docPr id="41" name="Imagen 34"/>
+            <wp:cNvGraphicFramePr>
+              <a:graphicFrameLocks xmlns:a="http://schemas.openxmlformats.org/drawingml/2006/main" noChangeAspect="1"/>
+            </wp:cNvGraphicFramePr>
+            <a:graphic xmlns:a="http://schemas.openxmlformats.org/drawingml/2006/main">
+              <a:graphicData uri="http://schemas.openxmlformats.org/drawingml/2006/picture">
+                <pic:pic xmlns:pic="http://schemas.openxmlformats.org/drawingml/2006/picture">
+                  <pic:nvPicPr>
+                    <pic:cNvPr id="0" name="Picture 34"/>
+                    <pic:cNvPicPr>
+                      <a:picLocks noChangeAspect="1" noChangeArrowheads="1"/>
+                    </pic:cNvPicPr>
+                  </pic:nvPicPr>
+                  <pic:blipFill>
+                    <a:blip r:embed="rId41"/>
+                    <a:srcRect/>
+                    <a:stretch>
+                      <a:fillRect/>
+                    </a:stretch>
+                  </pic:blipFill>
+                  <pic:spPr bwMode="auto">
+                    <a:xfrm>
+                      <a:off x="0" y="0"/>
+                      <a:ext cx="5392420" cy="3135630"/>
+                    </a:xfrm>
+                    <a:prstGeom prst="rect">
+                      <a:avLst/>
+                    </a:prstGeom>
+                    <a:noFill/>
+                    <a:ln w="9525">
+                      <a:noFill/>
+                      <a:miter lim="800000"/>
+                      <a:headEnd/>
+                      <a:tailEnd/>
+                    </a:ln>
+                  </pic:spPr>
+                </pic:pic>
+              </a:graphicData>
+            </a:graphic>
+          </wp:inline>
+        </w:drawing>
+      </w:r>
+    </w:p>
+    <w:p>
+      <w:pPr>
+        <w:spacing w:after="0"/>
+        <w:rPr>
+          <w:sz w:val="24"/>
+        </w:rPr>
+      </w:pPr>
     </w:p>
     <w:sectPr>
       <w:pgSz w:w="11906" w:h="16838"/>
@@ -12540,8 +13829,124 @@
       </w:rPr>
     </w:lvl>
   </w:abstractNum>
+  <w:abstractNum w:abstractNumId="1">
+    <w:nsid w:val="48EA75BA"/>
+    <w:multiLevelType w:val="multilevel"/>
+    <w:tmpl w:val="84007DEE"/>
+    <w:lvl w:ilvl="0">
+      <w:start w:val="1"/>
+      <w:numFmt w:val="decimal"/>
+      <w:lvlText w:val="%1."/>
+      <w:lvlJc w:val="left"/>
+      <w:pPr>
+        <w:tabs>
+          <w:tab w:val="num" w:pos="720"/>
+        </w:tabs>
+        <w:ind w:left="720" w:hanging="360"/>
+      </w:pPr>
+    </w:lvl>
+    <w:lvl w:ilvl="1" w:tentative="1">
+      <w:start w:val="1"/>
+      <w:numFmt w:val="decimal"/>
+      <w:lvlText w:val="%2."/>
+      <w:lvlJc w:val="left"/>
+      <w:pPr>
+        <w:tabs>
+          <w:tab w:val="num" w:pos="1440"/>
+        </w:tabs>
+        <w:ind w:left="1440" w:hanging="360"/>
+      </w:pPr>
+    </w:lvl>
+    <w:lvl w:ilvl="2" w:tentative="1">
+      <w:start w:val="1"/>
+      <w:numFmt w:val="decimal"/>
+      <w:lvlText w:val="%3."/>
+      <w:lvlJc w:val="left"/>
+      <w:pPr>
+        <w:tabs>
+          <w:tab w:val="num" w:pos="2160"/>
+        </w:tabs>
+        <w:ind w:left="2160" w:hanging="360"/>
+      </w:pPr>
+    </w:lvl>
+    <w:lvl w:ilvl="3" w:tentative="1">
+      <w:start w:val="1"/>
+      <w:numFmt w:val="decimal"/>
+      <w:lvlText w:val="%4."/>
+      <w:lvlJc w:val="left"/>
+      <w:pPr>
+        <w:tabs>
+          <w:tab w:val="num" w:pos="2880"/>
+        </w:tabs>
+        <w:ind w:left="2880" w:hanging="360"/>
+      </w:pPr>
+    </w:lvl>
+    <w:lvl w:ilvl="4" w:tentative="1">
+      <w:start w:val="1"/>
+      <w:numFmt w:val="decimal"/>
+      <w:lvlText w:val="%5."/>
+      <w:lvlJc w:val="left"/>
+      <w:pPr>
+        <w:tabs>
+          <w:tab w:val="num" w:pos="3600"/>
+        </w:tabs>
+        <w:ind w:left="3600" w:hanging="360"/>
+      </w:pPr>
+    </w:lvl>
+    <w:lvl w:ilvl="5" w:tentative="1">
+      <w:start w:val="1"/>
+      <w:numFmt w:val="decimal"/>
+      <w:lvlText w:val="%6."/>
+      <w:lvlJc w:val="left"/>
+      <w:pPr>
+        <w:tabs>
+          <w:tab w:val="num" w:pos="4320"/>
+        </w:tabs>
+        <w:ind w:left="4320" w:hanging="360"/>
+      </w:pPr>
+    </w:lvl>
+    <w:lvl w:ilvl="6" w:tentative="1">
+      <w:start w:val="1"/>
+      <w:numFmt w:val="decimal"/>
+      <w:lvlText w:val="%7."/>
+      <w:lvlJc w:val="left"/>
+      <w:pPr>
+        <w:tabs>
+          <w:tab w:val="num" w:pos="5040"/>
+        </w:tabs>
+        <w:ind w:left="5040" w:hanging="360"/>
+      </w:pPr>
+    </w:lvl>
+    <w:lvl w:ilvl="7" w:tentative="1">
+      <w:start w:val="1"/>
+      <w:numFmt w:val="decimal"/>
+      <w:lvlText w:val="%8."/>
+      <w:lvlJc w:val="left"/>
+      <w:pPr>
+        <w:tabs>
+          <w:tab w:val="num" w:pos="5760"/>
+        </w:tabs>
+        <w:ind w:left="5760" w:hanging="360"/>
+      </w:pPr>
+    </w:lvl>
+    <w:lvl w:ilvl="8" w:tentative="1">
+      <w:start w:val="1"/>
+      <w:numFmt w:val="decimal"/>
+      <w:lvlText w:val="%9."/>
+      <w:lvlJc w:val="left"/>
+      <w:pPr>
+        <w:tabs>
+          <w:tab w:val="num" w:pos="6480"/>
+        </w:tabs>
+        <w:ind w:left="6480" w:hanging="360"/>
+      </w:pPr>
+    </w:lvl>
+  </w:abstractNum>
   <w:num w:numId="1">
     <w:abstractNumId w:val="0"/>
+  </w:num>
+  <w:num w:numId="2">
+    <w:abstractNumId w:val="1"/>
   </w:num>
 </w:numbering>
 </file>
@@ -12827,6 +14232,17 @@
     <w:name w:val="token"/>
     <w:basedOn w:val="Fuentedeprrafopredeter"/>
     <w:rsid w:val="00E4258F"/>
+  </w:style>
+  <w:style w:type="paragraph" w:styleId="Prrafodelista">
+    <w:name w:val="List Paragraph"/>
+    <w:basedOn w:val="Normal"/>
+    <w:uiPriority w:val="34"/>
+    <w:qFormat/>
+    <w:rsid w:val="00715040"/>
+    <w:pPr>
+      <w:ind w:left="720"/>
+      <w:contextualSpacing/>
+    </w:pPr>
   </w:style>
 </w:styles>
 </file>

</xml_diff>